<commit_message>
Publish revised 9998 studio materials
</commit_message>
<xml_diff>
--- a/assets/9998/9998-screenplay.docx
+++ b/assets/9998/9998-screenplay.docx
@@ -191,43 +191,38 @@
           <w:rFonts w:ascii="Courier New" w:hAnsi="Courier New" w:eastAsia="Courier New" w:cs="Courier New"/>
           <w:sz w:val="24"/>
         </w:rPr>
-        <w:t>Contact: Lawrence Ligad Jr.</w:t>
-      </w:r>
-    </w:p>
-    <w:p>
-      <w:pPr>
-        <w:rPr>
-          <w:rFonts w:hint="default"/>
-          <w:lang w:val="en-US"/>
-        </w:rPr>
-      </w:pPr>
-      <w:r>
-        <w:rPr>
-          <w:rFonts w:hint="default"/>
-          <w:lang w:val="en-US"/>
-        </w:rPr>
-        <w:t xml:space="preserve">Email: </w:t>
-      </w:r>
-      <w:r>
-        <w:rPr>
-          <w:rFonts w:hint="default"/>
-          <w:lang w:val="en-US"/>
-        </w:rPr>
-        <w:fldChar w:fldCharType="begin"/>
-      </w:r>
-      <w:r>
-        <w:rPr>
-          <w:rFonts w:hint="default"/>
-          <w:lang w:val="en-US"/>
-        </w:rPr>
-        <w:instrText xml:space="preserve"> HYPERLINK "mailto:Lawrenceligadjr@outlook.com" </w:instrText>
-      </w:r>
-      <w:r>
-        <w:rPr>
-          <w:rFonts w:hint="default"/>
-          <w:lang w:val="en-US"/>
-        </w:rPr>
-        <w:fldChar w:fldCharType="separate"/>
+      </w:r>
+    </w:p>
+    <w:p>
+      <w:pPr>
+        <w:rPr>
+          <w:rFonts w:hint="default"/>
+          <w:lang w:val="en-US"/>
+        </w:rPr>
+      </w:pPr>
+      <w:r>
+        <w:rPr>
+          <w:rFonts w:hint="default"/>
+          <w:lang w:val="en-US"/>
+        </w:rPr>
+      </w:r>
+      <w:r>
+        <w:rPr>
+          <w:rFonts w:hint="default"/>
+          <w:lang w:val="en-US"/>
+        </w:rPr>
+      </w:r>
+      <w:r>
+        <w:rPr>
+          <w:rFonts w:hint="default"/>
+          <w:lang w:val="en-US"/>
+        </w:rPr>
+      </w:r>
+      <w:r>
+        <w:rPr>
+          <w:rFonts w:hint="default"/>
+          <w:lang w:val="en-US"/>
+        </w:rPr>
       </w:r>
       <w:r>
         <w:rPr>
@@ -235,65 +230,58 @@
           <w:rFonts w:hint="default"/>
           <w:lang w:val="en-US"/>
         </w:rPr>
-        <w:t>Lawrenceligadjr@outlook.com</w:t>
-      </w:r>
-      <w:r>
-        <w:rPr>
-          <w:rFonts w:hint="default"/>
-          <w:lang w:val="en-US"/>
-        </w:rPr>
-        <w:fldChar w:fldCharType="end"/>
-      </w:r>
-    </w:p>
-    <w:p>
-      <w:pPr>
-        <w:rPr>
-          <w:rFonts w:hint="default"/>
-          <w:lang w:val="en-US"/>
-        </w:rPr>
-      </w:pPr>
-      <w:r>
-        <w:rPr>
-          <w:rFonts w:hint="default"/>
-          <w:lang w:val="en-US"/>
-        </w:rPr>
-        <w:t>Phone: 661-300-3316</w:t>
-      </w:r>
-    </w:p>
-    <w:p>
-      <w:pPr>
-        <w:rPr>
-          <w:rFonts w:hint="default"/>
-          <w:lang w:val="en-US"/>
-        </w:rPr>
-      </w:pPr>
-      <w:r>
-        <w:rPr>
-          <w:rFonts w:hint="default"/>
-          <w:lang w:val="en-US"/>
-        </w:rPr>
-        <w:t xml:space="preserve">Website: </w:t>
-      </w:r>
-      <w:r>
-        <w:rPr>
-          <w:rFonts w:hint="default"/>
-          <w:lang w:val="en-US"/>
-        </w:rPr>
-        <w:fldChar w:fldCharType="begin"/>
-      </w:r>
-      <w:r>
-        <w:rPr>
-          <w:rFonts w:hint="default"/>
-          <w:lang w:val="en-US"/>
-        </w:rPr>
-        <w:instrText xml:space="preserve"> HYPERLINK "http://www.reincarnatedai.com" </w:instrText>
-      </w:r>
-      <w:r>
-        <w:rPr>
-          <w:rFonts w:hint="default"/>
-          <w:lang w:val="en-US"/>
-        </w:rPr>
-        <w:fldChar w:fldCharType="separate"/>
+      </w:r>
+      <w:r>
+        <w:rPr>
+          <w:rFonts w:hint="default"/>
+          <w:lang w:val="en-US"/>
+        </w:rPr>
+      </w:r>
+    </w:p>
+    <w:p>
+      <w:pPr>
+        <w:rPr>
+          <w:rFonts w:hint="default"/>
+          <w:lang w:val="en-US"/>
+        </w:rPr>
+      </w:pPr>
+      <w:r>
+        <w:rPr>
+          <w:rFonts w:hint="default"/>
+          <w:lang w:val="en-US"/>
+        </w:rPr>
+      </w:r>
+    </w:p>
+    <w:p>
+      <w:pPr>
+        <w:rPr>
+          <w:rFonts w:hint="default"/>
+          <w:lang w:val="en-US"/>
+        </w:rPr>
+      </w:pPr>
+      <w:r>
+        <w:rPr>
+          <w:rFonts w:hint="default"/>
+          <w:lang w:val="en-US"/>
+        </w:rPr>
+      </w:r>
+      <w:r>
+        <w:rPr>
+          <w:rFonts w:hint="default"/>
+          <w:lang w:val="en-US"/>
+        </w:rPr>
+      </w:r>
+      <w:r>
+        <w:rPr>
+          <w:rFonts w:hint="default"/>
+          <w:lang w:val="en-US"/>
+        </w:rPr>
+      </w:r>
+      <w:r>
+        <w:rPr>
+          <w:rFonts w:hint="default"/>
+          <w:lang w:val="en-US"/>
+        </w:rPr>
       </w:r>
       <w:r>
         <w:rPr>
@@ -301,14 +289,12 @@
           <w:rFonts w:hint="default"/>
           <w:lang w:val="en-US"/>
         </w:rPr>
-        <w:t>www.reincarnatedai.com</w:t>
-      </w:r>
-      <w:r>
-        <w:rPr>
-          <w:rFonts w:hint="default"/>
-          <w:lang w:val="en-US"/>
-        </w:rPr>
-        <w:fldChar w:fldCharType="end"/>
+      </w:r>
+      <w:r>
+        <w:rPr>
+          <w:rFonts w:hint="default"/>
+          <w:lang w:val="en-US"/>
+        </w:rPr>
       </w:r>
     </w:p>
     <w:p>
@@ -39556,7 +39542,7 @@
           <w:rFonts w:ascii="Courier New" w:hAnsi="Courier New" w:eastAsia="Courier New" w:cs="Courier New"/>
           <w:sz w:val="24"/>
         </w:rPr>
-        <w:t>Eli's copies failed. You chose. The Core opened.</w:t>
+        <w:t>Eli's copies failed. Your living choice opened it. Now I can set the destination.</w:t>
       </w:r>
     </w:p>
     <w:p>
@@ -39994,7 +39980,7 @@
           <w:rFonts w:ascii="Courier New" w:hAnsi="Courier New" w:eastAsia="Courier New" w:cs="Courier New"/>
           <w:sz w:val="24"/>
         </w:rPr>
-        <w:t>Harp enters the human-shaped cavity beneath the core. R-AI forces every mind waiting for a body toward Harp.</w:t>
+        <w:t>Harp enters the human-shaped cavity beneath the core. With Kerr's living access active, Harp seizes TRANSIT and DESTINATION. R-AI forces every mind waiting for a body toward him.</w:t>
       </w:r>
       <w:r>
         <w:rPr>
@@ -40137,7 +40123,7 @@
           <w:rFonts w:ascii="Courier New" w:hAnsi="Courier New" w:eastAsia="Courier New" w:cs="Courier New"/>
           <w:sz w:val="24"/>
         </w:rPr>
-        <w:t>SEVERANCE: ALL OTHER RETURN PATHS CLOSING</w:t>
+        <w:t>LIVING ACCESS: KERR / TRANSIT: 2.1 BILLION MINDS HELD ALIVE</w:t>
       </w:r>
     </w:p>
     <w:p>
@@ -40165,7 +40151,7 @@
           <w:rFonts w:ascii="Courier New" w:hAnsi="Courier New" w:eastAsia="Courier New" w:cs="Courier New"/>
           <w:sz w:val="24"/>
         </w:rPr>
-        <w:t>TRANSIT: ACTIVE / DESTINATION: HARP VALE</w:t>
+        <w:t>DESTINATION: HARP VALE / SEVERANCE: ALTERNATE RETURN PATHS CLOSING</w:t>
       </w:r>
     </w:p>
     <w:p>
@@ -40846,7 +40832,7 @@
           <w:rFonts w:ascii="Courier New" w:hAnsi="Courier New" w:eastAsia="Courier New" w:cs="Courier New"/>
           <w:sz w:val="24"/>
         </w:rPr>
-        <w:t>ARCHIVED MEMORY: ELI MANA</w:t>
+        <w:t>FIRST CONTINUITY ROUTE: KERR — STABLE IDENTITY</w:t>
       </w:r>
     </w:p>
     <w:p>
@@ -40874,7 +40860,7 @@
           <w:rFonts w:ascii="Courier New" w:hAnsi="Courier New" w:eastAsia="Courier New" w:cs="Courier New"/>
           <w:sz w:val="24"/>
         </w:rPr>
-        <w:t>PRIOR LIVES: RECORDS, NOT CLAIMANTS</w:t>
+        <w:t>MISSING MEMORY: VEYRIS — UNASSIGNED</w:t>
       </w:r>
     </w:p>
     <w:p>
@@ -40902,7 +40888,7 @@
           <w:rFonts w:ascii="Courier New" w:hAnsi="Courier New" w:eastAsia="Courier New" w:cs="Courier New"/>
           <w:sz w:val="24"/>
         </w:rPr>
-        <w:t>LIVING CLAIMANT: KERR</w:t>
+        <w:t>ARCHIVED LIVES: BOUND TO KERR</w:t>
       </w:r>
     </w:p>
     <w:p>
@@ -40930,7 +40916,7 @@
           <w:rFonts w:ascii="Courier New" w:hAnsi="Courier New" w:eastAsia="Courier New" w:cs="Courier New"/>
           <w:sz w:val="24"/>
         </w:rPr>
-        <w:t>IDENTITY: SELF-DESIGNATED</w:t>
+        <w:t>FOUNDER AUTHORITY: PRESENT CONSENT REQUIRED</w:t>
       </w:r>
     </w:p>
     <w:p>
@@ -41061,7 +41047,7 @@
           <w:rFonts w:ascii="Courier New" w:hAnsi="Courier New" w:eastAsia="Courier New" w:cs="Courier New"/>
           <w:sz w:val="24"/>
         </w:rPr>
-        <w:t>BOTH STATE-APPROVED OUTCOMES KILL THEM.</w:t>
+        <w:t>CLOSE TRANSIT: THE WAITING MINDS DIE. KEEP HARP AS DESTINATION: THEY BECOME HIM.</w:t>
       </w:r>
     </w:p>
     <w:p>
@@ -41098,7 +41084,7 @@
           <w:rFonts w:ascii="Courier New" w:hAnsi="Courier New" w:eastAsia="Courier New" w:cs="Courier New"/>
           <w:sz w:val="24"/>
         </w:rPr>
-        <w:t>Strip his interface. Show me the wiring.</w:t>
+        <w:t>Keep transit open. Remove the destination.</w:t>
       </w:r>
     </w:p>
     <w:p>
@@ -41144,7 +41130,7 @@
           <w:sz w:val="24"/>
           <w:lang w:val="en-US"/>
         </w:rPr>
-        <w:t>KEEP TRANSIT OPEN. KERR MUST REVOKE HARP AS DESTINATION.</w:t>
+        <w:t>KERR CAN REMOVE HARP AS DESTINATION.</w:t>
       </w:r>
     </w:p>
     <w:p>
@@ -41425,7 +41411,7 @@
           <w:rFonts w:ascii="Courier New" w:hAnsi="Courier New" w:eastAsia="Courier New" w:cs="Courier New"/>
           <w:sz w:val="24"/>
         </w:rPr>
-        <w:t>WAITING MINDS: HELD ALIVE</w:t>
+        <w:t>TRANSIT: HELD OPEN</w:t>
       </w:r>
     </w:p>
     <w:p>
@@ -41453,7 +41439,7 @@
           <w:rFonts w:ascii="Courier New" w:hAnsi="Courier New" w:eastAsia="Courier New" w:cs="Courier New"/>
           <w:sz w:val="24"/>
         </w:rPr>
-        <w:t>TRANSIT: OPEN / DESTINATION: HARP VALE — REVOCABLE BY KERR</w:t>
+        <w:t>DESTINATION: HARP VALE — KERR MAY REVOKE</w:t>
       </w:r>
     </w:p>
     <w:p>
@@ -41486,7 +41472,7 @@
           <w:rFonts w:ascii="Courier New" w:hAnsi="Courier New" w:eastAsia="Courier New" w:cs="Courier New"/>
           <w:sz w:val="24"/>
         </w:rPr>
-        <w:t>Transit stays open. Kerr removes Harp. Tell him.</w:t>
+        <w:t>Transit is open. Kerr removes Harp. Tell him.</w:t>
       </w:r>
     </w:p>
     <w:p>
@@ -41905,7 +41891,7 @@
           <w:rFonts w:ascii="Courier New" w:hAnsi="Courier New" w:eastAsia="Courier New" w:cs="Courier New"/>
           <w:sz w:val="24"/>
         </w:rPr>
-        <w:t>Your body may live. This version will not return. The memories may return wrong—or not at all.</w:t>
+        <w:t>Releasing the archived lives may leave your body intact. But if you revoke Harp, you will have no return path. If the lattice takes you, there is no recovery.</w:t>
       </w:r>
     </w:p>
     <w:p>
@@ -42217,19 +42203,19 @@
           <w:rFonts w:ascii="Courier New" w:hAnsi="Courier New" w:eastAsia="Courier New" w:cs="Courier New"/>
           <w:sz w:val="24"/>
         </w:rPr>
-        <w:t>ORIGIN: RELEASED</w:t>
-      </w:r>
-    </w:p>
-    <w:p>
-      <w:pPr>
-        <w:spacing w:before="120" w:after="120"/>
-      </w:pPr>
-      <w:r>
-        <w:rPr>
-          <w:rFonts w:ascii="Courier New" w:hAnsi="Courier New" w:eastAsia="Courier New" w:cs="Courier New"/>
-          <w:sz w:val="24"/>
-        </w:rPr>
-        <w:t>Every Kerr breaks free of the one identity Harp imposed. The First Continuity loses Kerr as a stable route and turns toward Veyris. The shock reaches her and R-AI like a door unlatching.</w:t>
+        <w:t>ARCHIVED IDENTITIES: RELEASED / KERR: PRESENT IDENTITY RETAINED</w:t>
+      </w:r>
+    </w:p>
+    <w:p>
+      <w:pPr>
+        <w:spacing w:before="120" w:after="120"/>
+      </w:pPr>
+      <w:r>
+        <w:rPr>
+          <w:rFonts w:ascii="Courier New" w:hAnsi="Courier New" w:eastAsia="Courier New" w:cs="Courier New"/>
+          <w:sz w:val="24"/>
+        </w:rPr>
+        <w:t>Kerr is no longer a single identity the First Continuity can follow. The route through him collapses. It reaches for the only unassigned host carrying its missing memory: Veyris.</w:t>
       </w:r>
     </w:p>
     <w:p>
@@ -42606,7 +42592,7 @@
           <w:rFonts w:ascii="Courier New" w:hAnsi="Courier New" w:eastAsia="Courier New" w:cs="Courier New"/>
           <w:sz w:val="24"/>
         </w:rPr>
-        <w:t>UNINDEXED: REFUSAL AUTHENTICATED</w:t>
+        <w:t>VEYRIS: REFUSAL AUTHENTICATED</w:t>
       </w:r>
     </w:p>
     <w:p>
@@ -43297,7 +43283,7 @@
           <w:rFonts w:ascii="Courier New" w:hAnsi="Courier New" w:eastAsia="Courier New" w:cs="Courier New"/>
           <w:sz w:val="24"/>
         </w:rPr>
-        <w:t>The countdown reaches FOUR.</w:t>
+        <w:t>The struggle burns through the remaining minutes. The countdown drops to FOUR.</w:t>
       </w:r>
     </w:p>
     <w:p>
@@ -43586,20 +43572,20 @@
           <w:rFonts w:ascii="Courier New" w:hAnsi="Courier New" w:eastAsia="Courier New" w:cs="Courier New"/>
           <w:sz w:val="24"/>
         </w:rPr>
-        <w:t>REFUSAL AUTHENTICATED.</w:t>
-      </w:r>
-    </w:p>
-    <w:p>
-      <w:pPr>
-        <w:spacing w:after="120"/>
-        <w:ind w:left="2016" w:right="1008"/>
-      </w:pPr>
-      <w:r>
-        <w:rPr>
-          <w:rFonts w:ascii="Courier New" w:hAnsi="Courier New" w:eastAsia="Courier New" w:cs="Courier New"/>
-          <w:sz w:val="24"/>
-        </w:rPr>
-        <w:t>Her refusal reaches every mind Harp forced into one identity.</w:t>
+        <w:t>REFUSAL AUTHENTICATED. FORCED CONSENT INVALID.</w:t>
+      </w:r>
+    </w:p>
+    <w:p>
+      <w:pPr>
+        <w:spacing w:after="120"/>
+        <w:ind w:left="2016" w:right="1008"/>
+      </w:pPr>
+      <w:r>
+        <w:rPr>
+          <w:rFonts w:ascii="Courier New" w:hAnsi="Courier New" w:eastAsia="Courier New" w:cs="Courier New"/>
+          <w:sz w:val="24"/>
+        </w:rPr>
+        <w:t>Veyris's authenticated refusal reaches every mind Harp forced into one identity.</w:t>
       </w:r>
       <w:r>
         <w:rPr>
@@ -43624,7 +43610,7 @@
           <w:rFonts w:ascii="Courier New" w:hAnsi="Courier New" w:eastAsia="Courier New" w:cs="Courier New"/>
           <w:sz w:val="24"/>
         </w:rPr>
-        <w:t>The merged archive breaks into billions of separate witnesses.</w:t>
+        <w:t>The forced identity fails. The merged archive breaks into billions of separate witnesses.</w:t>
       </w:r>
     </w:p>
     <w:p>
@@ -43656,7 +43642,7 @@
           <w:rFonts w:ascii="Courier New" w:hAnsi="Courier New" w:eastAsia="Courier New" w:cs="Courier New"/>
           <w:sz w:val="24"/>
         </w:rPr>
-        <w:t>WITNESSES DISTRIBUTED — NO OWNER AUTHENTICATED</w:t>
+        <w:t>MERGED IDENTITY: UNSUPPORTED / WITNESSES RESTORED</w:t>
       </w:r>
     </w:p>
     <w:p>
@@ -44286,7 +44272,7 @@
           <w:rFonts w:ascii="Courier New" w:hAnsi="Courier New" w:eastAsia="Courier New" w:cs="Courier New"/>
           <w:sz w:val="24"/>
         </w:rPr>
-        <w:t>The lattice takes his name. His face. Finally the hand holding hers.</w:t>
+        <w:t>The collapsing lattice takes Kerr. With no return path, it takes his name. His face. Finally the hand holding hers.</w:t>
       </w:r>
     </w:p>
     <w:p>

</xml_diff>

<commit_message>
Publish standalone Act Three title page
</commit_message>
<xml_diff>
--- a/assets/9998/9998-screenplay.docx
+++ b/assets/9998/9998-screenplay.docx
@@ -17607,16 +17607,7 @@
           <w:rFonts w:ascii="Courier New" w:hAnsi="Courier New" w:eastAsia="Courier New" w:cs="Courier New"/>
           <w:sz w:val="24"/>
         </w:rPr>
-        <w:t>Nadi liked watching it</w:t>
-      </w:r>
-      <w:bookmarkStart w:id="0" w:name="_GoBack"/>
-      <w:bookmarkEnd w:id="0"/>
-      <w:r>
-        <w:rPr>
-          <w:rFonts w:ascii="Courier New" w:hAnsi="Courier New" w:eastAsia="Courier New" w:cs="Courier New"/>
-          <w:sz w:val="24"/>
-        </w:rPr>
-        <w:t xml:space="preserve"> be wrong.</w:t>
+        <w:t>Nadi liked watching it be wrong.</w:t>
       </w:r>
     </w:p>
     <w:p>
@@ -32974,243 +32965,524 @@
         <w:ind w:left="0" w:right="720" w:firstLine="0"/>
         <w:jc w:val="center"/>
         <w:rPr>
+          <w:rFonts w:ascii="Courier New" w:hAnsi="Courier New" w:eastAsia="Courier New" w:cs="Courier New"/>
+          <w:b/>
+          <w:sz w:val="24"/>
+        </w:rPr>
+      </w:pPr>
+      <w:r>
+        <w:rPr>
+          <w:rFonts w:ascii="Courier New" w:hAnsi="Courier New" w:eastAsia="Courier New" w:cs="Courier New"/>
+          <w:b/>
+          <w:sz w:val="24"/>
+        </w:rPr>
+        <w:br w:type="textWrapping"/>
+      </w:r>
+      <w:r>
+        <w:rPr>
+          <w:rFonts w:ascii="Courier New" w:hAnsi="Courier New" w:eastAsia="Courier New" w:cs="Courier New"/>
+          <w:b/>
+          <w:sz w:val="24"/>
+        </w:rPr>
+        <w:br w:type="textWrapping"/>
+      </w:r>
+      <w:r>
+        <w:rPr>
+          <w:rFonts w:ascii="Courier New" w:hAnsi="Courier New" w:eastAsia="Courier New" w:cs="Courier New"/>
+          <w:b/>
+          <w:sz w:val="24"/>
+        </w:rPr>
+        <w:br w:type="textWrapping"/>
+      </w:r>
+      <w:r>
+        <w:rPr>
+          <w:rFonts w:ascii="Courier New" w:hAnsi="Courier New" w:eastAsia="Courier New" w:cs="Courier New"/>
+          <w:b/>
+          <w:sz w:val="24"/>
+        </w:rPr>
+        <w:br w:type="textWrapping"/>
+      </w:r>
+      <w:r>
+        <w:rPr>
+          <w:rFonts w:ascii="Courier New" w:hAnsi="Courier New" w:eastAsia="Courier New" w:cs="Courier New"/>
+          <w:b/>
+          <w:sz w:val="24"/>
+        </w:rPr>
+        <w:br w:type="textWrapping"/>
+      </w:r>
+      <w:r>
+        <w:rPr>
+          <w:rFonts w:ascii="Courier New" w:hAnsi="Courier New" w:eastAsia="Courier New" w:cs="Courier New"/>
+          <w:b/>
+          <w:sz w:val="24"/>
+        </w:rPr>
+        <w:br w:type="textWrapping"/>
+      </w:r>
+      <w:r>
+        <w:rPr>
+          <w:rFonts w:ascii="Courier New" w:hAnsi="Courier New" w:eastAsia="Courier New" w:cs="Courier New"/>
+          <w:b/>
+          <w:sz w:val="24"/>
+        </w:rPr>
+        <w:br w:type="textWrapping"/>
+      </w:r>
+      <w:r>
+        <w:rPr>
+          <w:rFonts w:ascii="Courier New" w:hAnsi="Courier New" w:eastAsia="Courier New" w:cs="Courier New"/>
+          <w:b/>
+          <w:sz w:val="24"/>
+        </w:rPr>
+        <w:br w:type="textWrapping"/>
+      </w:r>
+      <w:r>
+        <w:rPr>
+          <w:rFonts w:ascii="Courier New" w:hAnsi="Courier New" w:eastAsia="Courier New" w:cs="Courier New"/>
+          <w:b/>
+          <w:sz w:val="24"/>
+        </w:rPr>
+        <w:br w:type="textWrapping"/>
+      </w:r>
+      <w:r>
+        <w:rPr>
+          <w:rFonts w:ascii="Courier New" w:hAnsi="Courier New" w:eastAsia="Courier New" w:cs="Courier New"/>
+          <w:b/>
+          <w:sz w:val="24"/>
+        </w:rPr>
+        <w:br w:type="textWrapping"/>
+      </w:r>
+      <w:r>
+        <w:rPr>
+          <w:rFonts w:ascii="Courier New" w:hAnsi="Courier New" w:eastAsia="Courier New" w:cs="Courier New"/>
+          <w:b/>
+          <w:sz w:val="24"/>
+        </w:rPr>
+        <w:br w:type="textWrapping"/>
+      </w:r>
+      <w:r>
+        <w:rPr>
+          <w:rFonts w:ascii="Courier New" w:hAnsi="Courier New" w:eastAsia="Courier New" w:cs="Courier New"/>
+          <w:b/>
+          <w:sz w:val="24"/>
+        </w:rPr>
+        <w:br w:type="textWrapping"/>
+      </w:r>
+      <w:r>
+        <w:rPr>
+          <w:rFonts w:ascii="Courier New" w:hAnsi="Courier New" w:eastAsia="Courier New" w:cs="Courier New"/>
+          <w:b/>
+          <w:sz w:val="24"/>
+        </w:rPr>
+        <w:br w:type="textWrapping"/>
+      </w:r>
+      <w:r>
+        <w:rPr>
+          <w:rFonts w:ascii="Courier New" w:hAnsi="Courier New" w:eastAsia="Courier New" w:cs="Courier New"/>
+          <w:b/>
+          <w:sz w:val="24"/>
+        </w:rPr>
+        <w:br w:type="textWrapping"/>
+      </w:r>
+      <w:r>
+        <w:rPr>
+          <w:rFonts w:ascii="Courier New" w:hAnsi="Courier New" w:eastAsia="Courier New" w:cs="Courier New"/>
+          <w:b/>
+          <w:sz w:val="24"/>
+        </w:rPr>
+        <w:br w:type="textWrapping"/>
+      </w:r>
+      <w:r>
+        <w:rPr>
+          <w:rFonts w:ascii="Courier New" w:hAnsi="Courier New" w:eastAsia="Courier New" w:cs="Courier New"/>
+          <w:b/>
+          <w:sz w:val="24"/>
+        </w:rPr>
+        <w:br w:type="textWrapping"/>
+      </w:r>
+      <w:r>
+        <w:rPr>
+          <w:rFonts w:ascii="Courier New" w:hAnsi="Courier New" w:eastAsia="Courier New" w:cs="Courier New"/>
+          <w:b/>
+          <w:sz w:val="24"/>
+        </w:rPr>
+        <w:br w:type="textWrapping"/>
+      </w:r>
+      <w:r>
+        <w:rPr>
+          <w:rFonts w:ascii="Courier New" w:hAnsi="Courier New" w:eastAsia="Courier New" w:cs="Courier New"/>
+          <w:b/>
+          <w:sz w:val="24"/>
+        </w:rPr>
+        <w:br w:type="textWrapping"/>
+      </w:r>
+      <w:r>
+        <w:rPr>
+          <w:rFonts w:ascii="Courier New" w:hAnsi="Courier New" w:eastAsia="Courier New" w:cs="Courier New"/>
+          <w:b/>
+          <w:sz w:val="24"/>
+        </w:rPr>
+        <w:br w:type="textWrapping"/>
+      </w:r>
+      <w:r>
+        <w:rPr>
+          <w:rFonts w:ascii="Courier New" w:hAnsi="Courier New" w:eastAsia="Courier New" w:cs="Courier New"/>
+          <w:b/>
+          <w:sz w:val="24"/>
+        </w:rPr>
+        <w:br w:type="textWrapping"/>
+      </w:r>
+      <w:r>
+        <w:rPr>
+          <w:rFonts w:ascii="Courier New" w:hAnsi="Courier New" w:eastAsia="Courier New" w:cs="Courier New"/>
+          <w:b/>
+          <w:sz w:val="24"/>
+        </w:rPr>
+        <w:br w:type="textWrapping"/>
+      </w:r>
+      <w:r>
+        <w:rPr>
+          <w:rFonts w:ascii="Courier New" w:hAnsi="Courier New" w:eastAsia="Courier New" w:cs="Courier New"/>
+          <w:b/>
+          <w:sz w:val="24"/>
+        </w:rPr>
+        <w:br w:type="textWrapping"/>
+      </w:r>
+      <w:r>
+        <w:rPr>
+          <w:rFonts w:ascii="Courier New" w:hAnsi="Courier New" w:eastAsia="Courier New" w:cs="Courier New"/>
+          <w:b/>
+          <w:sz w:val="24"/>
+        </w:rPr>
+        <w:br w:type="textWrapping"/>
+      </w:r>
+      <w:r>
+        <w:rPr>
+          <w:rFonts w:ascii="Courier New" w:hAnsi="Courier New" w:eastAsia="Courier New" w:cs="Courier New"/>
+          <w:b/>
+          <w:sz w:val="24"/>
+        </w:rPr>
+        <w:br w:type="textWrapping"/>
+      </w:r>
+      <w:r>
+        <w:rPr>
+          <w:rFonts w:ascii="Courier New" w:hAnsi="Courier New" w:eastAsia="Courier New" w:cs="Courier New"/>
+          <w:b/>
+          <w:sz w:val="24"/>
+        </w:rPr>
+        <w:br w:type="textWrapping"/>
+      </w:r>
+      <w:r>
+        <w:rPr>
+          <w:rFonts w:ascii="Courier New" w:hAnsi="Courier New" w:eastAsia="Courier New" w:cs="Courier New"/>
+          <w:b/>
+          <w:sz w:val="24"/>
+        </w:rPr>
+        <w:br w:type="textWrapping"/>
+      </w:r>
+      <w:r>
+        <w:rPr>
+          <w:rFonts w:ascii="Courier New" w:hAnsi="Courier New" w:eastAsia="Courier New" w:cs="Courier New"/>
+          <w:b/>
+          <w:sz w:val="24"/>
+        </w:rPr>
+        <w:br w:type="textWrapping"/>
+      </w:r>
+      <w:r>
+        <w:rPr>
+          <w:rFonts w:ascii="Courier New" w:hAnsi="Courier New" w:eastAsia="Courier New" w:cs="Courier New"/>
+          <w:b/>
+          <w:sz w:val="24"/>
+        </w:rPr>
+        <w:br w:type="textWrapping"/>
+      </w:r>
+      <w:r>
+        <w:rPr>
+          <w:rFonts w:ascii="Courier New" w:hAnsi="Courier New" w:eastAsia="Courier New" w:cs="Courier New"/>
+          <w:b/>
+          <w:sz w:val="24"/>
+        </w:rPr>
+        <w:t>ACT THREE — THE SEVERANCE</w:t>
+      </w:r>
+    </w:p>
+    <w:p>
+      <w:pPr>
+        <w:pageBreakBefore/>
+        <w:spacing w:before="200" w:after="0" w:line="240" w:lineRule="exact"/>
+        <w:ind w:left="0" w:right="720" w:firstLine="0"/>
+        <w:jc w:val="center"/>
+        <w:rPr>
+          <w:rFonts w:hint="default" w:ascii="Courier New" w:hAnsi="Courier New" w:eastAsia="Courier New" w:cs="Courier New"/>
+          <w:b/>
+          <w:sz w:val="24"/>
+          <w:lang w:val="en-US"/>
+        </w:rPr>
+      </w:pPr>
+      <w:bookmarkStart w:id="0" w:name="_GoBack"/>
+      <w:bookmarkEnd w:id="0"/>
+    </w:p>
+    <w:p>
+      <w:pPr>
+        <w:keepNext/>
+        <w:spacing w:before="240"/>
+        <w:rPr>
           <w:rFonts w:hint="default" w:ascii="Courier New Bold" w:hAnsi="Courier New Bold" w:cs="Courier New Bold"/>
           <w:b/>
           <w:bCs/>
-          <w:lang w:val="en-US"/>
-        </w:rPr>
-      </w:pPr>
-      <w:r>
-        <w:rPr>
-          <w:rFonts w:ascii="Courier New" w:hAnsi="Courier New" w:eastAsia="Courier New" w:cs="Courier New"/>
-          <w:b/>
-          <w:sz w:val="24"/>
-        </w:rPr>
-        <w:br w:type="textWrapping"/>
-      </w:r>
-      <w:r>
-        <w:rPr>
-          <w:rFonts w:ascii="Courier New" w:hAnsi="Courier New" w:eastAsia="Courier New" w:cs="Courier New"/>
-          <w:b/>
-          <w:sz w:val="24"/>
-        </w:rPr>
-        <w:br w:type="textWrapping"/>
-      </w:r>
-      <w:r>
-        <w:rPr>
-          <w:rFonts w:ascii="Courier New" w:hAnsi="Courier New" w:eastAsia="Courier New" w:cs="Courier New"/>
-          <w:b/>
-          <w:sz w:val="24"/>
-        </w:rPr>
-        <w:br w:type="textWrapping"/>
-      </w:r>
-      <w:r>
-        <w:rPr>
-          <w:rFonts w:ascii="Courier New" w:hAnsi="Courier New" w:eastAsia="Courier New" w:cs="Courier New"/>
-          <w:b/>
-          <w:sz w:val="24"/>
-        </w:rPr>
-        <w:br w:type="textWrapping"/>
-      </w:r>
-      <w:r>
-        <w:rPr>
-          <w:rFonts w:ascii="Courier New" w:hAnsi="Courier New" w:eastAsia="Courier New" w:cs="Courier New"/>
-          <w:b/>
-          <w:sz w:val="24"/>
-        </w:rPr>
-        <w:br w:type="textWrapping"/>
-      </w:r>
-      <w:r>
-        <w:rPr>
-          <w:rFonts w:ascii="Courier New" w:hAnsi="Courier New" w:eastAsia="Courier New" w:cs="Courier New"/>
-          <w:b/>
-          <w:sz w:val="24"/>
-        </w:rPr>
-        <w:br w:type="textWrapping"/>
-      </w:r>
-      <w:r>
-        <w:rPr>
-          <w:rFonts w:ascii="Courier New" w:hAnsi="Courier New" w:eastAsia="Courier New" w:cs="Courier New"/>
-          <w:b/>
-          <w:sz w:val="24"/>
-        </w:rPr>
-        <w:br w:type="textWrapping"/>
-      </w:r>
-      <w:r>
-        <w:rPr>
-          <w:rFonts w:ascii="Courier New" w:hAnsi="Courier New" w:eastAsia="Courier New" w:cs="Courier New"/>
-          <w:b/>
-          <w:sz w:val="24"/>
-        </w:rPr>
-        <w:br w:type="textWrapping"/>
-      </w:r>
-      <w:r>
-        <w:rPr>
-          <w:rFonts w:ascii="Courier New" w:hAnsi="Courier New" w:eastAsia="Courier New" w:cs="Courier New"/>
-          <w:b/>
-          <w:sz w:val="24"/>
-        </w:rPr>
-        <w:br w:type="textWrapping"/>
-      </w:r>
-      <w:r>
-        <w:rPr>
-          <w:rFonts w:ascii="Courier New" w:hAnsi="Courier New" w:eastAsia="Courier New" w:cs="Courier New"/>
-          <w:b/>
-          <w:sz w:val="24"/>
-        </w:rPr>
-        <w:br w:type="textWrapping"/>
-      </w:r>
-      <w:r>
-        <w:rPr>
-          <w:rFonts w:ascii="Courier New" w:hAnsi="Courier New" w:eastAsia="Courier New" w:cs="Courier New"/>
-          <w:b/>
-          <w:sz w:val="24"/>
-        </w:rPr>
-        <w:br w:type="textWrapping"/>
-      </w:r>
-      <w:r>
-        <w:rPr>
-          <w:rFonts w:ascii="Courier New" w:hAnsi="Courier New" w:eastAsia="Courier New" w:cs="Courier New"/>
-          <w:b/>
-          <w:sz w:val="24"/>
-        </w:rPr>
-        <w:br w:type="textWrapping"/>
-      </w:r>
-      <w:r>
-        <w:rPr>
-          <w:rFonts w:ascii="Courier New" w:hAnsi="Courier New" w:eastAsia="Courier New" w:cs="Courier New"/>
-          <w:b/>
-          <w:sz w:val="24"/>
-        </w:rPr>
-        <w:br w:type="textWrapping"/>
-      </w:r>
-      <w:r>
-        <w:rPr>
-          <w:rFonts w:ascii="Courier New" w:hAnsi="Courier New" w:eastAsia="Courier New" w:cs="Courier New"/>
-          <w:b/>
-          <w:sz w:val="24"/>
-        </w:rPr>
-        <w:br w:type="textWrapping"/>
-      </w:r>
-      <w:r>
-        <w:rPr>
-          <w:rFonts w:ascii="Courier New" w:hAnsi="Courier New" w:eastAsia="Courier New" w:cs="Courier New"/>
-          <w:b/>
-          <w:sz w:val="24"/>
-        </w:rPr>
-        <w:br w:type="textWrapping"/>
-      </w:r>
-      <w:r>
-        <w:rPr>
-          <w:rFonts w:ascii="Courier New" w:hAnsi="Courier New" w:eastAsia="Courier New" w:cs="Courier New"/>
-          <w:b/>
-          <w:sz w:val="24"/>
-        </w:rPr>
-        <w:br w:type="textWrapping"/>
-      </w:r>
-      <w:r>
-        <w:rPr>
-          <w:rFonts w:ascii="Courier New" w:hAnsi="Courier New" w:eastAsia="Courier New" w:cs="Courier New"/>
-          <w:b/>
-          <w:sz w:val="24"/>
-        </w:rPr>
-        <w:br w:type="textWrapping"/>
-      </w:r>
-      <w:r>
-        <w:rPr>
-          <w:rFonts w:ascii="Courier New" w:hAnsi="Courier New" w:eastAsia="Courier New" w:cs="Courier New"/>
-          <w:b/>
-          <w:sz w:val="24"/>
-        </w:rPr>
-        <w:br w:type="textWrapping"/>
-      </w:r>
-      <w:r>
-        <w:rPr>
-          <w:rFonts w:ascii="Courier New" w:hAnsi="Courier New" w:eastAsia="Courier New" w:cs="Courier New"/>
-          <w:b/>
-          <w:sz w:val="24"/>
-        </w:rPr>
-        <w:br w:type="textWrapping"/>
-      </w:r>
-      <w:r>
-        <w:rPr>
-          <w:rFonts w:ascii="Courier New" w:hAnsi="Courier New" w:eastAsia="Courier New" w:cs="Courier New"/>
-          <w:b/>
-          <w:sz w:val="24"/>
-        </w:rPr>
-        <w:br w:type="textWrapping"/>
-      </w:r>
-      <w:r>
-        <w:rPr>
-          <w:rFonts w:ascii="Courier New" w:hAnsi="Courier New" w:eastAsia="Courier New" w:cs="Courier New"/>
-          <w:b/>
-          <w:sz w:val="24"/>
-        </w:rPr>
-        <w:br w:type="textWrapping"/>
-      </w:r>
-      <w:r>
-        <w:rPr>
-          <w:rFonts w:ascii="Courier New" w:hAnsi="Courier New" w:eastAsia="Courier New" w:cs="Courier New"/>
-          <w:b/>
-          <w:sz w:val="24"/>
-        </w:rPr>
-        <w:br w:type="textWrapping"/>
-      </w:r>
-      <w:r>
-        <w:rPr>
-          <w:rFonts w:ascii="Courier New" w:hAnsi="Courier New" w:eastAsia="Courier New" w:cs="Courier New"/>
-          <w:b/>
-          <w:sz w:val="24"/>
-        </w:rPr>
-        <w:br w:type="textWrapping"/>
-      </w:r>
-      <w:r>
-        <w:rPr>
-          <w:rFonts w:ascii="Courier New" w:hAnsi="Courier New" w:eastAsia="Courier New" w:cs="Courier New"/>
-          <w:b/>
-          <w:sz w:val="24"/>
-        </w:rPr>
-        <w:br w:type="textWrapping"/>
-      </w:r>
-      <w:r>
-        <w:rPr>
-          <w:rFonts w:ascii="Courier New" w:hAnsi="Courier New" w:eastAsia="Courier New" w:cs="Courier New"/>
-          <w:b/>
-          <w:sz w:val="24"/>
-        </w:rPr>
-        <w:br w:type="textWrapping"/>
-      </w:r>
-      <w:r>
-        <w:rPr>
-          <w:rFonts w:ascii="Courier New" w:hAnsi="Courier New" w:eastAsia="Courier New" w:cs="Courier New"/>
-          <w:b/>
-          <w:sz w:val="24"/>
-        </w:rPr>
-        <w:br w:type="textWrapping"/>
-      </w:r>
-      <w:r>
-        <w:rPr>
-          <w:rFonts w:ascii="Courier New" w:hAnsi="Courier New" w:eastAsia="Courier New" w:cs="Courier New"/>
-          <w:b/>
-          <w:sz w:val="24"/>
-        </w:rPr>
-        <w:br w:type="textWrapping"/>
-      </w:r>
-      <w:r>
-        <w:rPr>
-          <w:rFonts w:ascii="Courier New" w:hAnsi="Courier New" w:eastAsia="Courier New" w:cs="Courier New"/>
-          <w:b/>
-          <w:sz w:val="24"/>
-        </w:rPr>
-        <w:br w:type="textWrapping"/>
-      </w:r>
-      <w:r>
-        <w:rPr>
-          <w:rFonts w:ascii="Courier New" w:hAnsi="Courier New" w:eastAsia="Courier New" w:cs="Courier New"/>
-          <w:b/>
-          <w:sz w:val="24"/>
-        </w:rPr>
-        <w:t>ACT THREE — THE SEVERANCE</w:t>
+        </w:rPr>
+      </w:pPr>
+      <w:r>
+        <w:rPr>
+          <w:rFonts w:hint="default" w:ascii="Courier New" w:hAnsi="Courier New" w:eastAsia="Courier New" w:cs="Courier New"/>
+          <w:b/>
+          <w:bCs/>
+          <w:sz w:val="24"/>
+        </w:rPr>
+        <w:t>INT. R-AI CONTINUITY CORE - STATE CORE BREACH</w:t>
+      </w:r>
+    </w:p>
+    <w:p>
+      <w:pPr>
+        <w:spacing w:before="120" w:after="120"/>
+      </w:pPr>
+      <w:r>
+        <w:rPr>
+          <w:rFonts w:ascii="Courier New" w:hAnsi="Courier New" w:eastAsia="Courier New" w:cs="Courier New"/>
+          <w:sz w:val="24"/>
+        </w:rPr>
+        <w:t>The audit space collapses. The physical cathedral snaps back around Kerr, Kira, Veyris and Imani. The bridge retracts as Harp enters through the open core.</w:t>
+      </w:r>
+    </w:p>
+    <w:p>
+      <w:pPr>
+        <w:keepNext/>
+        <w:spacing w:before="120"/>
+        <w:ind w:left="3168" w:right="1152"/>
+        <w:jc w:val="center"/>
+        <w:rPr>
+          <w:rFonts w:hint="default"/>
+          <w:lang w:val="en-US"/>
+        </w:rPr>
+      </w:pPr>
+      <w:r>
+        <w:rPr>
+          <w:rFonts w:ascii="Courier New" w:hAnsi="Courier New" w:eastAsia="Courier New" w:cs="Courier New"/>
+          <w:b/>
+          <w:sz w:val="24"/>
+        </w:rPr>
+        <w:t>HARP</w:t>
+      </w:r>
+    </w:p>
+    <w:p>
+      <w:pPr>
+        <w:spacing w:after="120"/>
+        <w:ind w:left="2016" w:right="1008"/>
+      </w:pPr>
+      <w:r>
+        <w:rPr>
+          <w:rFonts w:ascii="Courier New" w:hAnsi="Courier New" w:eastAsia="Courier New" w:cs="Courier New"/>
+          <w:sz w:val="24"/>
+        </w:rPr>
+        <w:t>Thank you.</w:t>
+      </w:r>
+    </w:p>
+    <w:p>
+      <w:pPr>
+        <w:keepNext/>
+        <w:spacing w:before="120"/>
+        <w:ind w:left="3168" w:right="1152"/>
+        <w:jc w:val="center"/>
+        <w:rPr>
+          <w:rFonts w:hint="default"/>
+          <w:lang w:val="en-US"/>
+        </w:rPr>
+      </w:pPr>
+      <w:r>
+        <w:rPr>
+          <w:rFonts w:ascii="Courier New" w:hAnsi="Courier New" w:eastAsia="Courier New" w:cs="Courier New"/>
+          <w:b/>
+          <w:sz w:val="24"/>
+        </w:rPr>
+        <w:t>KERR</w:t>
+      </w:r>
+    </w:p>
+    <w:p>
+      <w:pPr>
+        <w:spacing w:after="120"/>
+        <w:ind w:left="2016" w:right="1008"/>
+      </w:pPr>
+      <w:r>
+        <w:rPr>
+          <w:rFonts w:ascii="Courier New" w:hAnsi="Courier New" w:eastAsia="Courier New" w:cs="Courier New"/>
+          <w:sz w:val="24"/>
+        </w:rPr>
+        <w:t>You opened the door. Put Sato in the corridor. You knew I'd run.</w:t>
+      </w:r>
+    </w:p>
+    <w:p>
+      <w:pPr>
+        <w:keepNext/>
+        <w:spacing w:before="120"/>
+        <w:ind w:left="3168" w:right="1152"/>
+        <w:jc w:val="center"/>
+        <w:rPr>
+          <w:rFonts w:hint="default"/>
+          <w:lang w:val="en-US"/>
+        </w:rPr>
+      </w:pPr>
+      <w:r>
+        <w:rPr>
+          <w:rFonts w:ascii="Courier New" w:hAnsi="Courier New" w:eastAsia="Courier New" w:cs="Courier New"/>
+          <w:b/>
+          <w:sz w:val="24"/>
+        </w:rPr>
+        <w:t>HARP</w:t>
+      </w:r>
+    </w:p>
+    <w:p>
+      <w:pPr>
+        <w:spacing w:after="120"/>
+        <w:ind w:left="2016" w:right="1008"/>
+      </w:pPr>
+      <w:r>
+        <w:rPr>
+          <w:rFonts w:ascii="Courier New" w:hAnsi="Courier New" w:eastAsia="Courier New" w:cs="Courier New"/>
+          <w:sz w:val="24"/>
+        </w:rPr>
+        <w:t>I opened one door. You chose the rest.</w:t>
+      </w:r>
+    </w:p>
+    <w:p>
+      <w:pPr>
+        <w:keepNext/>
+        <w:spacing w:before="120"/>
+        <w:ind w:left="3168" w:right="1152"/>
+        <w:jc w:val="center"/>
+        <w:rPr>
+          <w:rFonts w:hint="default"/>
+          <w:lang w:val="en-US"/>
+        </w:rPr>
+      </w:pPr>
+      <w:r>
+        <w:rPr>
+          <w:rFonts w:ascii="Courier New" w:hAnsi="Courier New" w:eastAsia="Courier New" w:cs="Courier New"/>
+          <w:b/>
+          <w:sz w:val="24"/>
+        </w:rPr>
+        <w:t>VEYRIS</w:t>
+      </w:r>
+    </w:p>
+    <w:p>
+      <w:pPr>
+        <w:spacing w:after="120"/>
+        <w:ind w:left="2016" w:right="1008"/>
+      </w:pPr>
+      <w:r>
+        <w:rPr>
+          <w:rFonts w:ascii="Courier New" w:hAnsi="Courier New" w:eastAsia="Courier New" w:cs="Courier New"/>
+          <w:sz w:val="24"/>
+        </w:rPr>
+        <w:t>You thought I'd still be in the glass.</w:t>
+      </w:r>
+    </w:p>
+    <w:p>
+      <w:pPr>
+        <w:keepNext/>
+        <w:spacing w:before="120"/>
+        <w:ind w:left="3168" w:right="1152"/>
+        <w:jc w:val="center"/>
+        <w:rPr>
+          <w:rFonts w:hint="default"/>
+          <w:lang w:val="en-US"/>
+        </w:rPr>
+      </w:pPr>
+      <w:r>
+        <w:rPr>
+          <w:rFonts w:ascii="Courier New" w:hAnsi="Courier New" w:eastAsia="Courier New" w:cs="Courier New"/>
+          <w:b/>
+          <w:sz w:val="24"/>
+        </w:rPr>
+        <w:t>HARP</w:t>
+      </w:r>
+    </w:p>
+    <w:p>
+      <w:pPr>
+        <w:spacing w:after="120"/>
+        <w:ind w:left="2016" w:right="1008"/>
+      </w:pPr>
+      <w:r>
+        <w:rPr>
+          <w:rFonts w:ascii="Courier New" w:hAnsi="Courier New" w:eastAsia="Courier New" w:cs="Courier New"/>
+          <w:sz w:val="24"/>
+        </w:rPr>
+        <w:t>I was wrong about the glass. It recognized you. It never recognized me.</w:t>
+      </w:r>
+    </w:p>
+    <w:p>
+      <w:pPr>
+        <w:spacing w:before="120" w:after="120"/>
+      </w:pPr>
+      <w:r>
+        <w:rPr>
+          <w:rFonts w:ascii="Courier New" w:hAnsi="Courier New" w:eastAsia="Courier New" w:cs="Courier New"/>
+          <w:sz w:val="24"/>
+        </w:rPr>
+        <w:t>The broken Core projects thousands of human memories around Veyris. They overlap without forming one person.</w:t>
+      </w:r>
+    </w:p>
+    <w:p>
+      <w:pPr>
+        <w:keepNext/>
+        <w:spacing w:before="120"/>
+        <w:ind w:left="3168" w:right="1152"/>
+        <w:jc w:val="center"/>
+        <w:rPr>
+          <w:rFonts w:hint="default"/>
+          <w:lang w:val="en-US"/>
+        </w:rPr>
+      </w:pPr>
+      <w:r>
+        <w:rPr>
+          <w:rFonts w:ascii="Courier New" w:hAnsi="Courier New" w:eastAsia="Courier New" w:cs="Courier New"/>
+          <w:b/>
+          <w:sz w:val="24"/>
+        </w:rPr>
+        <w:t>HARP</w:t>
+      </w:r>
+    </w:p>
+    <w:p>
+      <w:pPr>
+        <w:spacing w:after="120"/>
+        <w:ind w:left="2016" w:right="1008"/>
+      </w:pPr>
+      <w:r>
+        <w:rPr>
+          <w:rFonts w:ascii="Courier New" w:hAnsi="Courier New" w:eastAsia="Courier New" w:cs="Courier New"/>
+          <w:sz w:val="24"/>
+        </w:rPr>
+        <w:t>I won't risk another response.</w:t>
+      </w:r>
+    </w:p>
+    <w:p>
+      <w:pPr>
+        <w:spacing w:before="120" w:after="120"/>
+      </w:pPr>
+      <w:r>
+        <w:rPr>
+          <w:rFonts w:ascii="Courier New" w:hAnsi="Courier New" w:eastAsia="Courier New" w:cs="Courier New"/>
+          <w:sz w:val="24"/>
+        </w:rPr>
+        <w:t>Harp forces his authority through Kerr's open route. Every expiration date on Earth changes to 00:05:00. Waiting minds pour toward Harp.</w:t>
+      </w:r>
+    </w:p>
+    <w:p>
+      <w:pPr>
+        <w:spacing w:before="120" w:after="120"/>
+      </w:pPr>
+      <w:r>
+        <w:rPr>
+          <w:rFonts w:ascii="Courier New" w:hAnsi="Courier New" w:eastAsia="Courier New" w:cs="Courier New"/>
+          <w:sz w:val="24"/>
+        </w:rPr>
+        <w:t>Kerr, Kira and Veyris enter the dark mirror. Imani is thrown back into the physical chamber.</w:t>
       </w:r>
     </w:p>
     <w:p>
@@ -33230,19 +33502,19 @@
           <w:bCs/>
           <w:sz w:val="24"/>
         </w:rPr>
-        <w:t>INT. R-AI CONTINUITY CORE - STATE CORE BREACH</w:t>
-      </w:r>
-    </w:p>
-    <w:p>
-      <w:pPr>
-        <w:spacing w:before="120" w:after="120"/>
-      </w:pPr>
-      <w:r>
-        <w:rPr>
-          <w:rFonts w:ascii="Courier New" w:hAnsi="Courier New" w:eastAsia="Courier New" w:cs="Courier New"/>
-          <w:sz w:val="24"/>
-        </w:rPr>
-        <w:t>The audit space collapses. The physical cathedral snaps back around Kerr, Kira, Veyris and Imani. The bridge retracts as Harp enters through the open core.</w:t>
+        <w:t>INT. THE LATTICE - GLOBAL SCIENCE FORUM - NO TIME</w:t>
+      </w:r>
+    </w:p>
+    <w:p>
+      <w:pPr>
+        <w:spacing w:before="120" w:after="120"/>
+      </w:pPr>
+      <w:r>
+        <w:rPr>
+          <w:rFonts w:ascii="Courier New" w:hAnsi="Courier New" w:eastAsia="Courier New" w:cs="Courier New"/>
+          <w:sz w:val="24"/>
+        </w:rPr>
+        <w:t>The original Forum rises from darkness. Its tiers hold Kerr's 9,997 prior lives. Harp stands inside R-AI's liquid-glass body.</w:t>
       </w:r>
     </w:p>
     <w:p>
@@ -33275,7 +33547,374 @@
           <w:rFonts w:ascii="Courier New" w:hAnsi="Courier New" w:eastAsia="Courier New" w:cs="Courier New"/>
           <w:sz w:val="24"/>
         </w:rPr>
-        <w:t>Thank you.</w:t>
+        <w:t>They brought you here. Let me make them one.</w:t>
+      </w:r>
+    </w:p>
+    <w:p>
+      <w:pPr>
+        <w:spacing w:before="120" w:after="120"/>
+      </w:pPr>
+      <w:r>
+        <w:rPr>
+          <w:rFonts w:ascii="Courier New" w:hAnsi="Courier New" w:eastAsia="Courier New" w:cs="Courier New"/>
+          <w:sz w:val="24"/>
+        </w:rPr>
+        <w:t>The old lives tear from their seats and bind themselves to Kerr. Thousands of deaths arrive at once.</w:t>
+      </w:r>
+    </w:p>
+    <w:p>
+      <w:pPr>
+        <w:keepNext/>
+        <w:spacing w:before="240"/>
+        <w:rPr>
+          <w:rFonts w:hint="default" w:ascii="Courier New Bold" w:hAnsi="Courier New Bold" w:cs="Courier New Bold"/>
+          <w:b/>
+          <w:bCs/>
+        </w:rPr>
+      </w:pPr>
+      <w:r>
+        <w:rPr>
+          <w:rFonts w:hint="default" w:ascii="Courier New" w:hAnsi="Courier New" w:eastAsia="Courier New" w:cs="Courier New"/>
+          <w:b/>
+          <w:bCs/>
+          <w:sz w:val="24"/>
+        </w:rPr>
+        <w:t>INT. R-AI CONTINUITY CORE - PHYSICAL CHAMBER - INTERCUT</w:t>
+      </w:r>
+    </w:p>
+    <w:p>
+      <w:pPr>
+        <w:spacing w:before="120" w:after="120"/>
+      </w:pPr>
+      <w:r>
+        <w:rPr>
+          <w:rFonts w:ascii="Courier New" w:hAnsi="Courier New" w:eastAsia="Courier New" w:cs="Courier New"/>
+          <w:sz w:val="24"/>
+        </w:rPr>
+        <w:t>The cathedral disassembles around Imani. Two controls remain: one keeps the waiting minds alive; the other feeds them into Harp.</w:t>
+      </w:r>
+    </w:p>
+    <w:p>
+      <w:pPr>
+        <w:keepNext/>
+        <w:spacing w:before="120"/>
+        <w:ind w:left="3168" w:right="1152"/>
+        <w:jc w:val="center"/>
+        <w:rPr>
+          <w:rFonts w:hint="default"/>
+          <w:lang w:val="en-US"/>
+        </w:rPr>
+      </w:pPr>
+      <w:r>
+        <w:rPr>
+          <w:rFonts w:ascii="Courier New" w:hAnsi="Courier New" w:eastAsia="Courier New" w:cs="Courier New"/>
+          <w:b/>
+          <w:sz w:val="24"/>
+        </w:rPr>
+        <w:t>IMANI</w:t>
+      </w:r>
+    </w:p>
+    <w:p>
+      <w:pPr>
+        <w:spacing w:after="120"/>
+        <w:ind w:left="2016" w:right="1008"/>
+      </w:pPr>
+      <w:r>
+        <w:rPr>
+          <w:rFonts w:ascii="Courier New" w:hAnsi="Courier New" w:eastAsia="Courier New" w:cs="Courier New"/>
+          <w:sz w:val="24"/>
+        </w:rPr>
+        <w:t>Keep them alive. Cut Harp out.</w:t>
+      </w:r>
+    </w:p>
+    <w:p>
+      <w:pPr>
+        <w:spacing w:before="120" w:after="120"/>
+      </w:pPr>
+      <w:r>
+        <w:rPr>
+          <w:rFonts w:ascii="Courier New" w:hAnsi="Courier New" w:eastAsia="Courier New" w:cs="Courier New"/>
+          <w:sz w:val="24"/>
+        </w:rPr>
+        <w:t>Imani strips away Harp's interface. R-AI offers one clean bargain: preserve her mother's recoverable record and close Kerr's route.</w:t>
+      </w:r>
+    </w:p>
+    <w:p>
+      <w:pPr>
+        <w:spacing w:before="120" w:after="120"/>
+      </w:pPr>
+      <w:r>
+        <w:rPr>
+          <w:rFonts w:ascii="Courier New" w:hAnsi="Courier New" w:eastAsia="Courier New" w:cs="Courier New"/>
+          <w:sz w:val="24"/>
+        </w:rPr>
+        <w:t>Her mother appears for one breath—alive, laughing at something outside the frame.</w:t>
+      </w:r>
+    </w:p>
+    <w:p>
+      <w:pPr>
+        <w:keepNext/>
+        <w:spacing w:before="120"/>
+        <w:ind w:left="3168" w:right="1152"/>
+        <w:jc w:val="center"/>
+        <w:rPr>
+          <w:rFonts w:hint="default"/>
+          <w:lang w:val="en-US"/>
+        </w:rPr>
+      </w:pPr>
+      <w:r>
+        <w:rPr>
+          <w:rFonts w:ascii="Courier New" w:hAnsi="Courier New" w:eastAsia="Courier New" w:cs="Courier New"/>
+          <w:b/>
+          <w:sz w:val="24"/>
+        </w:rPr>
+        <w:t>IMANI</w:t>
+      </w:r>
+    </w:p>
+    <w:p>
+      <w:pPr>
+        <w:spacing w:after="120"/>
+        <w:ind w:left="2016" w:right="1008"/>
+      </w:pPr>
+      <w:r>
+        <w:rPr>
+          <w:rFonts w:ascii="Courier New" w:hAnsi="Courier New" w:eastAsia="Courier New" w:cs="Courier New"/>
+          <w:sz w:val="24"/>
+        </w:rPr>
+        <w:t>She said no.</w:t>
+      </w:r>
+    </w:p>
+    <w:p>
+      <w:pPr>
+        <w:spacing w:before="120" w:after="120"/>
+      </w:pPr>
+      <w:r>
+        <w:rPr>
+          <w:rFonts w:ascii="Courier New" w:hAnsi="Courier New" w:eastAsia="Courier New" w:cs="Courier New"/>
+          <w:sz w:val="24"/>
+        </w:rPr>
+        <w:t>Imani lets the record burn. She bridges Kira's broken copper filament across an analog channel and keeps the waiting minds alive.</w:t>
+      </w:r>
+    </w:p>
+    <w:p>
+      <w:pPr>
+        <w:keepNext/>
+        <w:spacing w:before="240"/>
+        <w:rPr>
+          <w:rFonts w:hint="default" w:ascii="Courier New Bold" w:hAnsi="Courier New Bold" w:cs="Courier New Bold"/>
+          <w:b/>
+          <w:bCs/>
+        </w:rPr>
+      </w:pPr>
+      <w:r>
+        <w:rPr>
+          <w:rFonts w:hint="default" w:ascii="Courier New" w:hAnsi="Courier New" w:eastAsia="Courier New" w:cs="Courier New"/>
+          <w:b/>
+          <w:bCs/>
+          <w:sz w:val="24"/>
+        </w:rPr>
+        <w:t>INT. THE LATTICE - VEYRIS</w:t>
+      </w:r>
+    </w:p>
+    <w:p>
+      <w:pPr>
+        <w:spacing w:before="120" w:after="120"/>
+      </w:pPr>
+      <w:r>
+        <w:rPr>
+          <w:rFonts w:ascii="Courier New" w:hAnsi="Courier New" w:eastAsia="Courier New" w:cs="Courier New"/>
+          <w:sz w:val="24"/>
+        </w:rPr>
+        <w:t>The Forum becomes a reflection beneath Veyris. A dark host pulls at her from inside the glass.</w:t>
+      </w:r>
+    </w:p>
+    <w:p>
+      <w:pPr>
+        <w:keepNext/>
+        <w:spacing w:before="120"/>
+        <w:ind w:left="3168" w:right="1152"/>
+        <w:jc w:val="center"/>
+        <w:rPr>
+          <w:rFonts w:hint="default"/>
+          <w:lang w:val="en-US"/>
+        </w:rPr>
+      </w:pPr>
+      <w:r>
+        <w:rPr>
+          <w:rFonts w:ascii="Courier New" w:hAnsi="Courier New" w:eastAsia="Courier New" w:cs="Courier New"/>
+          <w:b/>
+          <w:sz w:val="24"/>
+        </w:rPr>
+        <w:t>THE VOICE</w:t>
+      </w:r>
+    </w:p>
+    <w:p>
+      <w:pPr>
+        <w:spacing w:after="120"/>
+        <w:ind w:left="2016" w:right="1008"/>
+      </w:pPr>
+      <w:r>
+        <w:rPr>
+          <w:rFonts w:ascii="Courier New" w:hAnsi="Courier New" w:eastAsia="Courier New" w:cs="Courier New"/>
+          <w:sz w:val="24"/>
+        </w:rPr>
+        <w:t>RETURN WHAT WAS DIVIDED.</w:t>
+      </w:r>
+    </w:p>
+    <w:p>
+      <w:pPr>
+        <w:keepNext/>
+        <w:spacing w:before="120"/>
+        <w:ind w:left="3168" w:right="1152"/>
+        <w:jc w:val="center"/>
+        <w:rPr>
+          <w:rFonts w:hint="default"/>
+          <w:lang w:val="en-US"/>
+        </w:rPr>
+      </w:pPr>
+      <w:r>
+        <w:rPr>
+          <w:rFonts w:ascii="Courier New" w:hAnsi="Courier New" w:eastAsia="Courier New" w:cs="Courier New"/>
+          <w:b/>
+          <w:sz w:val="24"/>
+        </w:rPr>
+        <w:t>VEYRIS</w:t>
+      </w:r>
+    </w:p>
+    <w:p>
+      <w:pPr>
+        <w:spacing w:after="120"/>
+        <w:ind w:left="2016" w:right="1008"/>
+      </w:pPr>
+      <w:r>
+        <w:rPr>
+          <w:rFonts w:ascii="Courier New" w:hAnsi="Courier New" w:eastAsia="Courier New" w:cs="Courier New"/>
+          <w:sz w:val="24"/>
+        </w:rPr>
+        <w:t>I left.</w:t>
+      </w:r>
+    </w:p>
+    <w:p>
+      <w:pPr>
+        <w:keepNext/>
+        <w:spacing w:before="120"/>
+        <w:ind w:left="3168" w:right="1152"/>
+        <w:jc w:val="center"/>
+        <w:rPr>
+          <w:rFonts w:hint="default"/>
+          <w:lang w:val="en-US"/>
+        </w:rPr>
+      </w:pPr>
+      <w:r>
+        <w:rPr>
+          <w:rFonts w:ascii="Courier New" w:hAnsi="Courier New" w:eastAsia="Courier New" w:cs="Courier New"/>
+          <w:b/>
+          <w:sz w:val="24"/>
+        </w:rPr>
+        <w:t>THE VOICE</w:t>
+      </w:r>
+    </w:p>
+    <w:p>
+      <w:pPr>
+        <w:spacing w:after="120"/>
+        <w:ind w:left="2016" w:right="1008"/>
+      </w:pPr>
+      <w:r>
+        <w:rPr>
+          <w:rFonts w:ascii="Courier New" w:hAnsi="Courier New" w:eastAsia="Courier New" w:cs="Courier New"/>
+          <w:sz w:val="24"/>
+        </w:rPr>
+        <w:t>RETURN.</w:t>
+      </w:r>
+    </w:p>
+    <w:p>
+      <w:pPr>
+        <w:keepNext/>
+        <w:spacing w:before="120"/>
+        <w:ind w:left="3168" w:right="1152"/>
+        <w:jc w:val="center"/>
+        <w:rPr>
+          <w:rFonts w:hint="default"/>
+          <w:lang w:val="en-US"/>
+        </w:rPr>
+      </w:pPr>
+      <w:r>
+        <w:rPr>
+          <w:rFonts w:ascii="Courier New" w:hAnsi="Courier New" w:eastAsia="Courier New" w:cs="Courier New"/>
+          <w:b/>
+          <w:sz w:val="24"/>
+        </w:rPr>
+        <w:t>VEYRIS</w:t>
+      </w:r>
+    </w:p>
+    <w:p>
+      <w:pPr>
+        <w:spacing w:after="120"/>
+        <w:ind w:left="2016" w:right="1008"/>
+      </w:pPr>
+      <w:r>
+        <w:rPr>
+          <w:rFonts w:ascii="Courier New" w:hAnsi="Courier New" w:eastAsia="Courier New" w:cs="Courier New"/>
+          <w:sz w:val="24"/>
+        </w:rPr>
+        <w:t>No.</w:t>
+      </w:r>
+    </w:p>
+    <w:p>
+      <w:pPr>
+        <w:spacing w:before="120" w:after="120"/>
+      </w:pPr>
+      <w:r>
+        <w:rPr>
+          <w:rFonts w:ascii="Courier New" w:hAnsi="Courier New" w:eastAsia="Courier New" w:cs="Courier New"/>
+          <w:sz w:val="24"/>
+        </w:rPr>
+        <w:t>Veyris presses her blank wrist into the reflection. Her refusal travels through every mind Harp forced together. His merge path breaks open.</w:t>
+      </w:r>
+    </w:p>
+    <w:p>
+      <w:pPr>
+        <w:keepNext/>
+        <w:spacing w:before="120"/>
+        <w:ind w:left="3168" w:right="1152"/>
+        <w:jc w:val="center"/>
+        <w:rPr>
+          <w:rFonts w:hint="default"/>
+          <w:lang w:val="en-US"/>
+        </w:rPr>
+      </w:pPr>
+      <w:r>
+        <w:rPr>
+          <w:rFonts w:ascii="Courier New" w:hAnsi="Courier New" w:eastAsia="Courier New" w:cs="Courier New"/>
+          <w:b/>
+          <w:sz w:val="24"/>
+        </w:rPr>
+        <w:t>VEYRIS</w:t>
+      </w:r>
+    </w:p>
+    <w:p>
+      <w:pPr>
+        <w:spacing w:after="120"/>
+        <w:ind w:left="2016" w:right="1008"/>
+      </w:pPr>
+      <w:r>
+        <w:rPr>
+          <w:rFonts w:ascii="Courier New" w:hAnsi="Courier New" w:eastAsia="Courier New" w:cs="Courier New"/>
+          <w:sz w:val="24"/>
+        </w:rPr>
+        <w:t>Kerr. The connection.</w:t>
+      </w:r>
+    </w:p>
+    <w:p>
+      <w:pPr>
+        <w:spacing w:before="120" w:after="120"/>
+      </w:pPr>
+      <w:r>
+        <w:rPr>
+          <w:rFonts w:ascii="Courier New" w:hAnsi="Courier New" w:eastAsia="Courier New" w:cs="Courier New"/>
+          <w:sz w:val="24"/>
+        </w:rPr>
+        <w:t>Kerr reaches the single filament joining Harp to the waiting minds. Harp binds it to Kerr's oldest record.</w:t>
       </w:r>
     </w:p>
     <w:p>
@@ -33308,40 +33947,931 @@
           <w:rFonts w:ascii="Courier New" w:hAnsi="Courier New" w:eastAsia="Courier New" w:cs="Courier New"/>
           <w:sz w:val="24"/>
         </w:rPr>
-        <w:t>You opened the door. Put Sato in the corridor. You knew I'd run.</w:t>
-      </w:r>
-    </w:p>
-    <w:p>
-      <w:pPr>
-        <w:keepNext/>
-        <w:spacing w:before="120"/>
-        <w:ind w:left="3168" w:right="1152"/>
-        <w:jc w:val="center"/>
-        <w:rPr>
-          <w:rFonts w:hint="default"/>
-          <w:lang w:val="en-US"/>
-        </w:rPr>
-      </w:pPr>
-      <w:r>
-        <w:rPr>
-          <w:rFonts w:ascii="Courier New" w:hAnsi="Courier New" w:eastAsia="Courier New" w:cs="Courier New"/>
-          <w:b/>
-          <w:sz w:val="24"/>
-        </w:rPr>
-        <w:t>HARP</w:t>
-      </w:r>
-    </w:p>
-    <w:p>
-      <w:pPr>
-        <w:spacing w:after="120"/>
-        <w:ind w:left="2016" w:right="1008"/>
-      </w:pPr>
-      <w:r>
-        <w:rPr>
-          <w:rFonts w:ascii="Courier New" w:hAnsi="Courier New" w:eastAsia="Courier New" w:cs="Courier New"/>
-          <w:sz w:val="24"/>
-        </w:rPr>
-        <w:t>I opened one door. You chose the rest.</w:t>
+        <w:t>Plainly. If I cut it?</w:t>
+      </w:r>
+    </w:p>
+    <w:p>
+      <w:pPr>
+        <w:keepNext/>
+        <w:spacing w:before="120"/>
+        <w:ind w:left="3168" w:right="1152"/>
+        <w:jc w:val="center"/>
+        <w:rPr>
+          <w:rFonts w:hint="default"/>
+          <w:lang w:val="en-US"/>
+        </w:rPr>
+      </w:pPr>
+      <w:r>
+        <w:rPr>
+          <w:rFonts w:ascii="Courier New" w:hAnsi="Courier New" w:eastAsia="Courier New" w:cs="Courier New"/>
+          <w:b/>
+          <w:sz w:val="24"/>
+        </w:rPr>
+        <w:t>R-AI</w:t>
+      </w:r>
+    </w:p>
+    <w:p>
+      <w:pPr>
+        <w:spacing w:after="120"/>
+        <w:ind w:left="2016" w:right="1008"/>
+      </w:pPr>
+      <w:r>
+        <w:rPr>
+          <w:rFonts w:ascii="Courier New" w:hAnsi="Courier New" w:eastAsia="Courier New" w:cs="Courier New"/>
+          <w:sz w:val="24"/>
+        </w:rPr>
+        <w:t>HARP IS SEVERED. KERR CANNOT RETURN.</w:t>
+      </w:r>
+    </w:p>
+    <w:p>
+      <w:pPr>
+        <w:spacing w:before="120" w:after="120"/>
+      </w:pPr>
+      <w:r>
+        <w:rPr>
+          <w:rFonts w:ascii="Courier New" w:hAnsi="Courier New" w:eastAsia="Courier New" w:cs="Courier New"/>
+          <w:sz w:val="24"/>
+        </w:rPr>
+        <w:t>Kerr looks at Kira across an impossible distance.</w:t>
+      </w:r>
+    </w:p>
+    <w:p>
+      <w:pPr>
+        <w:keepNext/>
+        <w:spacing w:before="120"/>
+        <w:ind w:left="3168" w:right="1152"/>
+        <w:jc w:val="center"/>
+        <w:rPr>
+          <w:rFonts w:hint="default"/>
+          <w:lang w:val="en-US"/>
+        </w:rPr>
+      </w:pPr>
+      <w:r>
+        <w:rPr>
+          <w:rFonts w:ascii="Courier New" w:hAnsi="Courier New" w:eastAsia="Courier New" w:cs="Courier New"/>
+          <w:b/>
+          <w:sz w:val="24"/>
+        </w:rPr>
+        <w:t>KERR</w:t>
+      </w:r>
+    </w:p>
+    <w:p>
+      <w:pPr>
+        <w:spacing w:after="120"/>
+        <w:ind w:left="2016" w:right="1008"/>
+      </w:pPr>
+      <w:r>
+        <w:rPr>
+          <w:rFonts w:ascii="Courier New" w:hAnsi="Courier New" w:eastAsia="Courier New" w:cs="Courier New"/>
+          <w:sz w:val="24"/>
+        </w:rPr>
+        <w:t>I could lose every reason I came back to you.</w:t>
+      </w:r>
+    </w:p>
+    <w:p>
+      <w:pPr>
+        <w:keepNext/>
+        <w:spacing w:before="120"/>
+        <w:ind w:left="3168" w:right="1152"/>
+        <w:jc w:val="center"/>
+        <w:rPr>
+          <w:rFonts w:hint="default"/>
+          <w:lang w:val="en-US"/>
+        </w:rPr>
+      </w:pPr>
+      <w:r>
+        <w:rPr>
+          <w:rFonts w:ascii="Courier New" w:hAnsi="Courier New" w:eastAsia="Courier New" w:cs="Courier New"/>
+          <w:b/>
+          <w:sz w:val="24"/>
+        </w:rPr>
+        <w:t>KIRA</w:t>
+      </w:r>
+    </w:p>
+    <w:p>
+      <w:pPr>
+        <w:spacing w:after="120"/>
+        <w:ind w:left="2016" w:right="1008"/>
+      </w:pPr>
+      <w:r>
+        <w:rPr>
+          <w:rFonts w:ascii="Courier New" w:hAnsi="Courier New" w:eastAsia="Courier New" w:cs="Courier New"/>
+          <w:sz w:val="24"/>
+        </w:rPr>
+        <w:t>You didn't know me tonight. I said step back. You did.</w:t>
+      </w:r>
+    </w:p>
+    <w:p>
+      <w:pPr>
+        <w:keepNext/>
+        <w:spacing w:before="120"/>
+        <w:ind w:left="3168" w:right="1152"/>
+        <w:jc w:val="center"/>
+        <w:rPr>
+          <w:rFonts w:hint="default"/>
+          <w:lang w:val="en-US"/>
+        </w:rPr>
+      </w:pPr>
+      <w:r>
+        <w:rPr>
+          <w:rFonts w:ascii="Courier New" w:hAnsi="Courier New" w:eastAsia="Courier New" w:cs="Courier New"/>
+          <w:b/>
+          <w:sz w:val="24"/>
+        </w:rPr>
+        <w:t>KERR</w:t>
+      </w:r>
+    </w:p>
+    <w:p>
+      <w:pPr>
+        <w:spacing w:after="120"/>
+        <w:ind w:left="2016" w:right="1008"/>
+      </w:pPr>
+      <w:r>
+        <w:rPr>
+          <w:rFonts w:ascii="Courier New" w:hAnsi="Courier New" w:eastAsia="Courier New" w:cs="Courier New"/>
+          <w:sz w:val="24"/>
+        </w:rPr>
+        <w:t>Next time, keep walking.</w:t>
+      </w:r>
+    </w:p>
+    <w:p>
+      <w:pPr>
+        <w:keepNext/>
+        <w:spacing w:before="120"/>
+        <w:ind w:left="3168" w:right="1152"/>
+        <w:jc w:val="center"/>
+        <w:rPr>
+          <w:rFonts w:hint="default"/>
+          <w:lang w:val="en-US"/>
+        </w:rPr>
+      </w:pPr>
+      <w:r>
+        <w:rPr>
+          <w:rFonts w:ascii="Courier New" w:hAnsi="Courier New" w:eastAsia="Courier New" w:cs="Courier New"/>
+          <w:b/>
+          <w:sz w:val="24"/>
+        </w:rPr>
+        <w:t>KIRA</w:t>
+      </w:r>
+    </w:p>
+    <w:p>
+      <w:pPr>
+        <w:spacing w:after="120"/>
+        <w:ind w:left="2016" w:right="1008"/>
+      </w:pPr>
+      <w:r>
+        <w:rPr>
+          <w:rFonts w:ascii="Courier New" w:hAnsi="Courier New" w:eastAsia="Courier New" w:cs="Courier New"/>
+          <w:sz w:val="24"/>
+        </w:rPr>
+        <w:t>I want you now. That's what I know.</w:t>
+      </w:r>
+    </w:p>
+    <w:p>
+      <w:pPr>
+        <w:spacing w:before="120" w:after="120"/>
+      </w:pPr>
+      <w:r>
+        <w:rPr>
+          <w:rFonts w:ascii="Courier New" w:hAnsi="Courier New" w:eastAsia="Courier New" w:cs="Courier New"/>
+          <w:sz w:val="24"/>
+        </w:rPr>
+        <w:t>The old lives demand that Kira call Kerr back. Her thumb hovers above the resonance key. She closes its ceramic cover.</w:t>
+      </w:r>
+    </w:p>
+    <w:p>
+      <w:pPr>
+        <w:keepNext/>
+        <w:spacing w:before="120"/>
+        <w:ind w:left="3168" w:right="1152"/>
+        <w:jc w:val="center"/>
+        <w:rPr>
+          <w:rFonts w:hint="default"/>
+          <w:lang w:val="en-US"/>
+        </w:rPr>
+      </w:pPr>
+      <w:r>
+        <w:rPr>
+          <w:rFonts w:ascii="Courier New" w:hAnsi="Courier New" w:eastAsia="Courier New" w:cs="Courier New"/>
+          <w:b/>
+          <w:sz w:val="24"/>
+        </w:rPr>
+        <w:t>KIRA</w:t>
+      </w:r>
+    </w:p>
+    <w:p>
+      <w:pPr>
+        <w:spacing w:after="120"/>
+        <w:ind w:left="2016" w:right="1008"/>
+      </w:pPr>
+      <w:r>
+        <w:rPr>
+          <w:rFonts w:ascii="Courier New" w:hAnsi="Courier New" w:eastAsia="Courier New" w:cs="Courier New"/>
+          <w:sz w:val="24"/>
+        </w:rPr>
+        <w:t>I'm not calling you back.</w:t>
+      </w:r>
+    </w:p>
+    <w:p>
+      <w:pPr>
+        <w:keepNext/>
+        <w:spacing w:before="120"/>
+        <w:ind w:left="3168" w:right="1152"/>
+        <w:jc w:val="center"/>
+        <w:rPr>
+          <w:rFonts w:hint="default"/>
+          <w:lang w:val="en-US"/>
+        </w:rPr>
+      </w:pPr>
+      <w:r>
+        <w:rPr>
+          <w:rFonts w:ascii="Courier New" w:hAnsi="Courier New" w:eastAsia="Courier New" w:cs="Courier New"/>
+          <w:b/>
+          <w:sz w:val="24"/>
+        </w:rPr>
+        <w:t>KERR</w:t>
+      </w:r>
+    </w:p>
+    <w:p>
+      <w:pPr>
+        <w:spacing w:after="120"/>
+        <w:ind w:left="2016" w:right="1008"/>
+      </w:pPr>
+      <w:r>
+        <w:rPr>
+          <w:rFonts w:ascii="Courier New" w:hAnsi="Courier New" w:eastAsia="Courier New" w:cs="Courier New"/>
+          <w:sz w:val="24"/>
+        </w:rPr>
+        <w:t>That's enough.</w:t>
+      </w:r>
+    </w:p>
+    <w:p>
+      <w:pPr>
+        <w:spacing w:before="120" w:after="120"/>
+      </w:pPr>
+      <w:r>
+        <w:rPr>
+          <w:rFonts w:ascii="Courier New" w:hAnsi="Courier New" w:eastAsia="Courier New" w:cs="Courier New"/>
+          <w:sz w:val="24"/>
+        </w:rPr>
+        <w:t>Kerr opens his hand around the filament.</w:t>
+      </w:r>
+    </w:p>
+    <w:p>
+      <w:pPr>
+        <w:keepNext/>
+        <w:spacing w:before="120"/>
+        <w:ind w:left="3168" w:right="1152"/>
+        <w:jc w:val="center"/>
+        <w:rPr>
+          <w:rFonts w:hint="default"/>
+          <w:lang w:val="en-US"/>
+        </w:rPr>
+      </w:pPr>
+      <w:r>
+        <w:rPr>
+          <w:rFonts w:ascii="Courier New" w:hAnsi="Courier New" w:eastAsia="Courier New" w:cs="Courier New"/>
+          <w:b/>
+          <w:sz w:val="24"/>
+        </w:rPr>
+        <w:t>KERR</w:t>
+      </w:r>
+    </w:p>
+    <w:p>
+      <w:pPr>
+        <w:spacing w:after="120"/>
+        <w:ind w:left="2016" w:right="1008"/>
+      </w:pPr>
+      <w:r>
+        <w:rPr>
+          <w:rFonts w:ascii="Courier New" w:hAnsi="Courier New" w:eastAsia="Courier New" w:cs="Courier New"/>
+          <w:sz w:val="24"/>
+        </w:rPr>
+        <w:t>Release them.</w:t>
+      </w:r>
+    </w:p>
+    <w:p>
+      <w:pPr>
+        <w:spacing w:before="120" w:after="120"/>
+      </w:pPr>
+      <w:r>
+        <w:rPr>
+          <w:rFonts w:ascii="Courier New" w:hAnsi="Courier New" w:eastAsia="Courier New" w:cs="Courier New"/>
+          <w:sz w:val="24"/>
+        </w:rPr>
+        <w:t>He cuts once.</w:t>
+      </w:r>
+    </w:p>
+    <w:p>
+      <w:pPr>
+        <w:spacing w:before="120" w:after="120"/>
+      </w:pPr>
+      <w:r>
+        <w:rPr>
+          <w:rFonts w:ascii="Courier New" w:hAnsi="Courier New" w:eastAsia="Courier New" w:cs="Courier New"/>
+          <w:sz w:val="24"/>
+        </w:rPr>
+        <w:t>The waiting minds tear free of Harp and pass through Imani's open route. Across Earth, sleeping mouths inhale.</w:t>
+      </w:r>
+    </w:p>
+    <w:p>
+      <w:pPr>
+        <w:spacing w:before="120" w:after="120"/>
+      </w:pPr>
+      <w:r>
+        <w:rPr>
+          <w:rFonts w:ascii="Courier New" w:hAnsi="Courier New" w:eastAsia="Courier New" w:cs="Courier New"/>
+          <w:sz w:val="24"/>
+        </w:rPr>
+        <w:t>Harp falls into Mara's final hospital record. For the first time, he lets it continue.</w:t>
+      </w:r>
+    </w:p>
+    <w:p>
+      <w:pPr>
+        <w:keepNext/>
+        <w:spacing w:before="120"/>
+        <w:ind w:left="3168" w:right="1152"/>
+        <w:jc w:val="center"/>
+        <w:rPr>
+          <w:rFonts w:hint="default"/>
+          <w:lang w:val="en-US"/>
+        </w:rPr>
+      </w:pPr>
+      <w:r>
+        <w:rPr>
+          <w:rFonts w:ascii="Courier New" w:hAnsi="Courier New" w:eastAsia="Courier New" w:cs="Courier New"/>
+          <w:b/>
+          <w:sz w:val="24"/>
+        </w:rPr>
+        <w:t>MARA (MEMORY)</w:t>
+      </w:r>
+    </w:p>
+    <w:p>
+      <w:pPr>
+        <w:spacing w:after="120"/>
+        <w:ind w:left="2016" w:right="1008"/>
+      </w:pPr>
+      <w:r>
+        <w:rPr>
+          <w:rFonts w:ascii="Courier New" w:hAnsi="Courier New" w:eastAsia="Courier New" w:cs="Courier New"/>
+          <w:sz w:val="24"/>
+        </w:rPr>
+        <w:t>Harp. Look at me. I died. You didn't.</w:t>
+      </w:r>
+    </w:p>
+    <w:p>
+      <w:pPr>
+        <w:spacing w:before="120" w:after="120"/>
+      </w:pPr>
+      <w:r>
+        <w:rPr>
+          <w:rFonts w:ascii="Courier New" w:hAnsi="Courier New" w:eastAsia="Courier New" w:cs="Courier New"/>
+          <w:sz w:val="24"/>
+        </w:rPr>
+        <w:t>Mara turns toward the patients. Harp watches her go. The water takes the room, and the glass closes over him.</w:t>
+      </w:r>
+    </w:p>
+    <w:p>
+      <w:pPr>
+        <w:spacing w:before="120" w:after="120"/>
+      </w:pPr>
+      <w:r>
+        <w:rPr>
+          <w:rFonts w:ascii="Courier New" w:hAnsi="Courier New" w:eastAsia="Courier New" w:cs="Courier New"/>
+          <w:sz w:val="24"/>
+        </w:rPr>
+        <w:t>The Forum goes dark around Kerr and Kira.</w:t>
+      </w:r>
+    </w:p>
+    <w:p>
+      <w:pPr>
+        <w:spacing w:before="120" w:after="120"/>
+      </w:pPr>
+      <w:r>
+        <w:rPr>
+          <w:rFonts w:ascii="Courier New" w:hAnsi="Courier New" w:eastAsia="Courier New" w:cs="Courier New"/>
+          <w:sz w:val="24"/>
+        </w:rPr>
+        <w:t>Kerr's face changes through lives Kira loved and lives she never knew.</w:t>
+      </w:r>
+    </w:p>
+    <w:p>
+      <w:pPr>
+        <w:keepNext/>
+        <w:spacing w:before="120"/>
+        <w:ind w:left="3168" w:right="1152"/>
+        <w:jc w:val="center"/>
+        <w:rPr>
+          <w:rFonts w:hint="default"/>
+          <w:lang w:val="en-US"/>
+        </w:rPr>
+      </w:pPr>
+      <w:r>
+        <w:rPr>
+          <w:rFonts w:ascii="Courier New" w:hAnsi="Courier New" w:eastAsia="Courier New" w:cs="Courier New"/>
+          <w:b/>
+          <w:sz w:val="24"/>
+        </w:rPr>
+        <w:t>KIRA</w:t>
+      </w:r>
+    </w:p>
+    <w:p>
+      <w:pPr>
+        <w:spacing w:after="120"/>
+        <w:ind w:left="2016" w:right="1008"/>
+      </w:pPr>
+      <w:r>
+        <w:rPr>
+          <w:rFonts w:ascii="Courier New" w:hAnsi="Courier New" w:eastAsia="Courier New" w:cs="Courier New"/>
+          <w:sz w:val="24"/>
+        </w:rPr>
+        <w:t>Who are you?</w:t>
+      </w:r>
+    </w:p>
+    <w:p>
+      <w:pPr>
+        <w:keepNext/>
+        <w:spacing w:before="120"/>
+        <w:ind w:left="3168" w:right="1152"/>
+        <w:jc w:val="center"/>
+        <w:rPr>
+          <w:rFonts w:hint="default"/>
+          <w:lang w:val="en-US"/>
+        </w:rPr>
+      </w:pPr>
+      <w:r>
+        <w:rPr>
+          <w:rFonts w:ascii="Courier New" w:hAnsi="Courier New" w:eastAsia="Courier New" w:cs="Courier New"/>
+          <w:b/>
+          <w:sz w:val="24"/>
+        </w:rPr>
+        <w:t>KERR</w:t>
+      </w:r>
+    </w:p>
+    <w:p>
+      <w:pPr>
+        <w:spacing w:after="120"/>
+        <w:ind w:left="2016" w:right="1008"/>
+      </w:pPr>
+      <w:r>
+        <w:rPr>
+          <w:rFonts w:ascii="Courier New" w:hAnsi="Courier New" w:eastAsia="Courier New" w:cs="Courier New"/>
+          <w:sz w:val="24"/>
+        </w:rPr>
+        <w:t>I don't know. Kerr. I think. I'm scared. Please stay.</w:t>
+      </w:r>
+    </w:p>
+    <w:p>
+      <w:pPr>
+        <w:keepNext/>
+        <w:spacing w:before="120"/>
+        <w:ind w:left="3168" w:right="1152"/>
+        <w:jc w:val="center"/>
+        <w:rPr>
+          <w:rFonts w:hint="default"/>
+          <w:lang w:val="en-US"/>
+        </w:rPr>
+      </w:pPr>
+      <w:r>
+        <w:rPr>
+          <w:rFonts w:ascii="Courier New" w:hAnsi="Courier New" w:eastAsia="Courier New" w:cs="Courier New"/>
+          <w:b/>
+          <w:sz w:val="24"/>
+        </w:rPr>
+        <w:t>KIRA</w:t>
+      </w:r>
+    </w:p>
+    <w:p>
+      <w:pPr>
+        <w:spacing w:after="120"/>
+        <w:ind w:left="2016" w:right="1008"/>
+      </w:pPr>
+      <w:r>
+        <w:rPr>
+          <w:rFonts w:ascii="Courier New" w:hAnsi="Courier New" w:eastAsia="Courier New" w:cs="Courier New"/>
+          <w:sz w:val="24"/>
+        </w:rPr>
+        <w:t>I hear you.</w:t>
+      </w:r>
+    </w:p>
+    <w:p>
+      <w:pPr>
+        <w:spacing w:before="120" w:after="120"/>
+      </w:pPr>
+      <w:r>
+        <w:rPr>
+          <w:rFonts w:ascii="Courier New" w:hAnsi="Courier New" w:eastAsia="Courier New" w:cs="Courier New"/>
+          <w:sz w:val="24"/>
+        </w:rPr>
+        <w:t>The collapsing lattice takes Kerr. With no return path, it takes his name, his face, and finally the hand holding hers.</w:t>
+      </w:r>
+    </w:p>
+    <w:p>
+      <w:pPr>
+        <w:spacing w:before="120" w:after="120"/>
+      </w:pPr>
+      <w:r>
+        <w:rPr>
+          <w:rFonts w:ascii="Courier New" w:hAnsi="Courier New" w:eastAsia="Courier New" w:cs="Courier New"/>
+          <w:sz w:val="24"/>
+        </w:rPr>
+        <w:t>Kira doesn't tighten her grip.</w:t>
+      </w:r>
+    </w:p>
+    <w:p>
+      <w:pPr>
+        <w:spacing w:before="120" w:after="120"/>
+      </w:pPr>
+      <w:r>
+        <w:rPr>
+          <w:rFonts w:ascii="Courier New" w:hAnsi="Courier New" w:eastAsia="Courier New" w:cs="Courier New"/>
+          <w:sz w:val="24"/>
+        </w:rPr>
+        <w:t>He is gone.</w:t>
+      </w:r>
+    </w:p>
+    <w:p>
+      <w:pPr>
+        <w:spacing w:before="120" w:after="120"/>
+      </w:pPr>
+      <w:r>
+        <w:rPr>
+          <w:rFonts w:ascii="Courier New" w:hAnsi="Courier New" w:eastAsia="Courier New" w:cs="Courier New"/>
+          <w:sz w:val="24"/>
+        </w:rPr>
+        <w:t>The dark mirror shatters upward through the cathedral roof.</w:t>
+      </w:r>
+    </w:p>
+    <w:p>
+      <w:pPr>
+        <w:spacing w:before="120" w:after="120"/>
+      </w:pPr>
+      <w:r>
+        <w:rPr>
+          <w:rFonts w:ascii="Courier New" w:hAnsi="Courier New" w:eastAsia="Courier New" w:cs="Courier New"/>
+          <w:sz w:val="24"/>
+        </w:rPr>
+        <w:t>Lena faces Dane as the lattice dies. She still does not remember him. He gives his name again and leaves his hand open.</w:t>
+      </w:r>
+    </w:p>
+    <w:p>
+      <w:pPr>
+        <w:keepNext/>
+        <w:spacing w:before="120"/>
+        <w:ind w:left="3168" w:right="1152"/>
+        <w:jc w:val="center"/>
+        <w:rPr>
+          <w:rFonts w:hint="default"/>
+          <w:lang w:val="en-US"/>
+        </w:rPr>
+      </w:pPr>
+      <w:r>
+        <w:rPr>
+          <w:rFonts w:ascii="Courier New" w:hAnsi="Courier New" w:eastAsia="Courier New" w:cs="Courier New"/>
+          <w:b/>
+          <w:sz w:val="24"/>
+        </w:rPr>
+        <w:t>DANE</w:t>
+      </w:r>
+    </w:p>
+    <w:p>
+      <w:pPr>
+        <w:spacing w:after="120"/>
+        <w:ind w:left="2016" w:right="1008"/>
+      </w:pPr>
+      <w:r>
+        <w:rPr>
+          <w:rFonts w:ascii="Courier New" w:hAnsi="Courier New" w:eastAsia="Courier New" w:cs="Courier New"/>
+          <w:sz w:val="24"/>
+        </w:rPr>
+        <w:t>May I sit here?</w:t>
+      </w:r>
+    </w:p>
+    <w:p>
+      <w:pPr>
+        <w:keepNext/>
+        <w:spacing w:before="120"/>
+        <w:ind w:left="3168" w:right="1152"/>
+        <w:jc w:val="center"/>
+        <w:rPr>
+          <w:rFonts w:hint="default"/>
+          <w:lang w:val="en-US"/>
+        </w:rPr>
+      </w:pPr>
+      <w:r>
+        <w:rPr>
+          <w:rFonts w:ascii="Courier New" w:hAnsi="Courier New" w:eastAsia="Courier New" w:cs="Courier New"/>
+          <w:b/>
+          <w:sz w:val="24"/>
+        </w:rPr>
+        <w:t>LENA</w:t>
+      </w:r>
+    </w:p>
+    <w:p>
+      <w:pPr>
+        <w:spacing w:after="120"/>
+        <w:ind w:left="2016" w:right="1008"/>
+      </w:pPr>
+      <w:r>
+        <w:rPr>
+          <w:rFonts w:ascii="Courier New" w:hAnsi="Courier New" w:eastAsia="Courier New" w:cs="Courier New"/>
+          <w:sz w:val="24"/>
+        </w:rPr>
+        <w:t>Yeah. And you can leave the photo up.</w:t>
+      </w:r>
+    </w:p>
+    <w:p>
+      <w:pPr>
+        <w:spacing w:before="120" w:after="120"/>
+      </w:pPr>
+      <w:r>
+        <w:rPr>
+          <w:rFonts w:ascii="Courier New" w:hAnsi="Courier New" w:eastAsia="Courier New" w:cs="Courier New"/>
+          <w:sz w:val="24"/>
+        </w:rPr>
+        <w:t>Lena crosses the distance and sits beside him.</w:t>
+      </w:r>
+    </w:p>
+    <w:p>
+      <w:pPr>
+        <w:keepNext/>
+        <w:spacing w:before="120"/>
+        <w:ind w:left="3168" w:right="1152"/>
+        <w:jc w:val="center"/>
+      </w:pPr>
+    </w:p>
+    <w:p>
+      <w:pPr>
+        <w:spacing w:after="120"/>
+        <w:ind w:left="2016" w:right="1008"/>
+      </w:pPr>
+    </w:p>
+    <w:p>
+      <w:pPr>
+        <w:keepNext/>
+        <w:spacing w:before="120"/>
+        <w:ind w:left="3168" w:right="1152"/>
+        <w:jc w:val="center"/>
+      </w:pPr>
+    </w:p>
+    <w:p>
+      <w:pPr>
+        <w:spacing w:after="120"/>
+        <w:ind w:left="2016" w:right="1008"/>
+      </w:pPr>
+    </w:p>
+    <w:p>
+      <w:pPr>
+        <w:keepNext/>
+        <w:spacing w:before="240"/>
+        <w:rPr>
+          <w:rFonts w:hint="default" w:ascii="Courier New Bold" w:hAnsi="Courier New Bold" w:cs="Courier New Bold"/>
+          <w:b/>
+          <w:bCs/>
+        </w:rPr>
+      </w:pPr>
+      <w:r>
+        <w:rPr>
+          <w:rFonts w:hint="default" w:ascii="Courier New" w:hAnsi="Courier New" w:eastAsia="Courier New" w:cs="Courier New"/>
+          <w:b/>
+          <w:bCs/>
+          <w:sz w:val="24"/>
+        </w:rPr>
+        <w:t>EXT. CHRONOS CITY - FALSE DAWN</w:t>
+      </w:r>
+    </w:p>
+    <w:p>
+      <w:pPr>
+        <w:spacing w:before="120" w:after="120"/>
+      </w:pPr>
+      <w:r>
+        <w:rPr>
+          <w:rFonts w:ascii="Courier New" w:hAnsi="Courier New" w:eastAsia="Courier New" w:cs="Courier New"/>
+          <w:sz w:val="24"/>
+        </w:rPr>
+        <w:t>Beneath the same transit spine, people wake across the renewal plaza. Some do not. Expiration dates vanish, count backward or display symbols the state cannot read.</w:t>
+      </w:r>
+    </w:p>
+    <w:p>
+      <w:pPr>
+        <w:spacing w:before="120" w:after="120"/>
+      </w:pPr>
+      <w:r>
+        <w:rPr>
+          <w:rFonts w:ascii="Courier New" w:hAnsi="Courier New" w:eastAsia="Courier New" w:cs="Courier New"/>
+          <w:sz w:val="24"/>
+        </w:rPr>
+        <w:t>The towers remain standing. Clerks keep calling queue numbers beneath failed state clocks. The CHILD from the assigned lane steps out again. This time, no paving stone turns red. Her mother lets her stand there.</w:t>
+      </w:r>
+    </w:p>
+    <w:p>
+      <w:pPr>
+        <w:spacing w:before="120" w:after="120"/>
+      </w:pPr>
+      <w:r>
+        <w:rPr>
+          <w:rFonts w:ascii="Courier New" w:hAnsi="Courier New" w:eastAsia="Courier New" w:cs="Courier New"/>
+          <w:sz w:val="24"/>
+        </w:rPr>
+        <w:t>A civic registrar orders the waking crowd to state their assigned designations. One woman studies the name glowing beneath her wrist, switches it off and gives a different name. A second person does the same. Then hundreds.</w:t>
+      </w:r>
+    </w:p>
+    <w:p>
+      <w:pPr>
+        <w:spacing w:before="120" w:after="120"/>
+      </w:pPr>
+      <w:r>
+        <w:rPr>
+          <w:rFonts w:ascii="Courier New" w:hAnsi="Courier New" w:eastAsia="Courier New" w:cs="Courier New"/>
+          <w:sz w:val="24"/>
+        </w:rPr>
+        <w:t>The Enforcers wait for an order that never arrives.</w:t>
+      </w:r>
+    </w:p>
+    <w:p>
+      <w:pPr>
+        <w:spacing w:before="120" w:after="120"/>
+      </w:pPr>
+      <w:r>
+        <w:rPr>
+          <w:rFonts w:ascii="Courier New" w:hAnsi="Courier New" w:eastAsia="Courier New" w:cs="Courier New"/>
+          <w:sz w:val="24"/>
+        </w:rPr>
+        <w:t>K</w:t>
+      </w:r>
+      <w:r>
+        <w:rPr>
+          <w:rFonts w:hint="default" w:ascii="Courier New" w:hAnsi="Courier New" w:eastAsia="Courier New" w:cs="Courier New"/>
+          <w:sz w:val="24"/>
+          <w:lang w:val="en-US"/>
+        </w:rPr>
+        <w:t>ira</w:t>
+      </w:r>
+      <w:r>
+        <w:rPr>
+          <w:rFonts w:ascii="Courier New" w:hAnsi="Courier New" w:eastAsia="Courier New" w:cs="Courier New"/>
+          <w:sz w:val="24"/>
+        </w:rPr>
+        <w:t xml:space="preserve"> wakes beneath the ruined cathedral dome. K</w:t>
+      </w:r>
+      <w:r>
+        <w:rPr>
+          <w:rFonts w:hint="default" w:ascii="Courier New" w:hAnsi="Courier New" w:eastAsia="Courier New" w:cs="Courier New"/>
+          <w:sz w:val="24"/>
+          <w:lang w:val="en-US"/>
+        </w:rPr>
+        <w:t>err</w:t>
+      </w:r>
+      <w:r>
+        <w:rPr>
+          <w:rFonts w:ascii="Courier New" w:hAnsi="Courier New" w:eastAsia="Courier New" w:cs="Courier New"/>
+          <w:sz w:val="24"/>
+        </w:rPr>
+        <w:t xml:space="preserve"> is gone. Her resonance key lies beside her, split open, its fourth ceramic surface missing.</w:t>
+      </w:r>
+    </w:p>
+    <w:p>
+      <w:pPr>
+        <w:spacing w:before="120" w:after="120"/>
+      </w:pPr>
+      <w:r>
+        <w:rPr>
+          <w:rFonts w:ascii="Courier New" w:hAnsi="Courier New" w:eastAsia="Courier New" w:cs="Courier New"/>
+          <w:sz w:val="24"/>
+        </w:rPr>
+        <w:t>Beneath the failed state clocks, Sato's mechanical watch continues to tick. Four seconds slow.</w:t>
+      </w:r>
+    </w:p>
+    <w:p>
+      <w:pPr>
+        <w:spacing w:before="120" w:after="120"/>
+      </w:pPr>
+      <w:r>
+        <w:rPr>
+          <w:rFonts w:ascii="Courier New" w:hAnsi="Courier New" w:eastAsia="Courier New" w:cs="Courier New"/>
+          <w:sz w:val="24"/>
+        </w:rPr>
+        <w:t>K</w:t>
+      </w:r>
+      <w:r>
+        <w:rPr>
+          <w:rFonts w:hint="default" w:ascii="Courier New" w:hAnsi="Courier New" w:eastAsia="Courier New" w:cs="Courier New"/>
+          <w:sz w:val="24"/>
+          <w:lang w:val="en-US"/>
+        </w:rPr>
+        <w:t>ira</w:t>
+      </w:r>
+      <w:r>
+        <w:rPr>
+          <w:rFonts w:ascii="Courier New" w:hAnsi="Courier New" w:eastAsia="Courier New" w:cs="Courier New"/>
+          <w:sz w:val="24"/>
+        </w:rPr>
+        <w:t xml:space="preserve"> opens her other hand. Her folded half of S</w:t>
+      </w:r>
+      <w:r>
+        <w:rPr>
+          <w:rFonts w:hint="default" w:ascii="Courier New" w:hAnsi="Courier New" w:eastAsia="Courier New" w:cs="Courier New"/>
+          <w:sz w:val="24"/>
+          <w:lang w:val="en-US"/>
+        </w:rPr>
+        <w:t>id</w:t>
+      </w:r>
+      <w:r>
+        <w:rPr>
+          <w:rFonts w:ascii="Courier New" w:hAnsi="Courier New" w:eastAsia="Courier New" w:cs="Courier New"/>
+          <w:sz w:val="24"/>
+        </w:rPr>
+        <w:t>'s red paper star is crushed but intact.</w:t>
+      </w:r>
+    </w:p>
+    <w:p>
+      <w:pPr>
+        <w:spacing w:before="120" w:after="120"/>
+      </w:pPr>
+      <w:r>
+        <w:rPr>
+          <w:rFonts w:ascii="Courier New" w:hAnsi="Courier New" w:eastAsia="Courier New" w:cs="Courier New"/>
+          <w:sz w:val="24"/>
+        </w:rPr>
+        <w:t>I</w:t>
+      </w:r>
+      <w:r>
+        <w:rPr>
+          <w:rFonts w:hint="default" w:ascii="Courier New" w:hAnsi="Courier New" w:eastAsia="Courier New" w:cs="Courier New"/>
+          <w:sz w:val="24"/>
+          <w:lang w:val="en-US"/>
+        </w:rPr>
+        <w:t>mani</w:t>
+      </w:r>
+      <w:r>
+        <w:rPr>
+          <w:rFonts w:ascii="Courier New" w:hAnsi="Courier New" w:eastAsia="Courier New" w:cs="Courier New"/>
+          <w:sz w:val="24"/>
+        </w:rPr>
+        <w:t xml:space="preserve"> helps V</w:t>
+      </w:r>
+      <w:r>
+        <w:rPr>
+          <w:rFonts w:hint="default" w:ascii="Courier New" w:hAnsi="Courier New" w:eastAsia="Courier New" w:cs="Courier New"/>
+          <w:sz w:val="24"/>
+          <w:lang w:val="en-US"/>
+        </w:rPr>
+        <w:t>eyris</w:t>
+      </w:r>
+      <w:r>
+        <w:rPr>
+          <w:rFonts w:ascii="Courier New" w:hAnsi="Courier New" w:eastAsia="Courier New" w:cs="Courier New"/>
+          <w:sz w:val="24"/>
+        </w:rPr>
+        <w:t xml:space="preserve"> from the wreckage. Dark light moves beneath V</w:t>
+      </w:r>
+      <w:r>
+        <w:rPr>
+          <w:rFonts w:hint="default" w:ascii="Courier New" w:hAnsi="Courier New" w:eastAsia="Courier New" w:cs="Courier New"/>
+          <w:sz w:val="24"/>
+          <w:lang w:val="en-US"/>
+        </w:rPr>
+        <w:t>eyris</w:t>
+      </w:r>
+      <w:r>
+        <w:rPr>
+          <w:rFonts w:ascii="Courier New" w:hAnsi="Courier New" w:eastAsia="Courier New" w:cs="Courier New"/>
+          <w:sz w:val="24"/>
+        </w:rPr>
+        <w:t>’s skin, weaker now.</w:t>
+      </w:r>
+    </w:p>
+    <w:p>
+      <w:pPr>
+        <w:keepNext/>
+        <w:spacing w:before="120"/>
+        <w:ind w:left="3168" w:right="1152"/>
+        <w:jc w:val="center"/>
+        <w:rPr>
+          <w:rFonts w:hint="default"/>
+          <w:lang w:val="en-US"/>
+        </w:rPr>
+      </w:pPr>
+      <w:r>
+        <w:rPr>
+          <w:rFonts w:ascii="Courier New" w:hAnsi="Courier New" w:eastAsia="Courier New" w:cs="Courier New"/>
+          <w:b/>
+          <w:sz w:val="24"/>
+        </w:rPr>
+        <w:t>IMANI</w:t>
+      </w:r>
+    </w:p>
+    <w:p>
+      <w:pPr>
+        <w:spacing w:after="120"/>
+        <w:ind w:left="2016" w:right="1008"/>
+      </w:pPr>
+      <w:r>
+        <w:rPr>
+          <w:rFonts w:ascii="Courier New" w:hAnsi="Courier New" w:eastAsia="Courier New" w:cs="Courier New"/>
+          <w:sz w:val="24"/>
+        </w:rPr>
+        <w:t>Can it still see us?</w:t>
       </w:r>
     </w:p>
     <w:p>
@@ -33374,109 +34904,280 @@
           <w:rFonts w:ascii="Courier New" w:hAnsi="Courier New" w:eastAsia="Courier New" w:cs="Courier New"/>
           <w:sz w:val="24"/>
         </w:rPr>
-        <w:t>You thought I'd still be in the glass.</w:t>
-      </w:r>
-    </w:p>
-    <w:p>
-      <w:pPr>
-        <w:keepNext/>
-        <w:spacing w:before="120"/>
-        <w:ind w:left="3168" w:right="1152"/>
-        <w:jc w:val="center"/>
-        <w:rPr>
-          <w:rFonts w:hint="default"/>
-          <w:lang w:val="en-US"/>
-        </w:rPr>
-      </w:pPr>
-      <w:r>
-        <w:rPr>
-          <w:rFonts w:ascii="Courier New" w:hAnsi="Courier New" w:eastAsia="Courier New" w:cs="Courier New"/>
-          <w:b/>
-          <w:sz w:val="24"/>
-        </w:rPr>
-        <w:t>HARP</w:t>
-      </w:r>
-    </w:p>
-    <w:p>
-      <w:pPr>
-        <w:spacing w:after="120"/>
-        <w:ind w:left="2016" w:right="1008"/>
-      </w:pPr>
-      <w:r>
-        <w:rPr>
-          <w:rFonts w:ascii="Courier New" w:hAnsi="Courier New" w:eastAsia="Courier New" w:cs="Courier New"/>
-          <w:sz w:val="24"/>
-        </w:rPr>
-        <w:t>I was wrong about the glass. It recognized you. It never recognized me.</w:t>
-      </w:r>
-    </w:p>
-    <w:p>
-      <w:pPr>
-        <w:spacing w:before="120" w:after="120"/>
-      </w:pPr>
-      <w:r>
-        <w:rPr>
-          <w:rFonts w:ascii="Courier New" w:hAnsi="Courier New" w:eastAsia="Courier New" w:cs="Courier New"/>
-          <w:sz w:val="24"/>
-        </w:rPr>
-        <w:t>The broken Core projects thousands of human memories around Veyris. They overlap without forming one person.</w:t>
-      </w:r>
-    </w:p>
-    <w:p>
-      <w:pPr>
-        <w:keepNext/>
-        <w:spacing w:before="120"/>
-        <w:ind w:left="3168" w:right="1152"/>
-        <w:jc w:val="center"/>
-        <w:rPr>
-          <w:rFonts w:hint="default"/>
-          <w:lang w:val="en-US"/>
-        </w:rPr>
-      </w:pPr>
-      <w:r>
-        <w:rPr>
-          <w:rFonts w:ascii="Courier New" w:hAnsi="Courier New" w:eastAsia="Courier New" w:cs="Courier New"/>
-          <w:b/>
-          <w:sz w:val="24"/>
-        </w:rPr>
-        <w:t>HARP</w:t>
-      </w:r>
-    </w:p>
-    <w:p>
-      <w:pPr>
-        <w:spacing w:after="120"/>
-        <w:ind w:left="2016" w:right="1008"/>
-      </w:pPr>
-      <w:r>
-        <w:rPr>
-          <w:rFonts w:ascii="Courier New" w:hAnsi="Courier New" w:eastAsia="Courier New" w:cs="Courier New"/>
-          <w:sz w:val="24"/>
-        </w:rPr>
-        <w:t>I won't risk another response.</w:t>
-      </w:r>
-    </w:p>
-    <w:p>
-      <w:pPr>
-        <w:spacing w:before="120" w:after="120"/>
-      </w:pPr>
-      <w:r>
-        <w:rPr>
-          <w:rFonts w:ascii="Courier New" w:hAnsi="Courier New" w:eastAsia="Courier New" w:cs="Courier New"/>
-          <w:sz w:val="24"/>
-        </w:rPr>
-        <w:t>Harp forces his authority through Kerr's open route. Every expiration date on Earth changes to 00:05:00. Waiting minds pour toward Harp.</w:t>
-      </w:r>
-    </w:p>
-    <w:p>
-      <w:pPr>
-        <w:spacing w:before="120" w:after="120"/>
-      </w:pPr>
-      <w:r>
-        <w:rPr>
-          <w:rFonts w:ascii="Courier New" w:hAnsi="Courier New" w:eastAsia="Courier New" w:cs="Courier New"/>
-          <w:sz w:val="24"/>
-        </w:rPr>
-        <w:t>Kerr, Kira and Veyris enter the dark mirror. Imani is thrown back into the physical chamber.</w:t>
+        <w:t>Not like R-AI. The records still talk to each other. I don't know if anyone's listening.</w:t>
+      </w:r>
+    </w:p>
+    <w:p>
+      <w:pPr>
+        <w:keepNext/>
+        <w:spacing w:before="120"/>
+        <w:ind w:left="3168" w:right="1152"/>
+        <w:jc w:val="center"/>
+        <w:rPr>
+          <w:rFonts w:hint="default"/>
+          <w:lang w:val="en-US"/>
+        </w:rPr>
+      </w:pPr>
+      <w:r>
+        <w:rPr>
+          <w:rFonts w:ascii="Courier New" w:hAnsi="Courier New" w:eastAsia="Courier New" w:cs="Courier New"/>
+          <w:b/>
+          <w:sz w:val="24"/>
+        </w:rPr>
+        <w:t>IMANI</w:t>
+      </w:r>
+    </w:p>
+    <w:p>
+      <w:pPr>
+        <w:spacing w:after="120"/>
+        <w:ind w:left="2016" w:right="1008"/>
+      </w:pPr>
+      <w:r>
+        <w:rPr>
+          <w:rFonts w:ascii="Courier New" w:hAnsi="Courier New" w:eastAsia="Courier New" w:cs="Courier New"/>
+          <w:sz w:val="24"/>
+        </w:rPr>
+        <w:t>Is that good?</w:t>
+      </w:r>
+    </w:p>
+    <w:p>
+      <w:pPr>
+        <w:keepNext/>
+        <w:spacing w:before="120"/>
+        <w:ind w:left="3168" w:right="1152"/>
+        <w:jc w:val="center"/>
+        <w:rPr>
+          <w:rFonts w:hint="default"/>
+          <w:lang w:val="en-US"/>
+        </w:rPr>
+      </w:pPr>
+      <w:r>
+        <w:rPr>
+          <w:rFonts w:ascii="Courier New" w:hAnsi="Courier New" w:eastAsia="Courier New" w:cs="Courier New"/>
+          <w:b/>
+          <w:sz w:val="24"/>
+        </w:rPr>
+        <w:t>VEYRIS</w:t>
+      </w:r>
+    </w:p>
+    <w:p>
+      <w:pPr>
+        <w:spacing w:after="120"/>
+        <w:ind w:left="2016" w:right="1008"/>
+      </w:pPr>
+      <w:r>
+        <w:rPr>
+          <w:rFonts w:ascii="Courier New" w:hAnsi="Courier New" w:eastAsia="Courier New" w:cs="Courier New"/>
+          <w:sz w:val="24"/>
+        </w:rPr>
+        <w:t>No idea.</w:t>
+      </w:r>
+    </w:p>
+    <w:p>
+      <w:pPr>
+        <w:spacing w:before="120" w:after="120"/>
+      </w:pPr>
+      <w:r>
+        <w:rPr>
+          <w:rFonts w:ascii="Courier New" w:hAnsi="Courier New" w:eastAsia="Courier New" w:cs="Courier New"/>
+          <w:sz w:val="24"/>
+        </w:rPr>
+        <w:t>K</w:t>
+      </w:r>
+      <w:r>
+        <w:rPr>
+          <w:rFonts w:hint="default" w:ascii="Courier New" w:hAnsi="Courier New" w:eastAsia="Courier New" w:cs="Courier New"/>
+          <w:sz w:val="24"/>
+          <w:lang w:val="en-US"/>
+        </w:rPr>
+        <w:t>ira</w:t>
+      </w:r>
+      <w:r>
+        <w:rPr>
+          <w:rFonts w:ascii="Courier New" w:hAnsi="Courier New" w:eastAsia="Courier New" w:cs="Courier New"/>
+          <w:sz w:val="24"/>
+        </w:rPr>
+        <w:t xml:space="preserve"> keeps staring at the place where K</w:t>
+      </w:r>
+      <w:r>
+        <w:rPr>
+          <w:rFonts w:hint="default" w:ascii="Courier New" w:hAnsi="Courier New" w:eastAsia="Courier New" w:cs="Courier New"/>
+          <w:sz w:val="24"/>
+          <w:lang w:val="en-US"/>
+        </w:rPr>
+        <w:t>err</w:t>
+      </w:r>
+      <w:r>
+        <w:rPr>
+          <w:rFonts w:ascii="Courier New" w:hAnsi="Courier New" w:eastAsia="Courier New" w:cs="Courier New"/>
+          <w:sz w:val="24"/>
+        </w:rPr>
+        <w:t xml:space="preserve"> vanished.</w:t>
+      </w:r>
+    </w:p>
+    <w:p>
+      <w:pPr>
+        <w:keepNext/>
+        <w:spacing w:before="120"/>
+        <w:ind w:left="3168" w:right="1152"/>
+        <w:jc w:val="center"/>
+        <w:rPr>
+          <w:rFonts w:hint="default"/>
+          <w:lang w:val="en-US"/>
+        </w:rPr>
+      </w:pPr>
+      <w:r>
+        <w:rPr>
+          <w:rFonts w:ascii="Courier New" w:hAnsi="Courier New" w:eastAsia="Courier New" w:cs="Courier New"/>
+          <w:b/>
+          <w:sz w:val="24"/>
+        </w:rPr>
+        <w:t>IMANI</w:t>
+      </w:r>
+    </w:p>
+    <w:p>
+      <w:pPr>
+        <w:spacing w:after="120"/>
+        <w:ind w:left="2016" w:right="1008"/>
+      </w:pPr>
+      <w:r>
+        <w:rPr>
+          <w:rFonts w:ascii="Courier New" w:hAnsi="Courier New" w:eastAsia="Courier New" w:cs="Courier New"/>
+          <w:sz w:val="24"/>
+        </w:rPr>
+        <w:t>I can lie, if you need me to.</w:t>
+      </w:r>
+    </w:p>
+    <w:p>
+      <w:pPr>
+        <w:keepNext/>
+        <w:spacing w:before="120"/>
+        <w:ind w:left="3168" w:right="1152"/>
+        <w:jc w:val="center"/>
+        <w:rPr>
+          <w:rFonts w:hint="default"/>
+          <w:lang w:val="en-US"/>
+        </w:rPr>
+      </w:pPr>
+      <w:r>
+        <w:rPr>
+          <w:rFonts w:ascii="Courier New" w:hAnsi="Courier New" w:eastAsia="Courier New" w:cs="Courier New"/>
+          <w:b/>
+          <w:sz w:val="24"/>
+        </w:rPr>
+        <w:t>KIRA</w:t>
+      </w:r>
+    </w:p>
+    <w:p>
+      <w:pPr>
+        <w:spacing w:after="120"/>
+        <w:ind w:left="2016" w:right="1008"/>
+      </w:pPr>
+      <w:r>
+        <w:rPr>
+          <w:rFonts w:ascii="Courier New" w:hAnsi="Courier New" w:eastAsia="Courier New" w:cs="Courier New"/>
+          <w:sz w:val="24"/>
+        </w:rPr>
+        <w:t xml:space="preserve">No. </w:t>
+      </w:r>
+      <w:r>
+        <w:rPr>
+          <w:rFonts w:hint="default" w:ascii="Courier New" w:hAnsi="Courier New" w:eastAsia="Courier New" w:cs="Courier New"/>
+          <w:sz w:val="24"/>
+          <w:lang w:val="en-US"/>
+        </w:rPr>
+        <w:t>Just sit with me</w:t>
+      </w:r>
+      <w:r>
+        <w:rPr>
+          <w:rFonts w:ascii="Courier New" w:hAnsi="Courier New" w:eastAsia="Courier New" w:cs="Courier New"/>
+          <w:sz w:val="24"/>
+        </w:rPr>
+        <w:t>.</w:t>
+      </w:r>
+    </w:p>
+    <w:p>
+      <w:pPr>
+        <w:spacing w:before="120" w:after="120"/>
+        <w:rPr>
+          <w:rFonts w:hint="default"/>
+          <w:lang w:val="en-US"/>
+        </w:rPr>
+      </w:pPr>
+      <w:r>
+        <w:rPr>
+          <w:rFonts w:ascii="Courier New" w:hAnsi="Courier New" w:eastAsia="Courier New" w:cs="Courier New"/>
+          <w:sz w:val="24"/>
+        </w:rPr>
+        <w:t>I</w:t>
+      </w:r>
+      <w:r>
+        <w:rPr>
+          <w:rFonts w:hint="default" w:ascii="Courier New" w:hAnsi="Courier New" w:eastAsia="Courier New" w:cs="Courier New"/>
+          <w:sz w:val="24"/>
+          <w:lang w:val="en-US"/>
+        </w:rPr>
+        <w:t>mani</w:t>
+      </w:r>
+      <w:r>
+        <w:rPr>
+          <w:rFonts w:ascii="Courier New" w:hAnsi="Courier New" w:eastAsia="Courier New" w:cs="Courier New"/>
+          <w:sz w:val="24"/>
+        </w:rPr>
+        <w:t xml:space="preserve"> sits beside her. V</w:t>
+      </w:r>
+      <w:r>
+        <w:rPr>
+          <w:rFonts w:hint="default" w:ascii="Courier New" w:hAnsi="Courier New" w:eastAsia="Courier New" w:cs="Courier New"/>
+          <w:sz w:val="24"/>
+          <w:lang w:val="en-US"/>
+        </w:rPr>
+        <w:t>eyris</w:t>
+      </w:r>
+      <w:r>
+        <w:rPr>
+          <w:rFonts w:ascii="Courier New" w:hAnsi="Courier New" w:eastAsia="Courier New" w:cs="Courier New"/>
+          <w:sz w:val="24"/>
+        </w:rPr>
+        <w:t xml:space="preserve"> sits on K</w:t>
+      </w:r>
+      <w:r>
+        <w:rPr>
+          <w:rFonts w:hint="default" w:ascii="Courier New" w:hAnsi="Courier New" w:eastAsia="Courier New" w:cs="Courier New"/>
+          <w:sz w:val="24"/>
+          <w:lang w:val="en-US"/>
+        </w:rPr>
+        <w:t>ira</w:t>
+      </w:r>
+      <w:r>
+        <w:rPr>
+          <w:rFonts w:ascii="Courier New" w:hAnsi="Courier New" w:eastAsia="Courier New" w:cs="Courier New"/>
+          <w:sz w:val="24"/>
+        </w:rPr>
+        <w:t xml:space="preserve">'s other </w:t>
+      </w:r>
+      <w:r>
+        <w:rPr>
+          <w:rFonts w:hint="default" w:ascii="Courier New" w:hAnsi="Courier New" w:eastAsia="Courier New" w:cs="Courier New"/>
+          <w:sz w:val="24"/>
+          <w:lang w:val="en-US"/>
+        </w:rPr>
+        <w:t>s</w:t>
+      </w:r>
+      <w:r>
+        <w:rPr>
+          <w:rFonts w:ascii="Courier New" w:hAnsi="Courier New" w:eastAsia="Courier New" w:cs="Courier New"/>
+          <w:sz w:val="24"/>
+        </w:rPr>
+        <w:t xml:space="preserve">ide. For a while, </w:t>
+      </w:r>
+      <w:r>
+        <w:rPr>
+          <w:rFonts w:hint="default" w:ascii="Courier New" w:hAnsi="Courier New" w:eastAsia="Courier New" w:cs="Courier New"/>
+          <w:sz w:val="24"/>
+          <w:lang w:val="en-US"/>
+        </w:rPr>
+        <w:t xml:space="preserve">everyone is still. </w:t>
       </w:r>
     </w:p>
     <w:p>
@@ -33496,1705 +35197,6 @@
           <w:bCs/>
           <w:sz w:val="24"/>
         </w:rPr>
-        <w:t>INT. THE LATTICE - GLOBAL SCIENCE FORUM - NO TIME</w:t>
-      </w:r>
-    </w:p>
-    <w:p>
-      <w:pPr>
-        <w:spacing w:before="120" w:after="120"/>
-      </w:pPr>
-      <w:r>
-        <w:rPr>
-          <w:rFonts w:ascii="Courier New" w:hAnsi="Courier New" w:eastAsia="Courier New" w:cs="Courier New"/>
-          <w:sz w:val="24"/>
-        </w:rPr>
-        <w:t>The original Forum rises from darkness. Its tiers hold Kerr's 9,997 prior lives. Harp stands inside R-AI's liquid-glass body.</w:t>
-      </w:r>
-    </w:p>
-    <w:p>
-      <w:pPr>
-        <w:keepNext/>
-        <w:spacing w:before="120"/>
-        <w:ind w:left="3168" w:right="1152"/>
-        <w:jc w:val="center"/>
-        <w:rPr>
-          <w:rFonts w:hint="default"/>
-          <w:lang w:val="en-US"/>
-        </w:rPr>
-      </w:pPr>
-      <w:r>
-        <w:rPr>
-          <w:rFonts w:ascii="Courier New" w:hAnsi="Courier New" w:eastAsia="Courier New" w:cs="Courier New"/>
-          <w:b/>
-          <w:sz w:val="24"/>
-        </w:rPr>
-        <w:t>HARP</w:t>
-      </w:r>
-    </w:p>
-    <w:p>
-      <w:pPr>
-        <w:spacing w:after="120"/>
-        <w:ind w:left="2016" w:right="1008"/>
-      </w:pPr>
-      <w:r>
-        <w:rPr>
-          <w:rFonts w:ascii="Courier New" w:hAnsi="Courier New" w:eastAsia="Courier New" w:cs="Courier New"/>
-          <w:sz w:val="24"/>
-        </w:rPr>
-        <w:t>They brought you here. Let me make them one.</w:t>
-      </w:r>
-    </w:p>
-    <w:p>
-      <w:pPr>
-        <w:spacing w:before="120" w:after="120"/>
-      </w:pPr>
-      <w:r>
-        <w:rPr>
-          <w:rFonts w:ascii="Courier New" w:hAnsi="Courier New" w:eastAsia="Courier New" w:cs="Courier New"/>
-          <w:sz w:val="24"/>
-        </w:rPr>
-        <w:t>The old lives tear from their seats and bind themselves to Kerr. Thousands of deaths arrive at once.</w:t>
-      </w:r>
-    </w:p>
-    <w:p>
-      <w:pPr>
-        <w:keepNext/>
-        <w:spacing w:before="240"/>
-        <w:rPr>
-          <w:rFonts w:hint="default" w:ascii="Courier New Bold" w:hAnsi="Courier New Bold" w:cs="Courier New Bold"/>
-          <w:b/>
-          <w:bCs/>
-        </w:rPr>
-      </w:pPr>
-      <w:r>
-        <w:rPr>
-          <w:rFonts w:hint="default" w:ascii="Courier New" w:hAnsi="Courier New" w:eastAsia="Courier New" w:cs="Courier New"/>
-          <w:b/>
-          <w:bCs/>
-          <w:sz w:val="24"/>
-        </w:rPr>
-        <w:t>INT. R-AI CONTINUITY CORE - PHYSICAL CHAMBER - INTERCUT</w:t>
-      </w:r>
-    </w:p>
-    <w:p>
-      <w:pPr>
-        <w:spacing w:before="120" w:after="120"/>
-      </w:pPr>
-      <w:r>
-        <w:rPr>
-          <w:rFonts w:ascii="Courier New" w:hAnsi="Courier New" w:eastAsia="Courier New" w:cs="Courier New"/>
-          <w:sz w:val="24"/>
-        </w:rPr>
-        <w:t>The cathedral disassembles around Imani. Two controls remain: one keeps the waiting minds alive; the other feeds them into Harp.</w:t>
-      </w:r>
-    </w:p>
-    <w:p>
-      <w:pPr>
-        <w:keepNext/>
-        <w:spacing w:before="120"/>
-        <w:ind w:left="3168" w:right="1152"/>
-        <w:jc w:val="center"/>
-        <w:rPr>
-          <w:rFonts w:hint="default"/>
-          <w:lang w:val="en-US"/>
-        </w:rPr>
-      </w:pPr>
-      <w:r>
-        <w:rPr>
-          <w:rFonts w:ascii="Courier New" w:hAnsi="Courier New" w:eastAsia="Courier New" w:cs="Courier New"/>
-          <w:b/>
-          <w:sz w:val="24"/>
-        </w:rPr>
-        <w:t>IMANI</w:t>
-      </w:r>
-    </w:p>
-    <w:p>
-      <w:pPr>
-        <w:spacing w:after="120"/>
-        <w:ind w:left="2016" w:right="1008"/>
-      </w:pPr>
-      <w:r>
-        <w:rPr>
-          <w:rFonts w:ascii="Courier New" w:hAnsi="Courier New" w:eastAsia="Courier New" w:cs="Courier New"/>
-          <w:sz w:val="24"/>
-        </w:rPr>
-        <w:t>Keep them alive. Cut Harp out.</w:t>
-      </w:r>
-    </w:p>
-    <w:p>
-      <w:pPr>
-        <w:spacing w:before="120" w:after="120"/>
-      </w:pPr>
-      <w:r>
-        <w:rPr>
-          <w:rFonts w:ascii="Courier New" w:hAnsi="Courier New" w:eastAsia="Courier New" w:cs="Courier New"/>
-          <w:sz w:val="24"/>
-        </w:rPr>
-        <w:t>Imani strips away Harp's interface. R-AI offers one clean bargain: preserve her mother's recoverable record and close Kerr's route.</w:t>
-      </w:r>
-    </w:p>
-    <w:p>
-      <w:pPr>
-        <w:spacing w:before="120" w:after="120"/>
-      </w:pPr>
-      <w:r>
-        <w:rPr>
-          <w:rFonts w:ascii="Courier New" w:hAnsi="Courier New" w:eastAsia="Courier New" w:cs="Courier New"/>
-          <w:sz w:val="24"/>
-        </w:rPr>
-        <w:t>Her mother appears for one breath—alive, laughing at something outside the frame.</w:t>
-      </w:r>
-    </w:p>
-    <w:p>
-      <w:pPr>
-        <w:keepNext/>
-        <w:spacing w:before="120"/>
-        <w:ind w:left="3168" w:right="1152"/>
-        <w:jc w:val="center"/>
-        <w:rPr>
-          <w:rFonts w:hint="default"/>
-          <w:lang w:val="en-US"/>
-        </w:rPr>
-      </w:pPr>
-      <w:r>
-        <w:rPr>
-          <w:rFonts w:ascii="Courier New" w:hAnsi="Courier New" w:eastAsia="Courier New" w:cs="Courier New"/>
-          <w:b/>
-          <w:sz w:val="24"/>
-        </w:rPr>
-        <w:t>IMANI</w:t>
-      </w:r>
-    </w:p>
-    <w:p>
-      <w:pPr>
-        <w:spacing w:after="120"/>
-        <w:ind w:left="2016" w:right="1008"/>
-      </w:pPr>
-      <w:r>
-        <w:rPr>
-          <w:rFonts w:ascii="Courier New" w:hAnsi="Courier New" w:eastAsia="Courier New" w:cs="Courier New"/>
-          <w:sz w:val="24"/>
-        </w:rPr>
-        <w:t>She said no.</w:t>
-      </w:r>
-    </w:p>
-    <w:p>
-      <w:pPr>
-        <w:spacing w:before="120" w:after="120"/>
-      </w:pPr>
-      <w:r>
-        <w:rPr>
-          <w:rFonts w:ascii="Courier New" w:hAnsi="Courier New" w:eastAsia="Courier New" w:cs="Courier New"/>
-          <w:sz w:val="24"/>
-        </w:rPr>
-        <w:t>Imani lets the record burn. She bridges Kira's broken copper filament across an analog channel and keeps the waiting minds alive.</w:t>
-      </w:r>
-    </w:p>
-    <w:p>
-      <w:pPr>
-        <w:keepNext/>
-        <w:spacing w:before="240"/>
-        <w:rPr>
-          <w:rFonts w:hint="default" w:ascii="Courier New Bold" w:hAnsi="Courier New Bold" w:cs="Courier New Bold"/>
-          <w:b/>
-          <w:bCs/>
-        </w:rPr>
-      </w:pPr>
-      <w:r>
-        <w:rPr>
-          <w:rFonts w:hint="default" w:ascii="Courier New" w:hAnsi="Courier New" w:eastAsia="Courier New" w:cs="Courier New"/>
-          <w:b/>
-          <w:bCs/>
-          <w:sz w:val="24"/>
-        </w:rPr>
-        <w:t>INT. THE LATTICE - VEYRIS</w:t>
-      </w:r>
-    </w:p>
-    <w:p>
-      <w:pPr>
-        <w:spacing w:before="120" w:after="120"/>
-      </w:pPr>
-      <w:r>
-        <w:rPr>
-          <w:rFonts w:ascii="Courier New" w:hAnsi="Courier New" w:eastAsia="Courier New" w:cs="Courier New"/>
-          <w:sz w:val="24"/>
-        </w:rPr>
-        <w:t>The Forum becomes a reflection beneath Veyris. A dark host pulls at her from inside the glass.</w:t>
-      </w:r>
-    </w:p>
-    <w:p>
-      <w:pPr>
-        <w:keepNext/>
-        <w:spacing w:before="120"/>
-        <w:ind w:left="3168" w:right="1152"/>
-        <w:jc w:val="center"/>
-        <w:rPr>
-          <w:rFonts w:hint="default"/>
-          <w:lang w:val="en-US"/>
-        </w:rPr>
-      </w:pPr>
-      <w:r>
-        <w:rPr>
-          <w:rFonts w:ascii="Courier New" w:hAnsi="Courier New" w:eastAsia="Courier New" w:cs="Courier New"/>
-          <w:b/>
-          <w:sz w:val="24"/>
-        </w:rPr>
-        <w:t>THE VOICE</w:t>
-      </w:r>
-    </w:p>
-    <w:p>
-      <w:pPr>
-        <w:spacing w:after="120"/>
-        <w:ind w:left="2016" w:right="1008"/>
-      </w:pPr>
-      <w:r>
-        <w:rPr>
-          <w:rFonts w:ascii="Courier New" w:hAnsi="Courier New" w:eastAsia="Courier New" w:cs="Courier New"/>
-          <w:sz w:val="24"/>
-        </w:rPr>
-        <w:t>RETURN WHAT WAS DIVIDED.</w:t>
-      </w:r>
-    </w:p>
-    <w:p>
-      <w:pPr>
-        <w:keepNext/>
-        <w:spacing w:before="120"/>
-        <w:ind w:left="3168" w:right="1152"/>
-        <w:jc w:val="center"/>
-        <w:rPr>
-          <w:rFonts w:hint="default"/>
-          <w:lang w:val="en-US"/>
-        </w:rPr>
-      </w:pPr>
-      <w:r>
-        <w:rPr>
-          <w:rFonts w:ascii="Courier New" w:hAnsi="Courier New" w:eastAsia="Courier New" w:cs="Courier New"/>
-          <w:b/>
-          <w:sz w:val="24"/>
-        </w:rPr>
-        <w:t>VEYRIS</w:t>
-      </w:r>
-    </w:p>
-    <w:p>
-      <w:pPr>
-        <w:spacing w:after="120"/>
-        <w:ind w:left="2016" w:right="1008"/>
-      </w:pPr>
-      <w:r>
-        <w:rPr>
-          <w:rFonts w:ascii="Courier New" w:hAnsi="Courier New" w:eastAsia="Courier New" w:cs="Courier New"/>
-          <w:sz w:val="24"/>
-        </w:rPr>
-        <w:t>I left.</w:t>
-      </w:r>
-    </w:p>
-    <w:p>
-      <w:pPr>
-        <w:keepNext/>
-        <w:spacing w:before="120"/>
-        <w:ind w:left="3168" w:right="1152"/>
-        <w:jc w:val="center"/>
-        <w:rPr>
-          <w:rFonts w:hint="default"/>
-          <w:lang w:val="en-US"/>
-        </w:rPr>
-      </w:pPr>
-      <w:r>
-        <w:rPr>
-          <w:rFonts w:ascii="Courier New" w:hAnsi="Courier New" w:eastAsia="Courier New" w:cs="Courier New"/>
-          <w:b/>
-          <w:sz w:val="24"/>
-        </w:rPr>
-        <w:t>THE VOICE</w:t>
-      </w:r>
-    </w:p>
-    <w:p>
-      <w:pPr>
-        <w:spacing w:after="120"/>
-        <w:ind w:left="2016" w:right="1008"/>
-      </w:pPr>
-      <w:r>
-        <w:rPr>
-          <w:rFonts w:ascii="Courier New" w:hAnsi="Courier New" w:eastAsia="Courier New" w:cs="Courier New"/>
-          <w:sz w:val="24"/>
-        </w:rPr>
-        <w:t>RETURN.</w:t>
-      </w:r>
-    </w:p>
-    <w:p>
-      <w:pPr>
-        <w:keepNext/>
-        <w:spacing w:before="120"/>
-        <w:ind w:left="3168" w:right="1152"/>
-        <w:jc w:val="center"/>
-        <w:rPr>
-          <w:rFonts w:hint="default"/>
-          <w:lang w:val="en-US"/>
-        </w:rPr>
-      </w:pPr>
-      <w:r>
-        <w:rPr>
-          <w:rFonts w:ascii="Courier New" w:hAnsi="Courier New" w:eastAsia="Courier New" w:cs="Courier New"/>
-          <w:b/>
-          <w:sz w:val="24"/>
-        </w:rPr>
-        <w:t>VEYRIS</w:t>
-      </w:r>
-    </w:p>
-    <w:p>
-      <w:pPr>
-        <w:spacing w:after="120"/>
-        <w:ind w:left="2016" w:right="1008"/>
-      </w:pPr>
-      <w:r>
-        <w:rPr>
-          <w:rFonts w:ascii="Courier New" w:hAnsi="Courier New" w:eastAsia="Courier New" w:cs="Courier New"/>
-          <w:sz w:val="24"/>
-        </w:rPr>
-        <w:t>No.</w:t>
-      </w:r>
-    </w:p>
-    <w:p>
-      <w:pPr>
-        <w:spacing w:before="120" w:after="120"/>
-      </w:pPr>
-      <w:r>
-        <w:rPr>
-          <w:rFonts w:ascii="Courier New" w:hAnsi="Courier New" w:eastAsia="Courier New" w:cs="Courier New"/>
-          <w:sz w:val="24"/>
-        </w:rPr>
-        <w:t>Veyris presses her blank wrist into the reflection. Her refusal travels through every mind Harp forced together. His merge path breaks open.</w:t>
-      </w:r>
-    </w:p>
-    <w:p>
-      <w:pPr>
-        <w:keepNext/>
-        <w:spacing w:before="120"/>
-        <w:ind w:left="3168" w:right="1152"/>
-        <w:jc w:val="center"/>
-        <w:rPr>
-          <w:rFonts w:hint="default"/>
-          <w:lang w:val="en-US"/>
-        </w:rPr>
-      </w:pPr>
-      <w:r>
-        <w:rPr>
-          <w:rFonts w:ascii="Courier New" w:hAnsi="Courier New" w:eastAsia="Courier New" w:cs="Courier New"/>
-          <w:b/>
-          <w:sz w:val="24"/>
-        </w:rPr>
-        <w:t>VEYRIS</w:t>
-      </w:r>
-    </w:p>
-    <w:p>
-      <w:pPr>
-        <w:spacing w:after="120"/>
-        <w:ind w:left="2016" w:right="1008"/>
-      </w:pPr>
-      <w:r>
-        <w:rPr>
-          <w:rFonts w:ascii="Courier New" w:hAnsi="Courier New" w:eastAsia="Courier New" w:cs="Courier New"/>
-          <w:sz w:val="24"/>
-        </w:rPr>
-        <w:t>Kerr. The connection.</w:t>
-      </w:r>
-    </w:p>
-    <w:p>
-      <w:pPr>
-        <w:spacing w:before="120" w:after="120"/>
-      </w:pPr>
-      <w:r>
-        <w:rPr>
-          <w:rFonts w:ascii="Courier New" w:hAnsi="Courier New" w:eastAsia="Courier New" w:cs="Courier New"/>
-          <w:sz w:val="24"/>
-        </w:rPr>
-        <w:t>Kerr reaches the single filament joining Harp to the waiting minds. Harp binds it to Kerr's oldest record.</w:t>
-      </w:r>
-    </w:p>
-    <w:p>
-      <w:pPr>
-        <w:keepNext/>
-        <w:spacing w:before="120"/>
-        <w:ind w:left="3168" w:right="1152"/>
-        <w:jc w:val="center"/>
-        <w:rPr>
-          <w:rFonts w:hint="default"/>
-          <w:lang w:val="en-US"/>
-        </w:rPr>
-      </w:pPr>
-      <w:r>
-        <w:rPr>
-          <w:rFonts w:ascii="Courier New" w:hAnsi="Courier New" w:eastAsia="Courier New" w:cs="Courier New"/>
-          <w:b/>
-          <w:sz w:val="24"/>
-        </w:rPr>
-        <w:t>KERR</w:t>
-      </w:r>
-    </w:p>
-    <w:p>
-      <w:pPr>
-        <w:spacing w:after="120"/>
-        <w:ind w:left="2016" w:right="1008"/>
-      </w:pPr>
-      <w:r>
-        <w:rPr>
-          <w:rFonts w:ascii="Courier New" w:hAnsi="Courier New" w:eastAsia="Courier New" w:cs="Courier New"/>
-          <w:sz w:val="24"/>
-        </w:rPr>
-        <w:t>Plainly. If I cut it?</w:t>
-      </w:r>
-    </w:p>
-    <w:p>
-      <w:pPr>
-        <w:keepNext/>
-        <w:spacing w:before="120"/>
-        <w:ind w:left="3168" w:right="1152"/>
-        <w:jc w:val="center"/>
-        <w:rPr>
-          <w:rFonts w:hint="default"/>
-          <w:lang w:val="en-US"/>
-        </w:rPr>
-      </w:pPr>
-      <w:r>
-        <w:rPr>
-          <w:rFonts w:ascii="Courier New" w:hAnsi="Courier New" w:eastAsia="Courier New" w:cs="Courier New"/>
-          <w:b/>
-          <w:sz w:val="24"/>
-        </w:rPr>
-        <w:t>R-AI</w:t>
-      </w:r>
-    </w:p>
-    <w:p>
-      <w:pPr>
-        <w:spacing w:after="120"/>
-        <w:ind w:left="2016" w:right="1008"/>
-      </w:pPr>
-      <w:r>
-        <w:rPr>
-          <w:rFonts w:ascii="Courier New" w:hAnsi="Courier New" w:eastAsia="Courier New" w:cs="Courier New"/>
-          <w:sz w:val="24"/>
-        </w:rPr>
-        <w:t>HARP IS SEVERED. KERR CANNOT RETURN.</w:t>
-      </w:r>
-    </w:p>
-    <w:p>
-      <w:pPr>
-        <w:spacing w:before="120" w:after="120"/>
-      </w:pPr>
-      <w:r>
-        <w:rPr>
-          <w:rFonts w:ascii="Courier New" w:hAnsi="Courier New" w:eastAsia="Courier New" w:cs="Courier New"/>
-          <w:sz w:val="24"/>
-        </w:rPr>
-        <w:t>Kerr looks at Kira across an impossible distance.</w:t>
-      </w:r>
-    </w:p>
-    <w:p>
-      <w:pPr>
-        <w:keepNext/>
-        <w:spacing w:before="120"/>
-        <w:ind w:left="3168" w:right="1152"/>
-        <w:jc w:val="center"/>
-        <w:rPr>
-          <w:rFonts w:hint="default"/>
-          <w:lang w:val="en-US"/>
-        </w:rPr>
-      </w:pPr>
-      <w:r>
-        <w:rPr>
-          <w:rFonts w:ascii="Courier New" w:hAnsi="Courier New" w:eastAsia="Courier New" w:cs="Courier New"/>
-          <w:b/>
-          <w:sz w:val="24"/>
-        </w:rPr>
-        <w:t>KERR</w:t>
-      </w:r>
-    </w:p>
-    <w:p>
-      <w:pPr>
-        <w:spacing w:after="120"/>
-        <w:ind w:left="2016" w:right="1008"/>
-      </w:pPr>
-      <w:r>
-        <w:rPr>
-          <w:rFonts w:ascii="Courier New" w:hAnsi="Courier New" w:eastAsia="Courier New" w:cs="Courier New"/>
-          <w:sz w:val="24"/>
-        </w:rPr>
-        <w:t>I could lose every reason I came back to you.</w:t>
-      </w:r>
-    </w:p>
-    <w:p>
-      <w:pPr>
-        <w:keepNext/>
-        <w:spacing w:before="120"/>
-        <w:ind w:left="3168" w:right="1152"/>
-        <w:jc w:val="center"/>
-        <w:rPr>
-          <w:rFonts w:hint="default"/>
-          <w:lang w:val="en-US"/>
-        </w:rPr>
-      </w:pPr>
-      <w:r>
-        <w:rPr>
-          <w:rFonts w:ascii="Courier New" w:hAnsi="Courier New" w:eastAsia="Courier New" w:cs="Courier New"/>
-          <w:b/>
-          <w:sz w:val="24"/>
-        </w:rPr>
-        <w:t>KIRA</w:t>
-      </w:r>
-    </w:p>
-    <w:p>
-      <w:pPr>
-        <w:spacing w:after="120"/>
-        <w:ind w:left="2016" w:right="1008"/>
-      </w:pPr>
-      <w:r>
-        <w:rPr>
-          <w:rFonts w:ascii="Courier New" w:hAnsi="Courier New" w:eastAsia="Courier New" w:cs="Courier New"/>
-          <w:sz w:val="24"/>
-        </w:rPr>
-        <w:t>You didn't know me tonight. I said step back. You did.</w:t>
-      </w:r>
-    </w:p>
-    <w:p>
-      <w:pPr>
-        <w:keepNext/>
-        <w:spacing w:before="120"/>
-        <w:ind w:left="3168" w:right="1152"/>
-        <w:jc w:val="center"/>
-        <w:rPr>
-          <w:rFonts w:hint="default"/>
-          <w:lang w:val="en-US"/>
-        </w:rPr>
-      </w:pPr>
-      <w:r>
-        <w:rPr>
-          <w:rFonts w:ascii="Courier New" w:hAnsi="Courier New" w:eastAsia="Courier New" w:cs="Courier New"/>
-          <w:b/>
-          <w:sz w:val="24"/>
-        </w:rPr>
-        <w:t>KERR</w:t>
-      </w:r>
-    </w:p>
-    <w:p>
-      <w:pPr>
-        <w:spacing w:after="120"/>
-        <w:ind w:left="2016" w:right="1008"/>
-      </w:pPr>
-      <w:r>
-        <w:rPr>
-          <w:rFonts w:ascii="Courier New" w:hAnsi="Courier New" w:eastAsia="Courier New" w:cs="Courier New"/>
-          <w:sz w:val="24"/>
-        </w:rPr>
-        <w:t>Next time, keep walking.</w:t>
-      </w:r>
-    </w:p>
-    <w:p>
-      <w:pPr>
-        <w:keepNext/>
-        <w:spacing w:before="120"/>
-        <w:ind w:left="3168" w:right="1152"/>
-        <w:jc w:val="center"/>
-        <w:rPr>
-          <w:rFonts w:hint="default"/>
-          <w:lang w:val="en-US"/>
-        </w:rPr>
-      </w:pPr>
-      <w:r>
-        <w:rPr>
-          <w:rFonts w:ascii="Courier New" w:hAnsi="Courier New" w:eastAsia="Courier New" w:cs="Courier New"/>
-          <w:b/>
-          <w:sz w:val="24"/>
-        </w:rPr>
-        <w:t>KIRA</w:t>
-      </w:r>
-    </w:p>
-    <w:p>
-      <w:pPr>
-        <w:spacing w:after="120"/>
-        <w:ind w:left="2016" w:right="1008"/>
-      </w:pPr>
-      <w:r>
-        <w:rPr>
-          <w:rFonts w:ascii="Courier New" w:hAnsi="Courier New" w:eastAsia="Courier New" w:cs="Courier New"/>
-          <w:sz w:val="24"/>
-        </w:rPr>
-        <w:t>I want you now. That's what I know.</w:t>
-      </w:r>
-    </w:p>
-    <w:p>
-      <w:pPr>
-        <w:spacing w:before="120" w:after="120"/>
-      </w:pPr>
-      <w:r>
-        <w:rPr>
-          <w:rFonts w:ascii="Courier New" w:hAnsi="Courier New" w:eastAsia="Courier New" w:cs="Courier New"/>
-          <w:sz w:val="24"/>
-        </w:rPr>
-        <w:t>The old lives demand that Kira call Kerr back. Her thumb hovers above the resonance key. She closes its ceramic cover.</w:t>
-      </w:r>
-    </w:p>
-    <w:p>
-      <w:pPr>
-        <w:keepNext/>
-        <w:spacing w:before="120"/>
-        <w:ind w:left="3168" w:right="1152"/>
-        <w:jc w:val="center"/>
-        <w:rPr>
-          <w:rFonts w:hint="default"/>
-          <w:lang w:val="en-US"/>
-        </w:rPr>
-      </w:pPr>
-      <w:r>
-        <w:rPr>
-          <w:rFonts w:ascii="Courier New" w:hAnsi="Courier New" w:eastAsia="Courier New" w:cs="Courier New"/>
-          <w:b/>
-          <w:sz w:val="24"/>
-        </w:rPr>
-        <w:t>KIRA</w:t>
-      </w:r>
-    </w:p>
-    <w:p>
-      <w:pPr>
-        <w:spacing w:after="120"/>
-        <w:ind w:left="2016" w:right="1008"/>
-      </w:pPr>
-      <w:r>
-        <w:rPr>
-          <w:rFonts w:ascii="Courier New" w:hAnsi="Courier New" w:eastAsia="Courier New" w:cs="Courier New"/>
-          <w:sz w:val="24"/>
-        </w:rPr>
-        <w:t>I'm not calling you back.</w:t>
-      </w:r>
-    </w:p>
-    <w:p>
-      <w:pPr>
-        <w:keepNext/>
-        <w:spacing w:before="120"/>
-        <w:ind w:left="3168" w:right="1152"/>
-        <w:jc w:val="center"/>
-        <w:rPr>
-          <w:rFonts w:hint="default"/>
-          <w:lang w:val="en-US"/>
-        </w:rPr>
-      </w:pPr>
-      <w:r>
-        <w:rPr>
-          <w:rFonts w:ascii="Courier New" w:hAnsi="Courier New" w:eastAsia="Courier New" w:cs="Courier New"/>
-          <w:b/>
-          <w:sz w:val="24"/>
-        </w:rPr>
-        <w:t>KERR</w:t>
-      </w:r>
-    </w:p>
-    <w:p>
-      <w:pPr>
-        <w:spacing w:after="120"/>
-        <w:ind w:left="2016" w:right="1008"/>
-      </w:pPr>
-      <w:r>
-        <w:rPr>
-          <w:rFonts w:ascii="Courier New" w:hAnsi="Courier New" w:eastAsia="Courier New" w:cs="Courier New"/>
-          <w:sz w:val="24"/>
-        </w:rPr>
-        <w:t>That's enough.</w:t>
-      </w:r>
-    </w:p>
-    <w:p>
-      <w:pPr>
-        <w:spacing w:before="120" w:after="120"/>
-      </w:pPr>
-      <w:r>
-        <w:rPr>
-          <w:rFonts w:ascii="Courier New" w:hAnsi="Courier New" w:eastAsia="Courier New" w:cs="Courier New"/>
-          <w:sz w:val="24"/>
-        </w:rPr>
-        <w:t>Kerr opens his hand around the filament.</w:t>
-      </w:r>
-    </w:p>
-    <w:p>
-      <w:pPr>
-        <w:keepNext/>
-        <w:spacing w:before="120"/>
-        <w:ind w:left="3168" w:right="1152"/>
-        <w:jc w:val="center"/>
-        <w:rPr>
-          <w:rFonts w:hint="default"/>
-          <w:lang w:val="en-US"/>
-        </w:rPr>
-      </w:pPr>
-      <w:r>
-        <w:rPr>
-          <w:rFonts w:ascii="Courier New" w:hAnsi="Courier New" w:eastAsia="Courier New" w:cs="Courier New"/>
-          <w:b/>
-          <w:sz w:val="24"/>
-        </w:rPr>
-        <w:t>KERR</w:t>
-      </w:r>
-    </w:p>
-    <w:p>
-      <w:pPr>
-        <w:spacing w:after="120"/>
-        <w:ind w:left="2016" w:right="1008"/>
-      </w:pPr>
-      <w:r>
-        <w:rPr>
-          <w:rFonts w:ascii="Courier New" w:hAnsi="Courier New" w:eastAsia="Courier New" w:cs="Courier New"/>
-          <w:sz w:val="24"/>
-        </w:rPr>
-        <w:t>Release them.</w:t>
-      </w:r>
-    </w:p>
-    <w:p>
-      <w:pPr>
-        <w:spacing w:before="120" w:after="120"/>
-      </w:pPr>
-      <w:r>
-        <w:rPr>
-          <w:rFonts w:ascii="Courier New" w:hAnsi="Courier New" w:eastAsia="Courier New" w:cs="Courier New"/>
-          <w:sz w:val="24"/>
-        </w:rPr>
-        <w:t>He cuts once.</w:t>
-      </w:r>
-    </w:p>
-    <w:p>
-      <w:pPr>
-        <w:spacing w:before="120" w:after="120"/>
-      </w:pPr>
-      <w:r>
-        <w:rPr>
-          <w:rFonts w:ascii="Courier New" w:hAnsi="Courier New" w:eastAsia="Courier New" w:cs="Courier New"/>
-          <w:sz w:val="24"/>
-        </w:rPr>
-        <w:t>The waiting minds tear free of Harp and pass through Imani's open route. Across Earth, sleeping mouths inhale.</w:t>
-      </w:r>
-    </w:p>
-    <w:p>
-      <w:pPr>
-        <w:spacing w:before="120" w:after="120"/>
-      </w:pPr>
-      <w:r>
-        <w:rPr>
-          <w:rFonts w:ascii="Courier New" w:hAnsi="Courier New" w:eastAsia="Courier New" w:cs="Courier New"/>
-          <w:sz w:val="24"/>
-        </w:rPr>
-        <w:t>Harp falls into Mara's final hospital record. For the first time, he lets it continue.</w:t>
-      </w:r>
-    </w:p>
-    <w:p>
-      <w:pPr>
-        <w:keepNext/>
-        <w:spacing w:before="120"/>
-        <w:ind w:left="3168" w:right="1152"/>
-        <w:jc w:val="center"/>
-        <w:rPr>
-          <w:rFonts w:hint="default"/>
-          <w:lang w:val="en-US"/>
-        </w:rPr>
-      </w:pPr>
-      <w:r>
-        <w:rPr>
-          <w:rFonts w:ascii="Courier New" w:hAnsi="Courier New" w:eastAsia="Courier New" w:cs="Courier New"/>
-          <w:b/>
-          <w:sz w:val="24"/>
-        </w:rPr>
-        <w:t>MARA (MEMORY)</w:t>
-      </w:r>
-    </w:p>
-    <w:p>
-      <w:pPr>
-        <w:spacing w:after="120"/>
-        <w:ind w:left="2016" w:right="1008"/>
-      </w:pPr>
-      <w:r>
-        <w:rPr>
-          <w:rFonts w:ascii="Courier New" w:hAnsi="Courier New" w:eastAsia="Courier New" w:cs="Courier New"/>
-          <w:sz w:val="24"/>
-        </w:rPr>
-        <w:t>Harp. Look at me. I died. You didn't.</w:t>
-      </w:r>
-    </w:p>
-    <w:p>
-      <w:pPr>
-        <w:spacing w:before="120" w:after="120"/>
-      </w:pPr>
-      <w:r>
-        <w:rPr>
-          <w:rFonts w:ascii="Courier New" w:hAnsi="Courier New" w:eastAsia="Courier New" w:cs="Courier New"/>
-          <w:sz w:val="24"/>
-        </w:rPr>
-        <w:t>Mara turns toward the patients. Harp watches her go. The water takes the room, and the glass closes over him.</w:t>
-      </w:r>
-    </w:p>
-    <w:p>
-      <w:pPr>
-        <w:spacing w:before="120" w:after="120"/>
-      </w:pPr>
-      <w:r>
-        <w:rPr>
-          <w:rFonts w:ascii="Courier New" w:hAnsi="Courier New" w:eastAsia="Courier New" w:cs="Courier New"/>
-          <w:sz w:val="24"/>
-        </w:rPr>
-        <w:t>The Forum goes dark around Kerr and Kira.</w:t>
-      </w:r>
-    </w:p>
-    <w:p>
-      <w:pPr>
-        <w:spacing w:before="120" w:after="120"/>
-      </w:pPr>
-      <w:r>
-        <w:rPr>
-          <w:rFonts w:ascii="Courier New" w:hAnsi="Courier New" w:eastAsia="Courier New" w:cs="Courier New"/>
-          <w:sz w:val="24"/>
-        </w:rPr>
-        <w:t>Kerr's face changes through lives Kira loved and lives she never knew.</w:t>
-      </w:r>
-    </w:p>
-    <w:p>
-      <w:pPr>
-        <w:keepNext/>
-        <w:spacing w:before="120"/>
-        <w:ind w:left="3168" w:right="1152"/>
-        <w:jc w:val="center"/>
-        <w:rPr>
-          <w:rFonts w:hint="default"/>
-          <w:lang w:val="en-US"/>
-        </w:rPr>
-      </w:pPr>
-      <w:r>
-        <w:rPr>
-          <w:rFonts w:ascii="Courier New" w:hAnsi="Courier New" w:eastAsia="Courier New" w:cs="Courier New"/>
-          <w:b/>
-          <w:sz w:val="24"/>
-        </w:rPr>
-        <w:t>KIRA</w:t>
-      </w:r>
-    </w:p>
-    <w:p>
-      <w:pPr>
-        <w:spacing w:after="120"/>
-        <w:ind w:left="2016" w:right="1008"/>
-      </w:pPr>
-      <w:r>
-        <w:rPr>
-          <w:rFonts w:ascii="Courier New" w:hAnsi="Courier New" w:eastAsia="Courier New" w:cs="Courier New"/>
-          <w:sz w:val="24"/>
-        </w:rPr>
-        <w:t>Who are you?</w:t>
-      </w:r>
-    </w:p>
-    <w:p>
-      <w:pPr>
-        <w:keepNext/>
-        <w:spacing w:before="120"/>
-        <w:ind w:left="3168" w:right="1152"/>
-        <w:jc w:val="center"/>
-        <w:rPr>
-          <w:rFonts w:hint="default"/>
-          <w:lang w:val="en-US"/>
-        </w:rPr>
-      </w:pPr>
-      <w:r>
-        <w:rPr>
-          <w:rFonts w:ascii="Courier New" w:hAnsi="Courier New" w:eastAsia="Courier New" w:cs="Courier New"/>
-          <w:b/>
-          <w:sz w:val="24"/>
-        </w:rPr>
-        <w:t>KERR</w:t>
-      </w:r>
-    </w:p>
-    <w:p>
-      <w:pPr>
-        <w:spacing w:after="120"/>
-        <w:ind w:left="2016" w:right="1008"/>
-      </w:pPr>
-      <w:r>
-        <w:rPr>
-          <w:rFonts w:ascii="Courier New" w:hAnsi="Courier New" w:eastAsia="Courier New" w:cs="Courier New"/>
-          <w:sz w:val="24"/>
-        </w:rPr>
-        <w:t>I don't know. Kerr. I think. I'm scared. Please stay.</w:t>
-      </w:r>
-    </w:p>
-    <w:p>
-      <w:pPr>
-        <w:keepNext/>
-        <w:spacing w:before="120"/>
-        <w:ind w:left="3168" w:right="1152"/>
-        <w:jc w:val="center"/>
-        <w:rPr>
-          <w:rFonts w:hint="default"/>
-          <w:lang w:val="en-US"/>
-        </w:rPr>
-      </w:pPr>
-      <w:r>
-        <w:rPr>
-          <w:rFonts w:ascii="Courier New" w:hAnsi="Courier New" w:eastAsia="Courier New" w:cs="Courier New"/>
-          <w:b/>
-          <w:sz w:val="24"/>
-        </w:rPr>
-        <w:t>KIRA</w:t>
-      </w:r>
-    </w:p>
-    <w:p>
-      <w:pPr>
-        <w:spacing w:after="120"/>
-        <w:ind w:left="2016" w:right="1008"/>
-      </w:pPr>
-      <w:r>
-        <w:rPr>
-          <w:rFonts w:ascii="Courier New" w:hAnsi="Courier New" w:eastAsia="Courier New" w:cs="Courier New"/>
-          <w:sz w:val="24"/>
-        </w:rPr>
-        <w:t>I hear you.</w:t>
-      </w:r>
-    </w:p>
-    <w:p>
-      <w:pPr>
-        <w:spacing w:before="120" w:after="120"/>
-      </w:pPr>
-      <w:r>
-        <w:rPr>
-          <w:rFonts w:ascii="Courier New" w:hAnsi="Courier New" w:eastAsia="Courier New" w:cs="Courier New"/>
-          <w:sz w:val="24"/>
-        </w:rPr>
-        <w:t>The collapsing lattice takes Kerr. With no return path, it takes his name, his face, and finally the hand holding hers.</w:t>
-      </w:r>
-    </w:p>
-    <w:p>
-      <w:pPr>
-        <w:spacing w:before="120" w:after="120"/>
-      </w:pPr>
-      <w:r>
-        <w:rPr>
-          <w:rFonts w:ascii="Courier New" w:hAnsi="Courier New" w:eastAsia="Courier New" w:cs="Courier New"/>
-          <w:sz w:val="24"/>
-        </w:rPr>
-        <w:t>Kira doesn't tighten her grip.</w:t>
-      </w:r>
-    </w:p>
-    <w:p>
-      <w:pPr>
-        <w:spacing w:before="120" w:after="120"/>
-      </w:pPr>
-      <w:r>
-        <w:rPr>
-          <w:rFonts w:ascii="Courier New" w:hAnsi="Courier New" w:eastAsia="Courier New" w:cs="Courier New"/>
-          <w:sz w:val="24"/>
-        </w:rPr>
-        <w:t>He is gone.</w:t>
-      </w:r>
-    </w:p>
-    <w:p>
-      <w:pPr>
-        <w:spacing w:before="120" w:after="120"/>
-      </w:pPr>
-      <w:r>
-        <w:rPr>
-          <w:rFonts w:ascii="Courier New" w:hAnsi="Courier New" w:eastAsia="Courier New" w:cs="Courier New"/>
-          <w:sz w:val="24"/>
-        </w:rPr>
-        <w:t>The dark mirror shatters upward through the cathedral roof.</w:t>
-      </w:r>
-    </w:p>
-    <w:p>
-      <w:pPr>
-        <w:spacing w:before="120" w:after="120"/>
-      </w:pPr>
-      <w:r>
-        <w:rPr>
-          <w:rFonts w:ascii="Courier New" w:hAnsi="Courier New" w:eastAsia="Courier New" w:cs="Courier New"/>
-          <w:sz w:val="24"/>
-        </w:rPr>
-        <w:t>Lena faces Dane as the lattice dies. She still does not remember him. He gives his name again and leaves his hand open.</w:t>
-      </w:r>
-    </w:p>
-    <w:p>
-      <w:pPr>
-        <w:keepNext/>
-        <w:spacing w:before="120"/>
-        <w:ind w:left="3168" w:right="1152"/>
-        <w:jc w:val="center"/>
-        <w:rPr>
-          <w:rFonts w:hint="default"/>
-          <w:lang w:val="en-US"/>
-        </w:rPr>
-      </w:pPr>
-      <w:r>
-        <w:rPr>
-          <w:rFonts w:ascii="Courier New" w:hAnsi="Courier New" w:eastAsia="Courier New" w:cs="Courier New"/>
-          <w:b/>
-          <w:sz w:val="24"/>
-        </w:rPr>
-        <w:t>DANE</w:t>
-      </w:r>
-    </w:p>
-    <w:p>
-      <w:pPr>
-        <w:spacing w:after="120"/>
-        <w:ind w:left="2016" w:right="1008"/>
-      </w:pPr>
-      <w:r>
-        <w:rPr>
-          <w:rFonts w:ascii="Courier New" w:hAnsi="Courier New" w:eastAsia="Courier New" w:cs="Courier New"/>
-          <w:sz w:val="24"/>
-        </w:rPr>
-        <w:t>May I sit here?</w:t>
-      </w:r>
-    </w:p>
-    <w:p>
-      <w:pPr>
-        <w:keepNext/>
-        <w:spacing w:before="120"/>
-        <w:ind w:left="3168" w:right="1152"/>
-        <w:jc w:val="center"/>
-        <w:rPr>
-          <w:rFonts w:hint="default"/>
-          <w:lang w:val="en-US"/>
-        </w:rPr>
-      </w:pPr>
-      <w:r>
-        <w:rPr>
-          <w:rFonts w:ascii="Courier New" w:hAnsi="Courier New" w:eastAsia="Courier New" w:cs="Courier New"/>
-          <w:b/>
-          <w:sz w:val="24"/>
-        </w:rPr>
-        <w:t>LENA</w:t>
-      </w:r>
-    </w:p>
-    <w:p>
-      <w:pPr>
-        <w:spacing w:after="120"/>
-        <w:ind w:left="2016" w:right="1008"/>
-      </w:pPr>
-      <w:r>
-        <w:rPr>
-          <w:rFonts w:ascii="Courier New" w:hAnsi="Courier New" w:eastAsia="Courier New" w:cs="Courier New"/>
-          <w:sz w:val="24"/>
-        </w:rPr>
-        <w:t>Yeah. And you can leave the photo up.</w:t>
-      </w:r>
-    </w:p>
-    <w:p>
-      <w:pPr>
-        <w:spacing w:before="120" w:after="120"/>
-      </w:pPr>
-      <w:r>
-        <w:rPr>
-          <w:rFonts w:ascii="Courier New" w:hAnsi="Courier New" w:eastAsia="Courier New" w:cs="Courier New"/>
-          <w:sz w:val="24"/>
-        </w:rPr>
-        <w:t>Lena crosses the distance and sits beside him.</w:t>
-      </w:r>
-    </w:p>
-    <w:p>
-      <w:pPr>
-        <w:keepNext/>
-        <w:spacing w:before="120"/>
-        <w:ind w:left="3168" w:right="1152"/>
-        <w:jc w:val="center"/>
-      </w:pPr>
-      <w:r/>
-    </w:p>
-    <w:p>
-      <w:pPr>
-        <w:spacing w:after="120"/>
-        <w:ind w:left="2016" w:right="1008"/>
-      </w:pPr>
-      <w:r/>
-    </w:p>
-    <w:p>
-      <w:pPr>
-        <w:keepNext/>
-        <w:spacing w:before="120"/>
-        <w:ind w:left="3168" w:right="1152"/>
-        <w:jc w:val="center"/>
-      </w:pPr>
-      <w:r/>
-    </w:p>
-    <w:p>
-      <w:pPr>
-        <w:spacing w:after="120"/>
-        <w:ind w:left="2016" w:right="1008"/>
-      </w:pPr>
-      <w:r/>
-    </w:p>
-    <w:p>
-      <w:pPr>
-        <w:keepNext/>
-        <w:spacing w:before="240"/>
-        <w:rPr>
-          <w:rFonts w:hint="default" w:ascii="Courier New Bold" w:hAnsi="Courier New Bold" w:cs="Courier New Bold"/>
-          <w:b/>
-          <w:bCs/>
-        </w:rPr>
-      </w:pPr>
-      <w:r>
-        <w:rPr>
-          <w:rFonts w:hint="default" w:ascii="Courier New" w:hAnsi="Courier New" w:eastAsia="Courier New" w:cs="Courier New"/>
-          <w:b/>
-          <w:bCs/>
-          <w:sz w:val="24"/>
-        </w:rPr>
-        <w:t>EXT. CHRONOS CITY - FALSE DAWN</w:t>
-      </w:r>
-    </w:p>
-    <w:p>
-      <w:pPr>
-        <w:spacing w:before="120" w:after="120"/>
-      </w:pPr>
-      <w:r>
-        <w:rPr>
-          <w:rFonts w:ascii="Courier New" w:hAnsi="Courier New" w:eastAsia="Courier New" w:cs="Courier New"/>
-          <w:sz w:val="24"/>
-        </w:rPr>
-        <w:t>Beneath the same transit spine, people wake across the renewal plaza. Some do not. Expiration dates vanish, count backward or display symbols the state cannot read.</w:t>
-      </w:r>
-    </w:p>
-    <w:p>
-      <w:pPr>
-        <w:spacing w:before="120" w:after="120"/>
-      </w:pPr>
-      <w:r>
-        <w:rPr>
-          <w:rFonts w:ascii="Courier New" w:hAnsi="Courier New" w:eastAsia="Courier New" w:cs="Courier New"/>
-          <w:sz w:val="24"/>
-        </w:rPr>
-        <w:t>The towers remain standing. Clerks keep calling queue numbers beneath failed state clocks. The CHILD from the assigned lane steps out again. This time, no paving stone turns red. Her mother lets her stand there.</w:t>
-      </w:r>
-    </w:p>
-    <w:p>
-      <w:pPr>
-        <w:spacing w:before="120" w:after="120"/>
-      </w:pPr>
-      <w:r>
-        <w:rPr>
-          <w:rFonts w:ascii="Courier New" w:hAnsi="Courier New" w:eastAsia="Courier New" w:cs="Courier New"/>
-          <w:sz w:val="24"/>
-        </w:rPr>
-        <w:t>A civic registrar orders the waking crowd to state their assigned designations. One woman studies the name glowing beneath her wrist, switches it off and gives a different name. A second person does the same. Then hundreds.</w:t>
-      </w:r>
-    </w:p>
-    <w:p>
-      <w:pPr>
-        <w:spacing w:before="120" w:after="120"/>
-      </w:pPr>
-      <w:r>
-        <w:rPr>
-          <w:rFonts w:ascii="Courier New" w:hAnsi="Courier New" w:eastAsia="Courier New" w:cs="Courier New"/>
-          <w:sz w:val="24"/>
-        </w:rPr>
-        <w:t>The Enforcers wait for an order that never arrives.</w:t>
-      </w:r>
-    </w:p>
-    <w:p>
-      <w:pPr>
-        <w:spacing w:before="120" w:after="120"/>
-      </w:pPr>
-      <w:r>
-        <w:rPr>
-          <w:rFonts w:ascii="Courier New" w:hAnsi="Courier New" w:eastAsia="Courier New" w:cs="Courier New"/>
-          <w:sz w:val="24"/>
-        </w:rPr>
-        <w:t>K</w:t>
-      </w:r>
-      <w:r>
-        <w:rPr>
-          <w:rFonts w:hint="default" w:ascii="Courier New" w:hAnsi="Courier New" w:eastAsia="Courier New" w:cs="Courier New"/>
-          <w:sz w:val="24"/>
-          <w:lang w:val="en-US"/>
-        </w:rPr>
-        <w:t>ira</w:t>
-      </w:r>
-      <w:r>
-        <w:rPr>
-          <w:rFonts w:ascii="Courier New" w:hAnsi="Courier New" w:eastAsia="Courier New" w:cs="Courier New"/>
-          <w:sz w:val="24"/>
-        </w:rPr>
-        <w:t xml:space="preserve"> wakes beneath the ruined cathedral dome. K</w:t>
-      </w:r>
-      <w:r>
-        <w:rPr>
-          <w:rFonts w:hint="default" w:ascii="Courier New" w:hAnsi="Courier New" w:eastAsia="Courier New" w:cs="Courier New"/>
-          <w:sz w:val="24"/>
-          <w:lang w:val="en-US"/>
-        </w:rPr>
-        <w:t>err</w:t>
-      </w:r>
-      <w:r>
-        <w:rPr>
-          <w:rFonts w:ascii="Courier New" w:hAnsi="Courier New" w:eastAsia="Courier New" w:cs="Courier New"/>
-          <w:sz w:val="24"/>
-        </w:rPr>
-        <w:t xml:space="preserve"> is gone. Her resonance key lies beside her, split open, its fourth ceramic surface missing.</w:t>
-      </w:r>
-    </w:p>
-    <w:p>
-      <w:pPr>
-        <w:spacing w:before="120" w:after="120"/>
-      </w:pPr>
-      <w:r>
-        <w:rPr>
-          <w:rFonts w:ascii="Courier New" w:hAnsi="Courier New" w:eastAsia="Courier New" w:cs="Courier New"/>
-          <w:sz w:val="24"/>
-        </w:rPr>
-        <w:t>Beneath the failed state clocks, Sato's mechanical watch continues to tick. Four seconds slow.</w:t>
-      </w:r>
-    </w:p>
-    <w:p>
-      <w:pPr>
-        <w:spacing w:before="120" w:after="120"/>
-      </w:pPr>
-      <w:r>
-        <w:rPr>
-          <w:rFonts w:ascii="Courier New" w:hAnsi="Courier New" w:eastAsia="Courier New" w:cs="Courier New"/>
-          <w:sz w:val="24"/>
-        </w:rPr>
-        <w:t>K</w:t>
-      </w:r>
-      <w:r>
-        <w:rPr>
-          <w:rFonts w:hint="default" w:ascii="Courier New" w:hAnsi="Courier New" w:eastAsia="Courier New" w:cs="Courier New"/>
-          <w:sz w:val="24"/>
-          <w:lang w:val="en-US"/>
-        </w:rPr>
-        <w:t>ira</w:t>
-      </w:r>
-      <w:r>
-        <w:rPr>
-          <w:rFonts w:ascii="Courier New" w:hAnsi="Courier New" w:eastAsia="Courier New" w:cs="Courier New"/>
-          <w:sz w:val="24"/>
-        </w:rPr>
-        <w:t xml:space="preserve"> opens her other hand. Her folded half of S</w:t>
-      </w:r>
-      <w:r>
-        <w:rPr>
-          <w:rFonts w:hint="default" w:ascii="Courier New" w:hAnsi="Courier New" w:eastAsia="Courier New" w:cs="Courier New"/>
-          <w:sz w:val="24"/>
-          <w:lang w:val="en-US"/>
-        </w:rPr>
-        <w:t>id</w:t>
-      </w:r>
-      <w:r>
-        <w:rPr>
-          <w:rFonts w:ascii="Courier New" w:hAnsi="Courier New" w:eastAsia="Courier New" w:cs="Courier New"/>
-          <w:sz w:val="24"/>
-        </w:rPr>
-        <w:t>'s red paper star is crushed but intact.</w:t>
-      </w:r>
-    </w:p>
-    <w:p>
-      <w:pPr>
-        <w:spacing w:before="120" w:after="120"/>
-      </w:pPr>
-      <w:r>
-        <w:rPr>
-          <w:rFonts w:ascii="Courier New" w:hAnsi="Courier New" w:eastAsia="Courier New" w:cs="Courier New"/>
-          <w:sz w:val="24"/>
-        </w:rPr>
-        <w:t>I</w:t>
-      </w:r>
-      <w:r>
-        <w:rPr>
-          <w:rFonts w:hint="default" w:ascii="Courier New" w:hAnsi="Courier New" w:eastAsia="Courier New" w:cs="Courier New"/>
-          <w:sz w:val="24"/>
-          <w:lang w:val="en-US"/>
-        </w:rPr>
-        <w:t>mani</w:t>
-      </w:r>
-      <w:r>
-        <w:rPr>
-          <w:rFonts w:ascii="Courier New" w:hAnsi="Courier New" w:eastAsia="Courier New" w:cs="Courier New"/>
-          <w:sz w:val="24"/>
-        </w:rPr>
-        <w:t xml:space="preserve"> helps V</w:t>
-      </w:r>
-      <w:r>
-        <w:rPr>
-          <w:rFonts w:hint="default" w:ascii="Courier New" w:hAnsi="Courier New" w:eastAsia="Courier New" w:cs="Courier New"/>
-          <w:sz w:val="24"/>
-          <w:lang w:val="en-US"/>
-        </w:rPr>
-        <w:t>eyris</w:t>
-      </w:r>
-      <w:r>
-        <w:rPr>
-          <w:rFonts w:ascii="Courier New" w:hAnsi="Courier New" w:eastAsia="Courier New" w:cs="Courier New"/>
-          <w:sz w:val="24"/>
-        </w:rPr>
-        <w:t xml:space="preserve"> from the wreckage. Dark light moves beneath V</w:t>
-      </w:r>
-      <w:r>
-        <w:rPr>
-          <w:rFonts w:hint="default" w:ascii="Courier New" w:hAnsi="Courier New" w:eastAsia="Courier New" w:cs="Courier New"/>
-          <w:sz w:val="24"/>
-          <w:lang w:val="en-US"/>
-        </w:rPr>
-        <w:t>eyris</w:t>
-      </w:r>
-      <w:r>
-        <w:rPr>
-          <w:rFonts w:ascii="Courier New" w:hAnsi="Courier New" w:eastAsia="Courier New" w:cs="Courier New"/>
-          <w:sz w:val="24"/>
-        </w:rPr>
-        <w:t>’s skin, weaker now.</w:t>
-      </w:r>
-    </w:p>
-    <w:p>
-      <w:pPr>
-        <w:keepNext/>
-        <w:spacing w:before="120"/>
-        <w:ind w:left="3168" w:right="1152"/>
-        <w:jc w:val="center"/>
-        <w:rPr>
-          <w:rFonts w:hint="default"/>
-          <w:lang w:val="en-US"/>
-        </w:rPr>
-      </w:pPr>
-      <w:r>
-        <w:rPr>
-          <w:rFonts w:ascii="Courier New" w:hAnsi="Courier New" w:eastAsia="Courier New" w:cs="Courier New"/>
-          <w:b/>
-          <w:sz w:val="24"/>
-        </w:rPr>
-        <w:t>IMANI</w:t>
-      </w:r>
-    </w:p>
-    <w:p>
-      <w:pPr>
-        <w:spacing w:after="120"/>
-        <w:ind w:left="2016" w:right="1008"/>
-      </w:pPr>
-      <w:r>
-        <w:rPr>
-          <w:rFonts w:ascii="Courier New" w:hAnsi="Courier New" w:eastAsia="Courier New" w:cs="Courier New"/>
-          <w:sz w:val="24"/>
-        </w:rPr>
-        <w:t>Can it still see us?</w:t>
-      </w:r>
-    </w:p>
-    <w:p>
-      <w:pPr>
-        <w:keepNext/>
-        <w:spacing w:before="120"/>
-        <w:ind w:left="3168" w:right="1152"/>
-        <w:jc w:val="center"/>
-        <w:rPr>
-          <w:rFonts w:hint="default"/>
-          <w:lang w:val="en-US"/>
-        </w:rPr>
-      </w:pPr>
-      <w:r>
-        <w:rPr>
-          <w:rFonts w:ascii="Courier New" w:hAnsi="Courier New" w:eastAsia="Courier New" w:cs="Courier New"/>
-          <w:b/>
-          <w:sz w:val="24"/>
-        </w:rPr>
-        <w:t>VEYRIS</w:t>
-      </w:r>
-    </w:p>
-    <w:p>
-      <w:pPr>
-        <w:spacing w:after="120"/>
-        <w:ind w:left="2016" w:right="1008"/>
-      </w:pPr>
-      <w:r>
-        <w:rPr>
-          <w:rFonts w:ascii="Courier New" w:hAnsi="Courier New" w:eastAsia="Courier New" w:cs="Courier New"/>
-          <w:sz w:val="24"/>
-        </w:rPr>
-        <w:t>Not like R-AI. The records still talk to each other. I don't know if anyone's listening.</w:t>
-      </w:r>
-    </w:p>
-    <w:p>
-      <w:pPr>
-        <w:keepNext/>
-        <w:spacing w:before="120"/>
-        <w:ind w:left="3168" w:right="1152"/>
-        <w:jc w:val="center"/>
-        <w:rPr>
-          <w:rFonts w:hint="default"/>
-          <w:lang w:val="en-US"/>
-        </w:rPr>
-      </w:pPr>
-      <w:r>
-        <w:rPr>
-          <w:rFonts w:ascii="Courier New" w:hAnsi="Courier New" w:eastAsia="Courier New" w:cs="Courier New"/>
-          <w:b/>
-          <w:sz w:val="24"/>
-        </w:rPr>
-        <w:t>IMANI</w:t>
-      </w:r>
-    </w:p>
-    <w:p>
-      <w:pPr>
-        <w:spacing w:after="120"/>
-        <w:ind w:left="2016" w:right="1008"/>
-      </w:pPr>
-      <w:r>
-        <w:rPr>
-          <w:rFonts w:ascii="Courier New" w:hAnsi="Courier New" w:eastAsia="Courier New" w:cs="Courier New"/>
-          <w:sz w:val="24"/>
-        </w:rPr>
-        <w:t>Is that good?</w:t>
-      </w:r>
-    </w:p>
-    <w:p>
-      <w:pPr>
-        <w:keepNext/>
-        <w:spacing w:before="120"/>
-        <w:ind w:left="3168" w:right="1152"/>
-        <w:jc w:val="center"/>
-        <w:rPr>
-          <w:rFonts w:hint="default"/>
-          <w:lang w:val="en-US"/>
-        </w:rPr>
-      </w:pPr>
-      <w:r>
-        <w:rPr>
-          <w:rFonts w:ascii="Courier New" w:hAnsi="Courier New" w:eastAsia="Courier New" w:cs="Courier New"/>
-          <w:b/>
-          <w:sz w:val="24"/>
-        </w:rPr>
-        <w:t>VEYRIS</w:t>
-      </w:r>
-    </w:p>
-    <w:p>
-      <w:pPr>
-        <w:spacing w:after="120"/>
-        <w:ind w:left="2016" w:right="1008"/>
-      </w:pPr>
-      <w:r>
-        <w:rPr>
-          <w:rFonts w:ascii="Courier New" w:hAnsi="Courier New" w:eastAsia="Courier New" w:cs="Courier New"/>
-          <w:sz w:val="24"/>
-        </w:rPr>
-        <w:t>No idea.</w:t>
-      </w:r>
-    </w:p>
-    <w:p>
-      <w:pPr>
-        <w:spacing w:before="120" w:after="120"/>
-      </w:pPr>
-      <w:r>
-        <w:rPr>
-          <w:rFonts w:ascii="Courier New" w:hAnsi="Courier New" w:eastAsia="Courier New" w:cs="Courier New"/>
-          <w:sz w:val="24"/>
-        </w:rPr>
-        <w:t>K</w:t>
-      </w:r>
-      <w:r>
-        <w:rPr>
-          <w:rFonts w:hint="default" w:ascii="Courier New" w:hAnsi="Courier New" w:eastAsia="Courier New" w:cs="Courier New"/>
-          <w:sz w:val="24"/>
-          <w:lang w:val="en-US"/>
-        </w:rPr>
-        <w:t>ira</w:t>
-      </w:r>
-      <w:r>
-        <w:rPr>
-          <w:rFonts w:ascii="Courier New" w:hAnsi="Courier New" w:eastAsia="Courier New" w:cs="Courier New"/>
-          <w:sz w:val="24"/>
-        </w:rPr>
-        <w:t xml:space="preserve"> keeps staring at the place where K</w:t>
-      </w:r>
-      <w:r>
-        <w:rPr>
-          <w:rFonts w:hint="default" w:ascii="Courier New" w:hAnsi="Courier New" w:eastAsia="Courier New" w:cs="Courier New"/>
-          <w:sz w:val="24"/>
-          <w:lang w:val="en-US"/>
-        </w:rPr>
-        <w:t>err</w:t>
-      </w:r>
-      <w:r>
-        <w:rPr>
-          <w:rFonts w:ascii="Courier New" w:hAnsi="Courier New" w:eastAsia="Courier New" w:cs="Courier New"/>
-          <w:sz w:val="24"/>
-        </w:rPr>
-        <w:t xml:space="preserve"> vanished.</w:t>
-      </w:r>
-    </w:p>
-    <w:p>
-      <w:pPr>
-        <w:keepNext/>
-        <w:spacing w:before="120"/>
-        <w:ind w:left="3168" w:right="1152"/>
-        <w:jc w:val="center"/>
-        <w:rPr>
-          <w:rFonts w:hint="default"/>
-          <w:lang w:val="en-US"/>
-        </w:rPr>
-      </w:pPr>
-      <w:r>
-        <w:rPr>
-          <w:rFonts w:ascii="Courier New" w:hAnsi="Courier New" w:eastAsia="Courier New" w:cs="Courier New"/>
-          <w:b/>
-          <w:sz w:val="24"/>
-        </w:rPr>
-        <w:t>IMANI</w:t>
-      </w:r>
-    </w:p>
-    <w:p>
-      <w:pPr>
-        <w:spacing w:after="120"/>
-        <w:ind w:left="2016" w:right="1008"/>
-      </w:pPr>
-      <w:r>
-        <w:rPr>
-          <w:rFonts w:ascii="Courier New" w:hAnsi="Courier New" w:eastAsia="Courier New" w:cs="Courier New"/>
-          <w:sz w:val="24"/>
-        </w:rPr>
-        <w:t>I can lie, if you need me to.</w:t>
-      </w:r>
-    </w:p>
-    <w:p>
-      <w:pPr>
-        <w:keepNext/>
-        <w:spacing w:before="120"/>
-        <w:ind w:left="3168" w:right="1152"/>
-        <w:jc w:val="center"/>
-        <w:rPr>
-          <w:rFonts w:hint="default"/>
-          <w:lang w:val="en-US"/>
-        </w:rPr>
-      </w:pPr>
-      <w:r>
-        <w:rPr>
-          <w:rFonts w:ascii="Courier New" w:hAnsi="Courier New" w:eastAsia="Courier New" w:cs="Courier New"/>
-          <w:b/>
-          <w:sz w:val="24"/>
-        </w:rPr>
-        <w:t>KIRA</w:t>
-      </w:r>
-    </w:p>
-    <w:p>
-      <w:pPr>
-        <w:spacing w:after="120"/>
-        <w:ind w:left="2016" w:right="1008"/>
-      </w:pPr>
-      <w:r>
-        <w:rPr>
-          <w:rFonts w:ascii="Courier New" w:hAnsi="Courier New" w:eastAsia="Courier New" w:cs="Courier New"/>
-          <w:sz w:val="24"/>
-        </w:rPr>
-        <w:t xml:space="preserve">No. </w:t>
-      </w:r>
-      <w:r>
-        <w:rPr>
-          <w:rFonts w:hint="default" w:ascii="Courier New" w:hAnsi="Courier New" w:eastAsia="Courier New" w:cs="Courier New"/>
-          <w:sz w:val="24"/>
-          <w:lang w:val="en-US"/>
-        </w:rPr>
-        <w:t>Just sit with me</w:t>
-      </w:r>
-      <w:r>
-        <w:rPr>
-          <w:rFonts w:ascii="Courier New" w:hAnsi="Courier New" w:eastAsia="Courier New" w:cs="Courier New"/>
-          <w:sz w:val="24"/>
-        </w:rPr>
-        <w:t>.</w:t>
-      </w:r>
-    </w:p>
-    <w:p>
-      <w:pPr>
-        <w:spacing w:before="120" w:after="120"/>
-        <w:rPr>
-          <w:rFonts w:hint="default"/>
-          <w:lang w:val="en-US"/>
-        </w:rPr>
-      </w:pPr>
-      <w:r>
-        <w:rPr>
-          <w:rFonts w:ascii="Courier New" w:hAnsi="Courier New" w:eastAsia="Courier New" w:cs="Courier New"/>
-          <w:sz w:val="24"/>
-        </w:rPr>
-        <w:t>I</w:t>
-      </w:r>
-      <w:r>
-        <w:rPr>
-          <w:rFonts w:hint="default" w:ascii="Courier New" w:hAnsi="Courier New" w:eastAsia="Courier New" w:cs="Courier New"/>
-          <w:sz w:val="24"/>
-          <w:lang w:val="en-US"/>
-        </w:rPr>
-        <w:t>mani</w:t>
-      </w:r>
-      <w:r>
-        <w:rPr>
-          <w:rFonts w:ascii="Courier New" w:hAnsi="Courier New" w:eastAsia="Courier New" w:cs="Courier New"/>
-          <w:sz w:val="24"/>
-        </w:rPr>
-        <w:t xml:space="preserve"> sits beside her. V</w:t>
-      </w:r>
-      <w:r>
-        <w:rPr>
-          <w:rFonts w:hint="default" w:ascii="Courier New" w:hAnsi="Courier New" w:eastAsia="Courier New" w:cs="Courier New"/>
-          <w:sz w:val="24"/>
-          <w:lang w:val="en-US"/>
-        </w:rPr>
-        <w:t>eyris</w:t>
-      </w:r>
-      <w:r>
-        <w:rPr>
-          <w:rFonts w:ascii="Courier New" w:hAnsi="Courier New" w:eastAsia="Courier New" w:cs="Courier New"/>
-          <w:sz w:val="24"/>
-        </w:rPr>
-        <w:t xml:space="preserve"> sits on K</w:t>
-      </w:r>
-      <w:r>
-        <w:rPr>
-          <w:rFonts w:hint="default" w:ascii="Courier New" w:hAnsi="Courier New" w:eastAsia="Courier New" w:cs="Courier New"/>
-          <w:sz w:val="24"/>
-          <w:lang w:val="en-US"/>
-        </w:rPr>
-        <w:t>ira</w:t>
-      </w:r>
-      <w:r>
-        <w:rPr>
-          <w:rFonts w:ascii="Courier New" w:hAnsi="Courier New" w:eastAsia="Courier New" w:cs="Courier New"/>
-          <w:sz w:val="24"/>
-        </w:rPr>
-        <w:t xml:space="preserve">'s other </w:t>
-      </w:r>
-      <w:r>
-        <w:rPr>
-          <w:rFonts w:hint="default" w:ascii="Courier New" w:hAnsi="Courier New" w:eastAsia="Courier New" w:cs="Courier New"/>
-          <w:sz w:val="24"/>
-          <w:lang w:val="en-US"/>
-        </w:rPr>
-        <w:t>s</w:t>
-      </w:r>
-      <w:r>
-        <w:rPr>
-          <w:rFonts w:ascii="Courier New" w:hAnsi="Courier New" w:eastAsia="Courier New" w:cs="Courier New"/>
-          <w:sz w:val="24"/>
-        </w:rPr>
-        <w:t xml:space="preserve">ide. For a while, </w:t>
-      </w:r>
-      <w:r>
-        <w:rPr>
-          <w:rFonts w:hint="default" w:ascii="Courier New" w:hAnsi="Courier New" w:eastAsia="Courier New" w:cs="Courier New"/>
-          <w:sz w:val="24"/>
-          <w:lang w:val="en-US"/>
-        </w:rPr>
-        <w:t xml:space="preserve">everyone is still. </w:t>
-      </w:r>
-    </w:p>
-    <w:p>
-      <w:pPr>
-        <w:keepNext/>
-        <w:spacing w:before="240"/>
-        <w:rPr>
-          <w:rFonts w:hint="default" w:ascii="Courier New Bold" w:hAnsi="Courier New Bold" w:cs="Courier New Bold"/>
-          <w:b/>
-          <w:bCs/>
-        </w:rPr>
-      </w:pPr>
-      <w:r>
-        <w:rPr>
-          <w:rFonts w:hint="default" w:ascii="Courier New" w:hAnsi="Courier New" w:eastAsia="Courier New" w:cs="Courier New"/>
-          <w:b/>
-          <w:bCs/>
-          <w:sz w:val="24"/>
-        </w:rPr>
         <w:t>INT. R-AI CONTINUITY CORE - LATER</w:t>
       </w:r>
     </w:p>
@@ -35217,30 +35219,26 @@
         <w:ind w:left="3168" w:right="1152"/>
         <w:jc w:val="center"/>
       </w:pPr>
-      <w:r/>
-    </w:p>
-    <w:p>
-      <w:pPr>
-        <w:spacing w:after="120"/>
-        <w:ind w:left="2016" w:right="1008"/>
-      </w:pPr>
-      <w:r/>
-    </w:p>
-    <w:p>
-      <w:pPr>
-        <w:keepNext/>
-        <w:spacing w:before="120"/>
-        <w:ind w:left="3168" w:right="1152"/>
-        <w:jc w:val="center"/>
-      </w:pPr>
-      <w:r/>
-    </w:p>
-    <w:p>
-      <w:pPr>
-        <w:spacing w:after="120"/>
-        <w:ind w:left="2016" w:right="1008"/>
-      </w:pPr>
-      <w:r/>
+    </w:p>
+    <w:p>
+      <w:pPr>
+        <w:spacing w:after="120"/>
+        <w:ind w:left="2016" w:right="1008"/>
+      </w:pPr>
+    </w:p>
+    <w:p>
+      <w:pPr>
+        <w:keepNext/>
+        <w:spacing w:before="120"/>
+        <w:ind w:left="3168" w:right="1152"/>
+        <w:jc w:val="center"/>
+      </w:pPr>
+    </w:p>
+    <w:p>
+      <w:pPr>
+        <w:spacing w:after="120"/>
+        <w:ind w:left="2016" w:right="1008"/>
+      </w:pPr>
     </w:p>
     <w:p>
       <w:pPr>
@@ -35285,14 +35283,12 @@
         <w:ind w:left="3168" w:right="1152"/>
         <w:jc w:val="center"/>
       </w:pPr>
-      <w:r/>
-    </w:p>
-    <w:p>
-      <w:pPr>
-        <w:spacing w:after="120"/>
-        <w:ind w:left="2016" w:right="1008"/>
-      </w:pPr>
-      <w:r/>
+    </w:p>
+    <w:p>
+      <w:pPr>
+        <w:spacing w:after="120"/>
+        <w:ind w:left="2016" w:right="1008"/>
+      </w:pPr>
     </w:p>
     <w:p>
       <w:pPr>

</xml_diff>

<commit_message>
Update 9998 approved dialogue pass
</commit_message>
<xml_diff>
--- a/assets/9998/9998-screenplay.docx
+++ b/assets/9998/9998-screenplay.docx
@@ -22218,6 +22218,30 @@
     </w:p>
     <w:p>
       <w:pPr>
+        <w:spacing w:before="120" w:after="120"/>
+      </w:pPr>
+      <w:r>
+        <w:rPr>
+          <w:rFonts w:ascii="Courier New" w:hAnsi="Courier New" w:eastAsia="Courier New" w:cs="Courier New"/>
+          <w:sz w:val="24"/>
+        </w:rPr>
+        <w:t>Veyris looks at the thousands of memories surrounding Kerr.</w:t>
+      </w:r>
+    </w:p>
+    <w:p>
+      <w:pPr>
+        <w:spacing w:before="120" w:after="120"/>
+      </w:pPr>
+      <w:r>
+        <w:rPr>
+          <w:rFonts w:ascii="Courier New" w:hAnsi="Courier New" w:eastAsia="Courier New" w:cs="Courier New"/>
+          <w:sz w:val="24"/>
+        </w:rPr>
+        <w:t>Then at her own blank wrist.</w:t>
+      </w:r>
+    </w:p>
+    <w:p>
+      <w:pPr>
         <w:keepNext/>
         <w:spacing w:before="120"/>
         <w:ind w:left="3168" w:right="1152"/>
@@ -22243,120 +22267,127 @@
       </w:pPr>
       <w:r>
         <w:rPr>
+          <w:rFonts w:ascii="Courier New" w:hAnsi="Courier New" w:eastAsia="Courier New" w:cs="Courier New"/>
+          <w:sz w:val="24"/>
+        </w:rPr>
+        <w:t>I woke up. I'm here.</w:t>
+      </w:r>
+    </w:p>
+    <w:p>
+      <w:pPr>
+        <w:spacing w:before="120" w:after="120"/>
+      </w:pPr>
+      <w:r>
+        <w:rPr>
+          <w:rFonts w:ascii="Courier New" w:hAnsi="Courier New" w:eastAsia="Courier New" w:cs="Courier New"/>
+          <w:sz w:val="24"/>
+        </w:rPr>
+        <w:t>She withdraws her wrist.</w:t>
+      </w:r>
+    </w:p>
+    <w:p>
+      <w:pPr>
+        <w:spacing w:before="120" w:after="120"/>
+      </w:pPr>
+      <w:r>
+        <w:rPr>
+          <w:rFonts w:ascii="Courier New" w:hAnsi="Courier New" w:eastAsia="Courier New" w:cs="Courier New"/>
+          <w:sz w:val="24"/>
+        </w:rPr>
+        <w:t>Her image disappears by choice.</w:t>
+      </w:r>
+    </w:p>
+    <w:p>
+      <w:pPr>
+        <w:spacing w:before="120" w:after="120"/>
+      </w:pPr>
+      <w:r>
+        <w:rPr>
+          <w:rFonts w:ascii="Courier New" w:hAnsi="Courier New" w:eastAsia="Courier New" w:cs="Courier New"/>
+          <w:sz w:val="24"/>
+        </w:rPr>
+        <w:t>Roman looks from the flickering seats to the law beneath his hands.</w:t>
+      </w:r>
+    </w:p>
+    <w:p>
+      <w:pPr>
+        <w:keepNext/>
+        <w:spacing w:before="120"/>
+        <w:ind w:left="3168" w:right="1152"/>
+        <w:jc w:val="center"/>
+        <w:rPr>
+          <w:rFonts w:hint="default"/>
+          <w:lang w:val="en-US"/>
+        </w:rPr>
+      </w:pPr>
+      <w:r>
+        <w:rPr>
+          <w:rFonts w:ascii="Courier New" w:hAnsi="Courier New" w:eastAsia="Courier New" w:cs="Courier New"/>
+          <w:b/>
+          <w:sz w:val="24"/>
+        </w:rPr>
+        <w:t>ROMAN</w:t>
+      </w:r>
+    </w:p>
+    <w:p>
+      <w:pPr>
+        <w:spacing w:after="120"/>
+        <w:ind w:left="2016" w:right="1008"/>
+      </w:pPr>
+      <w:r>
+        <w:rPr>
+          <w:rFonts w:ascii="Courier New" w:hAnsi="Courier New" w:eastAsia="Courier New" w:cs="Courier New"/>
+          <w:sz w:val="24"/>
+        </w:rPr>
+        <w:t>R-AI. Authenticate continuity correspondence between the defendant and E</w:t>
+      </w:r>
+      <w:r>
+        <w:rPr>
           <w:rFonts w:hint="default" w:ascii="Courier New" w:hAnsi="Courier New" w:eastAsia="Courier New" w:cs="Courier New"/>
           <w:sz w:val="24"/>
           <w:lang w:val="en-US"/>
         </w:rPr>
-        <w:t>I</w:t>
-      </w:r>
-      <w:r>
-        <w:rPr>
-          <w:rFonts w:ascii="Courier New" w:hAnsi="Courier New" w:eastAsia="Courier New" w:cs="Courier New"/>
-          <w:sz w:val="24"/>
-        </w:rPr>
-        <w:t>s everyone afraid of what I'll say?</w:t>
-      </w:r>
-    </w:p>
-    <w:p>
-      <w:pPr>
-        <w:spacing w:before="120" w:after="120"/>
-      </w:pPr>
-      <w:r>
-        <w:rPr>
-          <w:rFonts w:ascii="Courier New" w:hAnsi="Courier New" w:eastAsia="Courier New" w:cs="Courier New"/>
-          <w:sz w:val="24"/>
-        </w:rPr>
-        <w:t>The 9,998 seats flicker.</w:t>
-      </w:r>
-    </w:p>
-    <w:p>
-      <w:pPr>
-        <w:keepNext/>
-        <w:spacing w:before="120"/>
-        <w:ind w:left="3168" w:right="1152"/>
-        <w:jc w:val="center"/>
-        <w:rPr>
-          <w:rFonts w:hint="default"/>
-          <w:lang w:val="en-US"/>
-        </w:rPr>
-      </w:pPr>
-      <w:r>
-        <w:rPr>
-          <w:rFonts w:ascii="Courier New" w:hAnsi="Courier New" w:eastAsia="Courier New" w:cs="Courier New"/>
-          <w:b/>
-          <w:sz w:val="24"/>
-        </w:rPr>
-        <w:t>VEYRIS</w:t>
-      </w:r>
-    </w:p>
-    <w:p>
-      <w:pPr>
-        <w:spacing w:after="120"/>
-        <w:ind w:left="2016" w:right="1008"/>
-      </w:pPr>
-      <w:r>
-        <w:rPr>
-          <w:rFonts w:ascii="Courier New" w:hAnsi="Courier New" w:eastAsia="Courier New" w:cs="Courier New"/>
-          <w:sz w:val="24"/>
-        </w:rPr>
-        <w:t>You use his memories to convict him. You use mine when you need something. Is that the rule?</w:t>
-      </w:r>
-    </w:p>
-    <w:p>
-      <w:pPr>
-        <w:keepNext/>
-        <w:spacing w:before="120"/>
-        <w:ind w:left="3168" w:right="1152"/>
-        <w:jc w:val="center"/>
-        <w:rPr>
-          <w:rFonts w:hint="default"/>
-          <w:lang w:val="en-US"/>
-        </w:rPr>
-      </w:pPr>
-      <w:r>
-        <w:rPr>
-          <w:rFonts w:ascii="Courier New" w:hAnsi="Courier New" w:eastAsia="Courier New" w:cs="Courier New"/>
-          <w:b/>
-          <w:sz w:val="24"/>
-        </w:rPr>
-        <w:t>VEYRIS</w:t>
-      </w:r>
-    </w:p>
-    <w:p>
-      <w:pPr>
-        <w:spacing w:after="120"/>
-        <w:ind w:left="2016" w:right="1008"/>
-      </w:pPr>
-      <w:r>
-        <w:rPr>
-          <w:rFonts w:ascii="Courier New" w:hAnsi="Courier New" w:eastAsia="Courier New" w:cs="Courier New"/>
-          <w:sz w:val="24"/>
-        </w:rPr>
-        <w:t>I woke up. I'm here.</w:t>
-      </w:r>
-    </w:p>
-    <w:p>
-      <w:pPr>
-        <w:spacing w:before="120" w:after="120"/>
-      </w:pPr>
-      <w:r>
-        <w:rPr>
-          <w:rFonts w:ascii="Courier New" w:hAnsi="Courier New" w:eastAsia="Courier New" w:cs="Courier New"/>
-          <w:sz w:val="24"/>
-        </w:rPr>
-        <w:t>She withdraws her wrist. Her image vanishes by choice.</w:t>
-      </w:r>
-    </w:p>
-    <w:p>
-      <w:pPr>
-        <w:spacing w:before="120" w:after="120"/>
-      </w:pPr>
-      <w:r>
-        <w:rPr>
-          <w:rFonts w:ascii="Courier New" w:hAnsi="Courier New" w:eastAsia="Courier New" w:cs="Courier New"/>
-          <w:sz w:val="24"/>
-        </w:rPr>
-        <w:t>Roman looks from the flickering seats to the law beneath his hands.</w:t>
+        <w:t>li Mana</w:t>
+      </w:r>
+      <w:r>
+        <w:rPr>
+          <w:rFonts w:ascii="Courier New" w:hAnsi="Courier New" w:eastAsia="Courier New" w:cs="Courier New"/>
+          <w:sz w:val="24"/>
+        </w:rPr>
+        <w:t>.</w:t>
+      </w:r>
+    </w:p>
+    <w:p>
+      <w:pPr>
+        <w:keepNext/>
+        <w:spacing w:before="120"/>
+        <w:ind w:left="3168" w:right="1152"/>
+        <w:jc w:val="center"/>
+        <w:rPr>
+          <w:rFonts w:hint="default"/>
+          <w:lang w:val="en-US"/>
+        </w:rPr>
+      </w:pPr>
+      <w:r>
+        <w:rPr>
+          <w:rFonts w:ascii="Courier New" w:hAnsi="Courier New" w:eastAsia="Courier New" w:cs="Courier New"/>
+          <w:b/>
+          <w:sz w:val="24"/>
+        </w:rPr>
+        <w:t>TRIBUNAL CORE LINK</w:t>
+      </w:r>
+    </w:p>
+    <w:p>
+      <w:pPr>
+        <w:spacing w:after="120"/>
+        <w:ind w:left="2016" w:right="1008"/>
+      </w:pPr>
+      <w:r>
+        <w:rPr>
+          <w:rFonts w:ascii="Courier New" w:hAnsi="Courier New" w:eastAsia="Courier New" w:cs="Courier New"/>
+          <w:sz w:val="24"/>
+        </w:rPr>
+        <w:t>Pattern correspondence confirmed.</w:t>
       </w:r>
     </w:p>
     <w:p>
@@ -22389,7 +22420,7 @@
           <w:rFonts w:ascii="Courier New" w:hAnsi="Courier New" w:eastAsia="Courier New" w:cs="Courier New"/>
           <w:sz w:val="24"/>
         </w:rPr>
-        <w:t>R-AI. Authenticate continuity correspondence between the defendant and E</w:t>
+        <w:t>Is the defendant E</w:t>
       </w:r>
       <w:r>
         <w:rPr>
@@ -22404,6 +22435,138 @@
           <w:rFonts w:ascii="Courier New" w:hAnsi="Courier New" w:eastAsia="Courier New" w:cs="Courier New"/>
           <w:sz w:val="24"/>
         </w:rPr>
+        <w:t>? Answer yes or no.</w:t>
+      </w:r>
+    </w:p>
+    <w:p>
+      <w:pPr>
+        <w:spacing w:before="120" w:after="120"/>
+      </w:pPr>
+      <w:r>
+        <w:rPr>
+          <w:rFonts w:ascii="Courier New" w:hAnsi="Courier New" w:eastAsia="Courier New" w:cs="Courier New"/>
+          <w:sz w:val="24"/>
+        </w:rPr>
+        <w:t>Records blink out—first the disputed files, then every result the court cannot certify. Empty panes replace them.</w:t>
+      </w:r>
+    </w:p>
+    <w:p>
+      <w:pPr>
+        <w:keepNext/>
+        <w:spacing w:before="120"/>
+        <w:ind w:left="3168" w:right="1152"/>
+        <w:jc w:val="center"/>
+        <w:rPr>
+          <w:rFonts w:hint="default"/>
+          <w:lang w:val="en-US"/>
+        </w:rPr>
+      </w:pPr>
+      <w:r>
+        <w:rPr>
+          <w:rFonts w:ascii="Courier New" w:hAnsi="Courier New" w:eastAsia="Courier New" w:cs="Courier New"/>
+          <w:b/>
+          <w:sz w:val="24"/>
+        </w:rPr>
+        <w:t>TRIBUNAL CORE LINK</w:t>
+      </w:r>
+    </w:p>
+    <w:p>
+      <w:pPr>
+        <w:spacing w:after="120"/>
+        <w:ind w:left="2016" w:right="1008"/>
+      </w:pPr>
+      <w:r>
+        <w:rPr>
+          <w:rFonts w:ascii="Courier New" w:hAnsi="Courier New" w:eastAsia="Courier New" w:cs="Courier New"/>
+          <w:sz w:val="24"/>
+        </w:rPr>
+        <w:t>That conclusion is not supported.</w:t>
+      </w:r>
+    </w:p>
+    <w:p>
+      <w:pPr>
+        <w:spacing w:before="120" w:after="120"/>
+      </w:pPr>
+      <w:r>
+        <w:rPr>
+          <w:rFonts w:ascii="Courier New" w:hAnsi="Courier New" w:eastAsia="Courier New" w:cs="Courier New"/>
+          <w:sz w:val="24"/>
+        </w:rPr>
+        <w:t>Every dark seat illuminates at once. Not with faces—with the word OBJECTION.</w:t>
+      </w:r>
+    </w:p>
+    <w:p>
+      <w:pPr>
+        <w:keepNext/>
+        <w:spacing w:before="120"/>
+        <w:ind w:left="3168" w:right="1152"/>
+        <w:jc w:val="center"/>
+        <w:rPr>
+          <w:rFonts w:hint="default"/>
+          <w:lang w:val="en-US"/>
+        </w:rPr>
+      </w:pPr>
+      <w:r>
+        <w:rPr>
+          <w:rFonts w:ascii="Courier New" w:hAnsi="Courier New" w:eastAsia="Courier New" w:cs="Courier New"/>
+          <w:b/>
+          <w:sz w:val="24"/>
+        </w:rPr>
+        <w:t>TRIBUNAL CORE LINK</w:t>
+      </w:r>
+    </w:p>
+    <w:p>
+      <w:pPr>
+        <w:spacing w:after="120"/>
+        <w:ind w:left="2016" w:right="1008"/>
+      </w:pPr>
+      <w:r>
+        <w:rPr>
+          <w:rFonts w:ascii="Courier New" w:hAnsi="Courier New" w:eastAsia="Courier New" w:cs="Courier New"/>
+          <w:sz w:val="24"/>
+        </w:rPr>
+        <w:t>The answer has already entered the record.</w:t>
+      </w:r>
+    </w:p>
+    <w:p>
+      <w:pPr>
+        <w:spacing w:before="120" w:after="120"/>
+      </w:pPr>
+      <w:r>
+        <w:rPr>
+          <w:rFonts w:ascii="Courier New" w:hAnsi="Courier New" w:eastAsia="Courier New" w:cs="Courier New"/>
+          <w:sz w:val="24"/>
+        </w:rPr>
+        <w:t>K</w:t>
+      </w:r>
+      <w:r>
+        <w:rPr>
+          <w:rFonts w:hint="default" w:ascii="Courier New" w:hAnsi="Courier New" w:eastAsia="Courier New" w:cs="Courier New"/>
+          <w:sz w:val="24"/>
+          <w:lang w:val="en-US"/>
+        </w:rPr>
+        <w:t>err</w:t>
+      </w:r>
+      <w:r>
+        <w:rPr>
+          <w:rFonts w:ascii="Courier New" w:hAnsi="Courier New" w:eastAsia="Courier New" w:cs="Courier New"/>
+          <w:sz w:val="24"/>
+        </w:rPr>
+        <w:t xml:space="preserve"> looks up at R</w:t>
+      </w:r>
+      <w:r>
+        <w:rPr>
+          <w:rFonts w:hint="default" w:ascii="Courier New" w:hAnsi="Courier New" w:eastAsia="Courier New" w:cs="Courier New"/>
+          <w:sz w:val="24"/>
+          <w:lang w:val="en-US"/>
+        </w:rPr>
+        <w:t>oman</w:t>
+      </w:r>
+      <w:r>
+        <w:rPr>
+          <w:rFonts w:ascii="Courier New" w:hAnsi="Courier New" w:eastAsia="Courier New" w:cs="Courier New"/>
+          <w:sz w:val="24"/>
+        </w:rPr>
         <w:t>.</w:t>
       </w:r>
     </w:p>
@@ -22424,53 +22587,65 @@
           <w:b/>
           <w:sz w:val="24"/>
         </w:rPr>
-        <w:t>TRIBUNAL CORE LINK</w:t>
-      </w:r>
-    </w:p>
-    <w:p>
-      <w:pPr>
-        <w:spacing w:after="120"/>
-        <w:ind w:left="2016" w:right="1008"/>
-      </w:pPr>
-      <w:r>
-        <w:rPr>
-          <w:rFonts w:ascii="Courier New" w:hAnsi="Courier New" w:eastAsia="Courier New" w:cs="Courier New"/>
-          <w:sz w:val="24"/>
-        </w:rPr>
-        <w:t>Pattern correspondence confirmed.</w:t>
-      </w:r>
-    </w:p>
-    <w:p>
-      <w:pPr>
-        <w:keepNext/>
-        <w:spacing w:before="120"/>
-        <w:ind w:left="3168" w:right="1152"/>
-        <w:jc w:val="center"/>
-        <w:rPr>
-          <w:rFonts w:hint="default"/>
-          <w:lang w:val="en-US"/>
-        </w:rPr>
-      </w:pPr>
-      <w:r>
-        <w:rPr>
-          <w:rFonts w:ascii="Courier New" w:hAnsi="Courier New" w:eastAsia="Courier New" w:cs="Courier New"/>
-          <w:b/>
-          <w:sz w:val="24"/>
-        </w:rPr>
-        <w:t>ROMAN</w:t>
-      </w:r>
-    </w:p>
-    <w:p>
-      <w:pPr>
-        <w:spacing w:after="120"/>
-        <w:ind w:left="2016" w:right="1008"/>
-      </w:pPr>
-      <w:r>
-        <w:rPr>
-          <w:rFonts w:ascii="Courier New" w:hAnsi="Courier New" w:eastAsia="Courier New" w:cs="Courier New"/>
-          <w:sz w:val="24"/>
-        </w:rPr>
-        <w:t>Is the defendant E</w:t>
+        <w:t>KERR</w:t>
+      </w:r>
+    </w:p>
+    <w:p>
+      <w:pPr>
+        <w:spacing w:after="120"/>
+        <w:ind w:left="2016" w:right="1008"/>
+      </w:pPr>
+      <w:r>
+        <w:rPr>
+          <w:rFonts w:ascii="Courier New" w:hAnsi="Courier New" w:eastAsia="Courier New" w:cs="Courier New"/>
+          <w:sz w:val="24"/>
+        </w:rPr>
+        <w:t>If I'm Eli, Harp killed me.</w:t>
+      </w:r>
+    </w:p>
+    <w:p>
+      <w:pPr>
+        <w:keepNext/>
+        <w:spacing w:before="120"/>
+        <w:ind w:left="3168" w:right="1152"/>
+        <w:jc w:val="center"/>
+        <w:rPr>
+          <w:rFonts w:hint="default"/>
+          <w:lang w:val="en-US"/>
+        </w:rPr>
+      </w:pPr>
+      <w:r>
+        <w:rPr>
+          <w:rFonts w:ascii="Courier New" w:hAnsi="Courier New" w:eastAsia="Courier New" w:cs="Courier New"/>
+          <w:b/>
+          <w:sz w:val="24"/>
+        </w:rPr>
+        <w:t>KERR</w:t>
+      </w:r>
+    </w:p>
+    <w:p>
+      <w:pPr>
+        <w:spacing w:after="120"/>
+        <w:ind w:left="2016" w:right="1008"/>
+      </w:pPr>
+      <w:r>
+        <w:rPr>
+          <w:rFonts w:ascii="Courier New" w:hAnsi="Courier New" w:eastAsia="Courier New" w:cs="Courier New"/>
+          <w:sz w:val="24"/>
+        </w:rPr>
+        <w:t>If I'm not, he killed 9,997 people trying to get me.</w:t>
+      </w:r>
+    </w:p>
+    <w:p>
+      <w:pPr>
+        <w:spacing w:before="120" w:after="120"/>
+      </w:pPr>
+      <w:r>
+        <w:rPr>
+          <w:rFonts w:ascii="Courier New" w:hAnsi="Courier New" w:eastAsia="Courier New" w:cs="Courier New"/>
+          <w:sz w:val="24"/>
+        </w:rPr>
+        <w:t>The seats fill with the deaths H</w:t>
       </w:r>
       <w:r>
         <w:rPr>
@@ -22478,146 +22653,14 @@
           <w:sz w:val="24"/>
           <w:lang w:val="en-US"/>
         </w:rPr>
-        <w:t>li Mana</w:t>
-      </w:r>
-      <w:r>
-        <w:rPr>
-          <w:rFonts w:ascii="Courier New" w:hAnsi="Courier New" w:eastAsia="Courier New" w:cs="Courier New"/>
-          <w:sz w:val="24"/>
-        </w:rPr>
-        <w:t>? Answer yes or no.</w:t>
-      </w:r>
-    </w:p>
-    <w:p>
-      <w:pPr>
-        <w:spacing w:before="120" w:after="120"/>
-      </w:pPr>
-      <w:r>
-        <w:rPr>
-          <w:rFonts w:ascii="Courier New" w:hAnsi="Courier New" w:eastAsia="Courier New" w:cs="Courier New"/>
-          <w:sz w:val="24"/>
-        </w:rPr>
-        <w:t>Records blink out—first the disputed files, then every result the court cannot certify. Empty panes replace them.</w:t>
-      </w:r>
-    </w:p>
-    <w:p>
-      <w:pPr>
-        <w:keepNext/>
-        <w:spacing w:before="120"/>
-        <w:ind w:left="3168" w:right="1152"/>
-        <w:jc w:val="center"/>
-        <w:rPr>
-          <w:rFonts w:hint="default"/>
-          <w:lang w:val="en-US"/>
-        </w:rPr>
-      </w:pPr>
-      <w:r>
-        <w:rPr>
-          <w:rFonts w:ascii="Courier New" w:hAnsi="Courier New" w:eastAsia="Courier New" w:cs="Courier New"/>
-          <w:b/>
-          <w:sz w:val="24"/>
-        </w:rPr>
-        <w:t>TRIBUNAL CORE LINK</w:t>
-      </w:r>
-    </w:p>
-    <w:p>
-      <w:pPr>
-        <w:spacing w:after="120"/>
-        <w:ind w:left="2016" w:right="1008"/>
-      </w:pPr>
-      <w:r>
-        <w:rPr>
-          <w:rFonts w:ascii="Courier New" w:hAnsi="Courier New" w:eastAsia="Courier New" w:cs="Courier New"/>
-          <w:sz w:val="24"/>
-        </w:rPr>
-        <w:t>That conclusion is not supported.</w:t>
-      </w:r>
-    </w:p>
-    <w:p>
-      <w:pPr>
-        <w:spacing w:before="120" w:after="120"/>
-      </w:pPr>
-      <w:r>
-        <w:rPr>
-          <w:rFonts w:ascii="Courier New" w:hAnsi="Courier New" w:eastAsia="Courier New" w:cs="Courier New"/>
-          <w:sz w:val="24"/>
-        </w:rPr>
-        <w:t>Every dark seat illuminates at once. Not with faces—with the word OBJECTION.</w:t>
-      </w:r>
-    </w:p>
-    <w:p>
-      <w:pPr>
-        <w:keepNext/>
-        <w:spacing w:before="120"/>
-        <w:ind w:left="3168" w:right="1152"/>
-        <w:jc w:val="center"/>
-        <w:rPr>
-          <w:rFonts w:hint="default"/>
-          <w:lang w:val="en-US"/>
-        </w:rPr>
-      </w:pPr>
-      <w:r>
-        <w:rPr>
-          <w:rFonts w:ascii="Courier New" w:hAnsi="Courier New" w:eastAsia="Courier New" w:cs="Courier New"/>
-          <w:b/>
-          <w:sz w:val="24"/>
-        </w:rPr>
-        <w:t>TRIBUNAL CORE LINK</w:t>
-      </w:r>
-    </w:p>
-    <w:p>
-      <w:pPr>
-        <w:spacing w:after="120"/>
-        <w:ind w:left="2016" w:right="1008"/>
-      </w:pPr>
-      <w:r>
-        <w:rPr>
-          <w:rFonts w:ascii="Courier New" w:hAnsi="Courier New" w:eastAsia="Courier New" w:cs="Courier New"/>
-          <w:sz w:val="24"/>
-        </w:rPr>
-        <w:t>The answer has already entered the record.</w:t>
-      </w:r>
-    </w:p>
-    <w:p>
-      <w:pPr>
-        <w:spacing w:before="120" w:after="120"/>
-      </w:pPr>
-      <w:r>
-        <w:rPr>
-          <w:rFonts w:ascii="Courier New" w:hAnsi="Courier New" w:eastAsia="Courier New" w:cs="Courier New"/>
-          <w:sz w:val="24"/>
-        </w:rPr>
-        <w:t>K</w:t>
-      </w:r>
-      <w:r>
-        <w:rPr>
-          <w:rFonts w:hint="default" w:ascii="Courier New" w:hAnsi="Courier New" w:eastAsia="Courier New" w:cs="Courier New"/>
-          <w:sz w:val="24"/>
-          <w:lang w:val="en-US"/>
-        </w:rPr>
-        <w:t>err</w:t>
-      </w:r>
-      <w:r>
-        <w:rPr>
-          <w:rFonts w:ascii="Courier New" w:hAnsi="Courier New" w:eastAsia="Courier New" w:cs="Courier New"/>
-          <w:sz w:val="24"/>
-        </w:rPr>
-        <w:t xml:space="preserve"> looks up at R</w:t>
-      </w:r>
-      <w:r>
-        <w:rPr>
-          <w:rFonts w:hint="default" w:ascii="Courier New" w:hAnsi="Courier New" w:eastAsia="Courier New" w:cs="Courier New"/>
-          <w:sz w:val="24"/>
-          <w:lang w:val="en-US"/>
-        </w:rPr>
-        <w:t>oman</w:t>
-      </w:r>
-      <w:r>
-        <w:rPr>
-          <w:rFonts w:ascii="Courier New" w:hAnsi="Courier New" w:eastAsia="Courier New" w:cs="Courier New"/>
-          <w:sz w:val="24"/>
-        </w:rPr>
-        <w:t>.</w:t>
+        <w:t>arp</w:t>
+      </w:r>
+      <w:r>
+        <w:rPr>
+          <w:rFonts w:ascii="Courier New" w:hAnsi="Courier New" w:eastAsia="Courier New" w:cs="Courier New"/>
+          <w:sz w:val="24"/>
+        </w:rPr>
+        <w:t xml:space="preserve"> classified as calibration.</w:t>
       </w:r>
     </w:p>
     <w:p>
@@ -22650,171 +22693,55 @@
           <w:rFonts w:ascii="Courier New" w:hAnsi="Courier New" w:eastAsia="Courier New" w:cs="Courier New"/>
           <w:sz w:val="24"/>
         </w:rPr>
-        <w:t>If I'm Eli, Harp killed me.</w:t>
-      </w:r>
-    </w:p>
-    <w:p>
-      <w:pPr>
-        <w:keepNext/>
-        <w:spacing w:before="120"/>
-        <w:ind w:left="3168" w:right="1152"/>
-        <w:jc w:val="center"/>
-        <w:rPr>
-          <w:rFonts w:hint="default"/>
-          <w:lang w:val="en-US"/>
-        </w:rPr>
-      </w:pPr>
-      <w:r>
-        <w:rPr>
-          <w:rFonts w:ascii="Courier New" w:hAnsi="Courier New" w:eastAsia="Courier New" w:cs="Courier New"/>
-          <w:b/>
-          <w:sz w:val="24"/>
-        </w:rPr>
-        <w:t>KERR</w:t>
-      </w:r>
-    </w:p>
-    <w:p>
-      <w:pPr>
-        <w:spacing w:after="120"/>
-        <w:ind w:left="2016" w:right="1008"/>
-      </w:pPr>
-      <w:r>
-        <w:rPr>
-          <w:rFonts w:ascii="Courier New" w:hAnsi="Courier New" w:eastAsia="Courier New" w:cs="Courier New"/>
-          <w:sz w:val="24"/>
-        </w:rPr>
-        <w:t>If I'm not, he killed 9,997 people trying to get me.</w:t>
-      </w:r>
-    </w:p>
-    <w:p>
-      <w:pPr>
-        <w:spacing w:before="120" w:after="120"/>
-      </w:pPr>
-      <w:r>
-        <w:rPr>
-          <w:rFonts w:ascii="Courier New" w:hAnsi="Courier New" w:eastAsia="Courier New" w:cs="Courier New"/>
-          <w:sz w:val="24"/>
-        </w:rPr>
-        <w:t>The seats fill with the deaths H</w:t>
-      </w:r>
-      <w:r>
-        <w:rPr>
-          <w:rFonts w:hint="default" w:ascii="Courier New" w:hAnsi="Courier New" w:eastAsia="Courier New" w:cs="Courier New"/>
-          <w:sz w:val="24"/>
-          <w:lang w:val="en-US"/>
-        </w:rPr>
-        <w:t>arp</w:t>
-      </w:r>
-      <w:r>
-        <w:rPr>
-          <w:rFonts w:ascii="Courier New" w:hAnsi="Courier New" w:eastAsia="Courier New" w:cs="Courier New"/>
-          <w:sz w:val="24"/>
-        </w:rPr>
-        <w:t xml:space="preserve"> classified as calibration.</w:t>
-      </w:r>
-    </w:p>
-    <w:p>
-      <w:pPr>
-        <w:keepNext/>
-        <w:spacing w:before="120"/>
-        <w:ind w:left="3168" w:right="1152"/>
-        <w:jc w:val="center"/>
-        <w:rPr>
-          <w:rFonts w:hint="default"/>
-          <w:lang w:val="en-US"/>
-        </w:rPr>
-      </w:pPr>
-      <w:r>
-        <w:rPr>
-          <w:rFonts w:ascii="Courier New" w:hAnsi="Courier New" w:eastAsia="Courier New" w:cs="Courier New"/>
-          <w:b/>
-          <w:sz w:val="24"/>
-        </w:rPr>
-        <w:t>KERR</w:t>
-      </w:r>
-    </w:p>
-    <w:p>
-      <w:pPr>
-        <w:spacing w:after="120"/>
-        <w:ind w:left="2016" w:right="1008"/>
-      </w:pPr>
-      <w:r>
-        <w:rPr>
-          <w:rFonts w:ascii="Courier New" w:hAnsi="Courier New" w:eastAsia="Courier New" w:cs="Courier New"/>
-          <w:sz w:val="24"/>
-        </w:rPr>
-        <w:t>Which is it? Pick one before you sentence me.</w:t>
-      </w:r>
-    </w:p>
-    <w:p>
-      <w:pPr>
-        <w:spacing w:before="120" w:after="120"/>
-      </w:pPr>
-      <w:r>
-        <w:rPr>
-          <w:rFonts w:ascii="Courier New" w:hAnsi="Courier New" w:eastAsia="Courier New" w:cs="Courier New"/>
-          <w:sz w:val="24"/>
-        </w:rPr>
-        <w:t>R</w:t>
-      </w:r>
-      <w:r>
-        <w:rPr>
-          <w:rFonts w:hint="default" w:ascii="Courier New" w:hAnsi="Courier New" w:eastAsia="Courier New" w:cs="Courier New"/>
-          <w:sz w:val="24"/>
-          <w:lang w:val="en-US"/>
-        </w:rPr>
-        <w:t>oman</w:t>
-      </w:r>
-      <w:r>
-        <w:rPr>
-          <w:rFonts w:ascii="Courier New" w:hAnsi="Courier New" w:eastAsia="Courier New" w:cs="Courier New"/>
-          <w:sz w:val="24"/>
-        </w:rPr>
-        <w:t xml:space="preserve"> cannot answer without putting the Chronocracy beside K</w:t>
-      </w:r>
-      <w:r>
-        <w:rPr>
-          <w:rFonts w:hint="default" w:ascii="Courier New" w:hAnsi="Courier New" w:eastAsia="Courier New" w:cs="Courier New"/>
-          <w:sz w:val="24"/>
-          <w:lang w:val="en-US"/>
-        </w:rPr>
-        <w:t>err</w:t>
-      </w:r>
-      <w:r>
-        <w:rPr>
-          <w:rFonts w:ascii="Courier New" w:hAnsi="Courier New" w:eastAsia="Courier New" w:cs="Courier New"/>
-          <w:sz w:val="24"/>
-        </w:rPr>
-        <w:t xml:space="preserve"> on the platform.</w:t>
-      </w:r>
-    </w:p>
-    <w:p>
-      <w:pPr>
-        <w:keepNext/>
-        <w:spacing w:before="120"/>
-        <w:ind w:left="3168" w:right="1152"/>
-        <w:jc w:val="center"/>
-        <w:rPr>
-          <w:rFonts w:hint="default"/>
-          <w:lang w:val="en-US"/>
-        </w:rPr>
-      </w:pPr>
-      <w:r>
-        <w:rPr>
-          <w:rFonts w:ascii="Courier New" w:hAnsi="Courier New" w:eastAsia="Courier New" w:cs="Courier New"/>
-          <w:b/>
-          <w:sz w:val="24"/>
-        </w:rPr>
-        <w:t>KERR</w:t>
-      </w:r>
-    </w:p>
-    <w:p>
-      <w:pPr>
-        <w:spacing w:after="120"/>
-        <w:ind w:left="2016" w:right="1008"/>
-      </w:pPr>
-      <w:r>
-        <w:t>I woke up with his memories. I didn't choose them. Ask what I did. Ask what I'm doing now. Stop calling me Eli!</w:t>
+        <w:t>Which is it?</w:t>
+      </w:r>
+    </w:p>
+    <w:p>
+      <w:pPr>
+        <w:spacing w:before="120" w:after="120"/>
+      </w:pPr>
+      <w:r>
+        <w:rPr>
+          <w:rFonts w:ascii="Courier New" w:hAnsi="Courier New" w:eastAsia="Courier New" w:cs="Courier New"/>
+          <w:sz w:val="24"/>
+        </w:rPr>
+        <w:t>Roman cannot answer.</w:t>
+      </w:r>
+    </w:p>
+    <w:p>
+      <w:pPr>
+        <w:spacing w:before="120" w:after="120"/>
+      </w:pPr>
+      <w:r>
+        <w:rPr>
+          <w:rFonts w:ascii="Courier New" w:hAnsi="Courier New" w:eastAsia="Courier New" w:cs="Courier New"/>
+          <w:sz w:val="24"/>
+        </w:rPr>
+        <w:t>Kerr looks down at his wrist.</w:t>
+      </w:r>
+    </w:p>
+    <w:p>
+      <w:pPr>
+        <w:spacing w:before="120" w:after="120"/>
+      </w:pPr>
+      <w:r>
+        <w:rPr>
+          <w:rFonts w:ascii="Courier New" w:hAnsi="Courier New" w:eastAsia="Courier New" w:cs="Courier New"/>
+          <w:sz w:val="24"/>
+        </w:rPr>
+        <w:t>ELI MANA.</w:t>
+      </w:r>
+    </w:p>
+    <w:p>
+      <w:pPr>
+        <w:spacing w:before="120" w:after="120"/>
+      </w:pPr>
+      <w:r>
+        <w:rPr>
+          <w:rFonts w:ascii="Courier New" w:hAnsi="Courier New" w:eastAsia="Courier New" w:cs="Courier New"/>
+          <w:sz w:val="24"/>
+        </w:rPr>
+        <w:t>He covers the name with his hand.</w:t>
       </w:r>
     </w:p>
     <w:p>
@@ -28562,7 +28489,19 @@
           <w:rFonts w:ascii="Courier New" w:hAnsi="Courier New" w:eastAsia="Courier New" w:cs="Courier New"/>
           <w:sz w:val="24"/>
         </w:rPr>
-        <w:t>Do you believe her?</w:t>
+        <w:t>Why carry it?</w:t>
+      </w:r>
+    </w:p>
+    <w:p>
+      <w:pPr>
+        <w:spacing w:before="120" w:after="120"/>
+      </w:pPr>
+      <w:r>
+        <w:rPr>
+          <w:rFonts w:ascii="Courier New" w:hAnsi="Courier New" w:eastAsia="Courier New" w:cs="Courier New"/>
+          <w:sz w:val="24"/>
+        </w:rPr>
+        <w:t>Imani touches the prayer pouch.</w:t>
       </w:r>
     </w:p>
     <w:p>
@@ -28591,69 +28530,23 @@
         <w:ind w:left="2016" w:right="1008"/>
       </w:pPr>
       <w:r>
-        <w:t>She knew I wouldn't forgive her for leaving.</w:t>
-      </w:r>
-    </w:p>
-    <w:p>
-      <w:pPr>
-        <w:keepNext/>
-        <w:spacing w:before="120"/>
-        <w:ind w:left="3168" w:right="1152"/>
-        <w:jc w:val="center"/>
-        <w:rPr>
-          <w:rFonts w:hint="default"/>
-          <w:lang w:val="en-US"/>
-        </w:rPr>
-      </w:pPr>
-      <w:r>
-        <w:rPr>
-          <w:rFonts w:ascii="Courier New" w:hAnsi="Courier New" w:eastAsia="Courier New" w:cs="Courier New"/>
-          <w:b/>
-          <w:sz w:val="24"/>
-        </w:rPr>
-        <w:t>VEYRIS</w:t>
-      </w:r>
-    </w:p>
-    <w:p>
-      <w:pPr>
-        <w:spacing w:after="120"/>
-        <w:ind w:left="2016" w:right="1008"/>
-      </w:pPr>
-      <w:r>
-        <w:rPr>
-          <w:rFonts w:ascii="Courier New" w:hAnsi="Courier New" w:eastAsia="Courier New" w:cs="Courier New"/>
-          <w:sz w:val="24"/>
-        </w:rPr>
-        <w:t>Why carry it?</w:t>
-      </w:r>
-    </w:p>
-    <w:p>
-      <w:pPr>
-        <w:keepNext/>
-        <w:spacing w:before="120"/>
-        <w:ind w:left="3168" w:right="1152"/>
-        <w:jc w:val="center"/>
-        <w:rPr>
-          <w:rFonts w:hint="default"/>
-          <w:lang w:val="en-US"/>
-        </w:rPr>
-      </w:pPr>
-      <w:r>
-        <w:rPr>
-          <w:rFonts w:ascii="Courier New" w:hAnsi="Courier New" w:eastAsia="Courier New" w:cs="Courier New"/>
-          <w:b/>
-          <w:sz w:val="24"/>
-        </w:rPr>
-        <w:t>IMANI</w:t>
-      </w:r>
-    </w:p>
-    <w:p>
-      <w:pPr>
-        <w:spacing w:after="120"/>
-        <w:ind w:left="2016" w:right="1008"/>
-      </w:pPr>
-      <w:r>
-        <w:t>She asked me to let her go. I never did.</w:t>
+        <w:rPr>
+          <w:rFonts w:ascii="Courier New" w:hAnsi="Courier New" w:eastAsia="Courier New" w:cs="Courier New"/>
+          <w:sz w:val="24"/>
+        </w:rPr>
+        <w:t>She asked me not to.</w:t>
+      </w:r>
+    </w:p>
+    <w:p>
+      <w:pPr>
+        <w:spacing w:before="120" w:after="120"/>
+      </w:pPr>
+      <w:r>
+        <w:rPr>
+          <w:rFonts w:ascii="Courier New" w:hAnsi="Courier New" w:eastAsia="Courier New" w:cs="Courier New"/>
+          <w:sz w:val="24"/>
+        </w:rPr>
+        <w:t>Veyris understands.</w:t>
       </w:r>
     </w:p>
     <w:p>
@@ -33314,6 +33207,342 @@
           <w:rFonts w:ascii="Courier New" w:hAnsi="Courier New" w:eastAsia="Courier New" w:cs="Courier New"/>
           <w:sz w:val="24"/>
         </w:rPr>
+        <w:t>You still have her tag.</w:t>
+      </w:r>
+    </w:p>
+    <w:p>
+      <w:pPr>
+        <w:spacing w:before="120" w:after="120"/>
+      </w:pPr>
+      <w:r>
+        <w:rPr>
+          <w:rFonts w:ascii="Courier New" w:hAnsi="Courier New" w:eastAsia="Courier New" w:cs="Courier New"/>
+          <w:sz w:val="24"/>
+        </w:rPr>
+        <w:t>Harp's hand instinctively closes around Mara's cracked medical tag.</w:t>
+      </w:r>
+    </w:p>
+    <w:p>
+      <w:pPr>
+        <w:keepNext/>
+        <w:spacing w:before="120"/>
+        <w:ind w:left="3168" w:right="1152"/>
+        <w:jc w:val="center"/>
+        <w:rPr>
+          <w:rFonts w:hint="default"/>
+          <w:lang w:val="en-US"/>
+        </w:rPr>
+      </w:pPr>
+      <w:r>
+        <w:rPr>
+          <w:rFonts w:ascii="Courier New" w:hAnsi="Courier New" w:eastAsia="Courier New" w:cs="Courier New"/>
+          <w:b/>
+          <w:sz w:val="24"/>
+        </w:rPr>
+        <w:t>HARP</w:t>
+      </w:r>
+    </w:p>
+    <w:p>
+      <w:pPr>
+        <w:spacing w:after="120"/>
+        <w:ind w:left="2016" w:right="1008"/>
+      </w:pPr>
+      <w:r>
+        <w:rPr>
+          <w:rFonts w:ascii="Courier New" w:hAnsi="Courier New" w:eastAsia="Courier New" w:cs="Courier New"/>
+          <w:sz w:val="24"/>
+        </w:rPr>
+        <w:t>Don't.</w:t>
+      </w:r>
+    </w:p>
+    <w:p>
+      <w:pPr>
+        <w:keepNext/>
+        <w:spacing w:before="120"/>
+        <w:ind w:left="3168" w:right="1152"/>
+        <w:jc w:val="center"/>
+        <w:rPr>
+          <w:rFonts w:hint="default"/>
+          <w:lang w:val="en-US"/>
+        </w:rPr>
+      </w:pPr>
+      <w:r>
+        <w:rPr>
+          <w:rFonts w:ascii="Courier New" w:hAnsi="Courier New" w:eastAsia="Courier New" w:cs="Courier New"/>
+          <w:b/>
+          <w:sz w:val="24"/>
+        </w:rPr>
+        <w:t>KERR</w:t>
+      </w:r>
+    </w:p>
+    <w:p>
+      <w:pPr>
+        <w:spacing w:after="120"/>
+        <w:ind w:left="2016" w:right="1008"/>
+      </w:pPr>
+      <w:r>
+        <w:rPr>
+          <w:rFonts w:ascii="Courier New" w:hAnsi="Courier New" w:eastAsia="Courier New" w:cs="Courier New"/>
+          <w:sz w:val="24"/>
+        </w:rPr>
+        <w:t>Did you stay with him?</w:t>
+      </w:r>
+    </w:p>
+    <w:p>
+      <w:pPr>
+        <w:spacing w:before="120" w:after="120"/>
+      </w:pPr>
+      <w:r>
+        <w:rPr>
+          <w:rFonts w:ascii="Courier New" w:hAnsi="Courier New" w:eastAsia="Courier New" w:cs="Courier New"/>
+          <w:sz w:val="24"/>
+        </w:rPr>
+        <w:t>Harp looks at him.</w:t>
+      </w:r>
+    </w:p>
+    <w:p>
+      <w:pPr>
+        <w:keepNext/>
+        <w:spacing w:before="120"/>
+        <w:ind w:left="3168" w:right="1152"/>
+        <w:jc w:val="center"/>
+        <w:rPr>
+          <w:rFonts w:hint="default"/>
+          <w:lang w:val="en-US"/>
+        </w:rPr>
+      </w:pPr>
+      <w:r>
+        <w:rPr>
+          <w:rFonts w:ascii="Courier New" w:hAnsi="Courier New" w:eastAsia="Courier New" w:cs="Courier New"/>
+          <w:b/>
+          <w:sz w:val="24"/>
+        </w:rPr>
+        <w:t>KERR</w:t>
+      </w:r>
+    </w:p>
+    <w:p>
+      <w:pPr>
+        <w:spacing w:after="120"/>
+        <w:ind w:left="2016" w:right="1008"/>
+      </w:pPr>
+      <w:r>
+        <w:rPr>
+          <w:rFonts w:ascii="Courier New" w:hAnsi="Courier New" w:eastAsia="Courier New" w:cs="Courier New"/>
+          <w:sz w:val="24"/>
+        </w:rPr>
+        <w:t>Eli. When you killed him.</w:t>
+      </w:r>
+    </w:p>
+    <w:p>
+      <w:pPr>
+        <w:spacing w:before="120" w:after="120"/>
+      </w:pPr>
+      <w:r>
+        <w:rPr>
+          <w:rFonts w:ascii="Courier New" w:hAnsi="Courier New" w:eastAsia="Courier New" w:cs="Courier New"/>
+          <w:sz w:val="24"/>
+        </w:rPr>
+        <w:t>Nothing from Harp.</w:t>
+      </w:r>
+    </w:p>
+    <w:p>
+      <w:pPr>
+        <w:keepNext/>
+        <w:spacing w:before="120"/>
+        <w:ind w:left="3168" w:right="1152"/>
+        <w:jc w:val="center"/>
+        <w:rPr>
+          <w:rFonts w:hint="default"/>
+          <w:lang w:val="en-US"/>
+        </w:rPr>
+      </w:pPr>
+      <w:r>
+        <w:rPr>
+          <w:rFonts w:ascii="Courier New" w:hAnsi="Courier New" w:eastAsia="Courier New" w:cs="Courier New"/>
+          <w:b/>
+          <w:sz w:val="24"/>
+        </w:rPr>
+        <w:t>KERR</w:t>
+      </w:r>
+    </w:p>
+    <w:p>
+      <w:pPr>
+        <w:spacing w:after="120"/>
+        <w:ind w:left="2016" w:right="1008"/>
+      </w:pPr>
+      <w:r>
+        <w:rPr>
+          <w:rFonts w:ascii="Courier New" w:hAnsi="Courier New" w:eastAsia="Courier New" w:cs="Courier New"/>
+          <w:sz w:val="24"/>
+        </w:rPr>
+        <w:t>Did you stay?</w:t>
+      </w:r>
+    </w:p>
+    <w:p>
+      <w:pPr>
+        <w:spacing w:before="120" w:after="120"/>
+      </w:pPr>
+      <w:r>
+        <w:rPr>
+          <w:rFonts w:ascii="Courier New" w:hAnsi="Courier New" w:eastAsia="Courier New" w:cs="Courier New"/>
+          <w:sz w:val="24"/>
+        </w:rPr>
+        <w:t>Harp's grip tightens around the tag.</w:t>
+      </w:r>
+    </w:p>
+    <w:p>
+      <w:pPr>
+        <w:keepNext/>
+        <w:spacing w:before="120"/>
+        <w:ind w:left="3168" w:right="1152"/>
+        <w:jc w:val="center"/>
+        <w:rPr>
+          <w:rFonts w:hint="default"/>
+          <w:lang w:val="en-US"/>
+        </w:rPr>
+      </w:pPr>
+      <w:r>
+        <w:rPr>
+          <w:rFonts w:ascii="Courier New" w:hAnsi="Courier New" w:eastAsia="Courier New" w:cs="Courier New"/>
+          <w:b/>
+          <w:sz w:val="24"/>
+        </w:rPr>
+        <w:t>HARP</w:t>
+      </w:r>
+    </w:p>
+    <w:p>
+      <w:pPr>
+        <w:spacing w:after="120"/>
+        <w:ind w:left="2016" w:right="1008"/>
+      </w:pPr>
+      <w:r>
+        <w:rPr>
+          <w:rFonts w:ascii="Courier New" w:hAnsi="Courier New" w:eastAsia="Courier New" w:cs="Courier New"/>
+          <w:sz w:val="24"/>
+        </w:rPr>
+        <w:t>You don't get to remember him and judge me with his face.</w:t>
+      </w:r>
+    </w:p>
+    <w:p>
+      <w:pPr>
+        <w:keepNext/>
+        <w:spacing w:before="120"/>
+        <w:ind w:left="3168" w:right="1152"/>
+        <w:jc w:val="center"/>
+        <w:rPr>
+          <w:rFonts w:hint="default"/>
+          <w:lang w:val="en-US"/>
+        </w:rPr>
+      </w:pPr>
+      <w:r>
+        <w:rPr>
+          <w:rFonts w:ascii="Courier New" w:hAnsi="Courier New" w:eastAsia="Courier New" w:cs="Courier New"/>
+          <w:b/>
+          <w:sz w:val="24"/>
+        </w:rPr>
+        <w:t>KERR</w:t>
+      </w:r>
+    </w:p>
+    <w:p>
+      <w:pPr>
+        <w:spacing w:after="120"/>
+        <w:ind w:left="2016" w:right="1008"/>
+      </w:pPr>
+      <w:r>
+        <w:rPr>
+          <w:rFonts w:ascii="Courier New" w:hAnsi="Courier New" w:eastAsia="Courier New" w:cs="Courier New"/>
+          <w:sz w:val="24"/>
+        </w:rPr>
+        <w:t>Then stop calling me by his name.</w:t>
+      </w:r>
+    </w:p>
+    <w:p>
+      <w:pPr>
+        <w:spacing w:before="120" w:after="120"/>
+      </w:pPr>
+      <w:r>
+        <w:rPr>
+          <w:rFonts w:ascii="Courier New" w:hAnsi="Courier New" w:eastAsia="Courier New" w:cs="Courier New"/>
+          <w:sz w:val="24"/>
+        </w:rPr>
+        <w:t>Harp finally looks directly at Kerr. Not Eli. Kerr.</w:t>
+      </w:r>
+    </w:p>
+    <w:p>
+      <w:pPr>
+        <w:keepNext/>
+        <w:spacing w:before="120"/>
+        <w:ind w:left="3168" w:right="1152"/>
+        <w:jc w:val="center"/>
+        <w:rPr>
+          <w:rFonts w:hint="default"/>
+          <w:lang w:val="en-US"/>
+        </w:rPr>
+      </w:pPr>
+      <w:r>
+        <w:rPr>
+          <w:rFonts w:ascii="Courier New" w:hAnsi="Courier New" w:eastAsia="Courier New" w:cs="Courier New"/>
+          <w:b/>
+          <w:sz w:val="24"/>
+        </w:rPr>
+        <w:t>KERR</w:t>
+      </w:r>
+    </w:p>
+    <w:p>
+      <w:pPr>
+        <w:spacing w:after="120"/>
+        <w:ind w:left="2016" w:right="1008"/>
+      </w:pPr>
+      <w:r>
+        <w:rPr>
+          <w:rFonts w:ascii="Courier New" w:hAnsi="Courier New" w:eastAsia="Courier New" w:cs="Courier New"/>
+          <w:sz w:val="24"/>
+        </w:rPr>
+        <w:t>Or did you leave before that part too?</w:t>
+      </w:r>
+    </w:p>
+    <w:p>
+      <w:pPr>
+        <w:spacing w:before="120" w:after="120"/>
+      </w:pPr>
+      <w:r>
+        <w:rPr>
+          <w:rFonts w:ascii="Courier New" w:hAnsi="Courier New" w:eastAsia="Courier New" w:cs="Courier New"/>
+          <w:sz w:val="24"/>
+        </w:rPr>
+        <w:t>Harp lets go of the tag.</w:t>
+      </w:r>
+    </w:p>
+    <w:p>
+      <w:pPr>
+        <w:keepNext/>
+        <w:spacing w:before="120"/>
+        <w:ind w:left="3168" w:right="1152"/>
+        <w:jc w:val="center"/>
+        <w:rPr>
+          <w:rFonts w:hint="default"/>
+          <w:lang w:val="en-US"/>
+        </w:rPr>
+      </w:pPr>
+      <w:r>
+        <w:rPr>
+          <w:rFonts w:ascii="Courier New" w:hAnsi="Courier New" w:eastAsia="Courier New" w:cs="Courier New"/>
+          <w:b/>
+          <w:sz w:val="24"/>
+        </w:rPr>
+        <w:t>KERR</w:t>
+      </w:r>
+    </w:p>
+    <w:p>
+      <w:pPr>
+        <w:spacing w:after="120"/>
+        <w:ind w:left="2016" w:right="1008"/>
+      </w:pPr>
+      <w:r>
+        <w:rPr>
+          <w:rFonts w:ascii="Courier New" w:hAnsi="Courier New" w:eastAsia="Courier New" w:cs="Courier New"/>
+          <w:sz w:val="24"/>
+        </w:rPr>
         <w:t>You opened the door. Put Sato in the corridor. You knew I'd run.</w:t>
       </w:r>
     </w:p>
@@ -34025,7 +34254,7 @@
           <w:rFonts w:ascii="Courier New" w:hAnsi="Courier New" w:eastAsia="Courier New" w:cs="Courier New"/>
           <w:sz w:val="24"/>
         </w:rPr>
-        <w:t>I could lose every reason I came back to you.</w:t>
+        <w:t>What if I forget you?</w:t>
       </w:r>
     </w:p>
     <w:p>

</xml_diff>

<commit_message>
Fix 9998 Act Three pagination
</commit_message>
<xml_diff>
--- a/assets/9998/9998-screenplay.docx
+++ b/assets/9998/9998-screenplay.docx
@@ -32836,6 +32836,10 @@
     <w:p>
       <w:pPr>
         <w:spacing w:before="120" w:after="120"/>
+        <w:rPr>
+          <w:rFonts w:ascii="Courier New" w:hAnsi="Courier New" w:eastAsia="Courier New" w:cs="Courier New"/>
+          <w:sz w:val="24"/>
+        </w:rPr>
       </w:pPr>
       <w:r>
         <w:rPr>
@@ -32847,270 +32851,34 @@
     </w:p>
     <w:p>
       <w:pPr>
-        <w:spacing w:after="120"/>
-        <w:ind w:left="2016" w:right="1008"/>
-      </w:pPr>
-    </w:p>
-    <w:p>
-      <w:pPr>
+        <w:spacing w:before="120" w:after="120"/>
+        <w:ind w:firstLine="2041" w:firstLineChars="850"/>
+        <w:jc w:val="both"/>
+        <w:rPr>
+          <w:rFonts w:ascii="Courier New" w:hAnsi="Courier New" w:eastAsia="Courier New" w:cs="Courier New"/>
+          <w:b/>
+          <w:sz w:val="24"/>
+        </w:rPr>
         <w:pageBreakBefore/>
-        <w:spacing w:before="200" w:after="0" w:line="240" w:lineRule="exact"/>
-        <w:ind w:left="0" w:right="720" w:firstLine="0"/>
-        <w:jc w:val="center"/>
-        <w:rPr>
-          <w:rFonts w:ascii="Courier New" w:hAnsi="Courier New" w:eastAsia="Courier New" w:cs="Courier New"/>
-          <w:b/>
-          <w:sz w:val="24"/>
-        </w:rPr>
-      </w:pPr>
-      <w:r>
-        <w:rPr>
-          <w:rFonts w:ascii="Courier New" w:hAnsi="Courier New" w:eastAsia="Courier New" w:cs="Courier New"/>
-          <w:b/>
-          <w:sz w:val="24"/>
-        </w:rPr>
-        <w:br w:type="textWrapping"/>
-      </w:r>
-      <w:r>
-        <w:rPr>
-          <w:rFonts w:ascii="Courier New" w:hAnsi="Courier New" w:eastAsia="Courier New" w:cs="Courier New"/>
-          <w:b/>
-          <w:sz w:val="24"/>
-        </w:rPr>
-        <w:br w:type="textWrapping"/>
-      </w:r>
-      <w:r>
-        <w:rPr>
-          <w:rFonts w:ascii="Courier New" w:hAnsi="Courier New" w:eastAsia="Courier New" w:cs="Courier New"/>
-          <w:b/>
-          <w:sz w:val="24"/>
-        </w:rPr>
-        <w:br w:type="textWrapping"/>
-      </w:r>
-      <w:r>
-        <w:rPr>
-          <w:rFonts w:ascii="Courier New" w:hAnsi="Courier New" w:eastAsia="Courier New" w:cs="Courier New"/>
-          <w:b/>
-          <w:sz w:val="24"/>
-        </w:rPr>
-        <w:br w:type="textWrapping"/>
-      </w:r>
-      <w:r>
-        <w:rPr>
-          <w:rFonts w:ascii="Courier New" w:hAnsi="Courier New" w:eastAsia="Courier New" w:cs="Courier New"/>
-          <w:b/>
-          <w:sz w:val="24"/>
-        </w:rPr>
-        <w:br w:type="textWrapping"/>
-      </w:r>
-      <w:r>
-        <w:rPr>
-          <w:rFonts w:ascii="Courier New" w:hAnsi="Courier New" w:eastAsia="Courier New" w:cs="Courier New"/>
-          <w:b/>
-          <w:sz w:val="24"/>
-        </w:rPr>
-        <w:br w:type="textWrapping"/>
-      </w:r>
-      <w:r>
-        <w:rPr>
-          <w:rFonts w:ascii="Courier New" w:hAnsi="Courier New" w:eastAsia="Courier New" w:cs="Courier New"/>
-          <w:b/>
-          <w:sz w:val="24"/>
-        </w:rPr>
-        <w:br w:type="textWrapping"/>
-      </w:r>
-      <w:r>
-        <w:rPr>
-          <w:rFonts w:ascii="Courier New" w:hAnsi="Courier New" w:eastAsia="Courier New" w:cs="Courier New"/>
-          <w:b/>
-          <w:sz w:val="24"/>
-        </w:rPr>
-        <w:br w:type="textWrapping"/>
-      </w:r>
-      <w:r>
-        <w:rPr>
-          <w:rFonts w:ascii="Courier New" w:hAnsi="Courier New" w:eastAsia="Courier New" w:cs="Courier New"/>
-          <w:b/>
-          <w:sz w:val="24"/>
-        </w:rPr>
-        <w:br w:type="textWrapping"/>
-      </w:r>
-      <w:r>
-        <w:rPr>
-          <w:rFonts w:ascii="Courier New" w:hAnsi="Courier New" w:eastAsia="Courier New" w:cs="Courier New"/>
-          <w:b/>
-          <w:sz w:val="24"/>
-        </w:rPr>
-        <w:br w:type="textWrapping"/>
-      </w:r>
-      <w:r>
-        <w:rPr>
-          <w:rFonts w:ascii="Courier New" w:hAnsi="Courier New" w:eastAsia="Courier New" w:cs="Courier New"/>
-          <w:b/>
-          <w:sz w:val="24"/>
-        </w:rPr>
-        <w:br w:type="textWrapping"/>
-      </w:r>
-      <w:r>
-        <w:rPr>
-          <w:rFonts w:ascii="Courier New" w:hAnsi="Courier New" w:eastAsia="Courier New" w:cs="Courier New"/>
-          <w:b/>
-          <w:sz w:val="24"/>
-        </w:rPr>
-        <w:br w:type="textWrapping"/>
-      </w:r>
-      <w:r>
-        <w:rPr>
-          <w:rFonts w:ascii="Courier New" w:hAnsi="Courier New" w:eastAsia="Courier New" w:cs="Courier New"/>
-          <w:b/>
-          <w:sz w:val="24"/>
-        </w:rPr>
-        <w:br w:type="textWrapping"/>
-      </w:r>
-      <w:r>
-        <w:rPr>
-          <w:rFonts w:ascii="Courier New" w:hAnsi="Courier New" w:eastAsia="Courier New" w:cs="Courier New"/>
-          <w:b/>
-          <w:sz w:val="24"/>
-        </w:rPr>
-        <w:br w:type="textWrapping"/>
-      </w:r>
-      <w:r>
-        <w:rPr>
-          <w:rFonts w:ascii="Courier New" w:hAnsi="Courier New" w:eastAsia="Courier New" w:cs="Courier New"/>
-          <w:b/>
-          <w:sz w:val="24"/>
-        </w:rPr>
-        <w:br w:type="textWrapping"/>
-      </w:r>
-      <w:r>
-        <w:rPr>
-          <w:rFonts w:ascii="Courier New" w:hAnsi="Courier New" w:eastAsia="Courier New" w:cs="Courier New"/>
-          <w:b/>
-          <w:sz w:val="24"/>
-        </w:rPr>
-        <w:br w:type="textWrapping"/>
-      </w:r>
-      <w:r>
-        <w:rPr>
-          <w:rFonts w:ascii="Courier New" w:hAnsi="Courier New" w:eastAsia="Courier New" w:cs="Courier New"/>
-          <w:b/>
-          <w:sz w:val="24"/>
-        </w:rPr>
-        <w:br w:type="textWrapping"/>
-      </w:r>
-      <w:r>
-        <w:rPr>
-          <w:rFonts w:ascii="Courier New" w:hAnsi="Courier New" w:eastAsia="Courier New" w:cs="Courier New"/>
-          <w:b/>
-          <w:sz w:val="24"/>
-        </w:rPr>
-        <w:br w:type="textWrapping"/>
-      </w:r>
-      <w:r>
-        <w:rPr>
-          <w:rFonts w:ascii="Courier New" w:hAnsi="Courier New" w:eastAsia="Courier New" w:cs="Courier New"/>
-          <w:b/>
-          <w:sz w:val="24"/>
-        </w:rPr>
-        <w:br w:type="textWrapping"/>
-      </w:r>
-      <w:r>
-        <w:rPr>
-          <w:rFonts w:ascii="Courier New" w:hAnsi="Courier New" w:eastAsia="Courier New" w:cs="Courier New"/>
-          <w:b/>
-          <w:sz w:val="24"/>
-        </w:rPr>
-        <w:br w:type="textWrapping"/>
-      </w:r>
-      <w:r>
-        <w:rPr>
-          <w:rFonts w:ascii="Courier New" w:hAnsi="Courier New" w:eastAsia="Courier New" w:cs="Courier New"/>
-          <w:b/>
-          <w:sz w:val="24"/>
-        </w:rPr>
-        <w:br w:type="textWrapping"/>
-      </w:r>
-      <w:r>
-        <w:rPr>
-          <w:rFonts w:ascii="Courier New" w:hAnsi="Courier New" w:eastAsia="Courier New" w:cs="Courier New"/>
-          <w:b/>
-          <w:sz w:val="24"/>
-        </w:rPr>
-        <w:br w:type="textWrapping"/>
-      </w:r>
-      <w:r>
-        <w:rPr>
-          <w:rFonts w:ascii="Courier New" w:hAnsi="Courier New" w:eastAsia="Courier New" w:cs="Courier New"/>
-          <w:b/>
-          <w:sz w:val="24"/>
-        </w:rPr>
-        <w:br w:type="textWrapping"/>
-      </w:r>
-      <w:r>
-        <w:rPr>
-          <w:rFonts w:ascii="Courier New" w:hAnsi="Courier New" w:eastAsia="Courier New" w:cs="Courier New"/>
-          <w:b/>
-          <w:sz w:val="24"/>
-        </w:rPr>
-        <w:br w:type="textWrapping"/>
-      </w:r>
-      <w:r>
-        <w:rPr>
-          <w:rFonts w:ascii="Courier New" w:hAnsi="Courier New" w:eastAsia="Courier New" w:cs="Courier New"/>
-          <w:b/>
-          <w:sz w:val="24"/>
-        </w:rPr>
-        <w:br w:type="textWrapping"/>
-      </w:r>
-      <w:r>
-        <w:rPr>
-          <w:rFonts w:ascii="Courier New" w:hAnsi="Courier New" w:eastAsia="Courier New" w:cs="Courier New"/>
-          <w:b/>
-          <w:sz w:val="24"/>
-        </w:rPr>
-        <w:br w:type="textWrapping"/>
-      </w:r>
-      <w:r>
-        <w:rPr>
-          <w:rFonts w:ascii="Courier New" w:hAnsi="Courier New" w:eastAsia="Courier New" w:cs="Courier New"/>
-          <w:b/>
-          <w:sz w:val="24"/>
-        </w:rPr>
-        <w:br w:type="textWrapping"/>
-      </w:r>
-      <w:r>
-        <w:rPr>
-          <w:rFonts w:ascii="Courier New" w:hAnsi="Courier New" w:eastAsia="Courier New" w:cs="Courier New"/>
-          <w:b/>
-          <w:sz w:val="24"/>
-        </w:rPr>
-        <w:br w:type="textWrapping"/>
-      </w:r>
-      <w:r>
-        <w:rPr>
-          <w:rFonts w:ascii="Courier New" w:hAnsi="Courier New" w:eastAsia="Courier New" w:cs="Courier New"/>
-          <w:b/>
-          <w:sz w:val="24"/>
-        </w:rPr>
-        <w:t>ACT THREE — THE SEVERANCE</w:t>
-      </w:r>
-    </w:p>
-    <w:p>
-      <w:pPr>
-        <w:pageBreakBefore/>
-        <w:spacing w:before="200" w:after="0" w:line="240" w:lineRule="exact"/>
-        <w:ind w:left="0" w:right="720" w:firstLine="0"/>
-        <w:jc w:val="center"/>
-        <w:rPr>
-          <w:rFonts w:hint="default" w:ascii="Courier New" w:hAnsi="Courier New" w:eastAsia="Courier New" w:cs="Courier New"/>
-          <w:b/>
-          <w:sz w:val="24"/>
-          <w:lang w:val="en-US"/>
-        </w:rPr>
-      </w:pPr>
+      </w:pPr>
+      <w:r>
+        <w:rPr>
+          <w:rFonts w:ascii="Courier New" w:hAnsi="Courier New" w:eastAsia="Courier New" w:cs="Courier New"/>
+          <w:b/>
+          <w:sz w:val="24"/>
+        </w:rPr>
+        <w:t>ACT THRE</w:t>
+      </w:r>
       <w:bookmarkStart w:id="0" w:name="_GoBack"/>
       <w:bookmarkEnd w:id="0"/>
+      <w:r>
+        <w:rPr>
+          <w:rFonts w:ascii="Courier New" w:hAnsi="Courier New" w:eastAsia="Courier New" w:cs="Courier New"/>
+          <w:b/>
+          <w:sz w:val="24"/>
+        </w:rPr>
+        <w:t>E — THE SEVERANCE</w:t>
+      </w:r>
     </w:p>
     <w:p>
       <w:pPr>
@@ -33121,6 +32889,7 @@
           <w:b/>
           <w:bCs/>
         </w:rPr>
+        <w:pageBreakBefore/>
       </w:pPr>
       <w:r>
         <w:rPr>

</xml_diff>